<commit_message>
Doc: actualizar CU011, diagrama de secuencia DVV y diagramas de clases
</commit_message>
<xml_diff>
--- a/Documentacion/Carpeta_Proyecto_Stach.docx
+++ b/Documentacion/Carpeta_Proyecto_Stach.docx
@@ -9061,7 +9061,23 @@
           </w:tcPr>
           <w:p>
             <w:r>
-              <w:t>2da Entrega. Reestructuración de 6 capas, desacoplamiento absoluto de GUI y Servicios con IoC global, clave de recuperación maestra (DPAPI), cifrado de backups AES-256 e integridad con dígitos verificadores (DVH/DVV).</w:t>
+              <w:t xml:space="preserve">2da Entrega. Reestructuración de 6 capas, desacoplamiento absoluto de GUI y Servicios con </w:t>
+            </w:r>
+            <w:proofErr w:type="spellStart"/>
+            <w:r>
+              <w:t>IoC</w:t>
+            </w:r>
+            <w:proofErr w:type="spellEnd"/>
+            <w:r>
+              <w:t xml:space="preserve"> global, clave de recuperación maestra (DPAPI), cifrado de </w:t>
+            </w:r>
+            <w:proofErr w:type="spellStart"/>
+            <w:r>
+              <w:t>backups</w:t>
+            </w:r>
+            <w:proofErr w:type="spellEnd"/>
+            <w:r>
+              <w:t xml:space="preserve"> AES-256 e integridad con dígitos verificadores (DVH/DVV).</w:t>
             </w:r>
           </w:p>
         </w:tc>
@@ -9153,12 +9169,36 @@
     </w:p>
     <w:p>
       <w:r>
-        <w:t>4. Soporte multi-idioma dinámico sin reinicio de la aplicación (patrón Observer).</w:t>
-      </w:r>
-    </w:p>
-    <w:p>
-      <w:r>
-        <w:t>5. Bitácora de auditía completa con filtros avanzados combinados.</w:t>
+        <w:t xml:space="preserve">4. Soporte </w:t>
+      </w:r>
+      <w:proofErr w:type="spellStart"/>
+      <w:r>
+        <w:t>multi-idioma</w:t>
+      </w:r>
+      <w:proofErr w:type="spellEnd"/>
+      <w:r>
+        <w:t xml:space="preserve"> dinámico sin reinicio de la aplicación (patrón </w:t>
+      </w:r>
+      <w:proofErr w:type="spellStart"/>
+      <w:r>
+        <w:t>Observer</w:t>
+      </w:r>
+      <w:proofErr w:type="spellEnd"/>
+      <w:r>
+        <w:t>).</w:t>
+      </w:r>
+    </w:p>
+    <w:p>
+      <w:r>
+        <w:t xml:space="preserve">5. Bitácora de </w:t>
+      </w:r>
+      <w:proofErr w:type="spellStart"/>
+      <w:r>
+        <w:t>auditía</w:t>
+      </w:r>
+      <w:proofErr w:type="spellEnd"/>
+      <w:r>
+        <w:t xml:space="preserve"> completa con filtros avanzados combinados.</w:t>
       </w:r>
     </w:p>
     <w:p>
@@ -9168,7 +9208,15 @@
     </w:p>
     <w:p>
       <w:r>
-        <w:t>7. Copias de seguridad cifradas (AES-256) con asistente de restauración Wizard.</w:t>
+        <w:t xml:space="preserve">7. Copias de seguridad cifradas (AES-256) con asistente de restauración </w:t>
+      </w:r>
+      <w:proofErr w:type="spellStart"/>
+      <w:r>
+        <w:t>Wizard</w:t>
+      </w:r>
+      <w:proofErr w:type="spellEnd"/>
+      <w:r>
+        <w:t>.</w:t>
       </w:r>
     </w:p>
     <w:p>
@@ -9492,7 +9540,15 @@
               <w:pStyle w:val="Sinespaciado"/>
             </w:pPr>
             <w:r>
-              <w:t>Acceso completo: gestión de usuarios, permisos, bitácora, control de cambios, backup, idiomas y configuración.</w:t>
+              <w:t xml:space="preserve">Acceso completo: gestión de usuarios, permisos, bitácora, control de cambios, </w:t>
+            </w:r>
+            <w:proofErr w:type="spellStart"/>
+            <w:r>
+              <w:t>backup</w:t>
+            </w:r>
+            <w:proofErr w:type="spellEnd"/>
+            <w:r>
+              <w:t>, idiomas y configuración.</w:t>
             </w:r>
           </w:p>
         </w:tc>
@@ -9587,7 +9643,15 @@
     </w:p>
     <w:p>
       <w:r>
-        <w:t>Permisos de escritura en el directorio de instalación para almacenamiento de archivos .stachbak.</w:t>
+        <w:t>Permisos de escritura en el directorio de instalación para almacenamiento de archivos .</w:t>
+      </w:r>
+      <w:proofErr w:type="spellStart"/>
+      <w:r>
+        <w:t>stachbak</w:t>
+      </w:r>
+      <w:proofErr w:type="spellEnd"/>
+      <w:r>
+        <w:t>.</w:t>
       </w:r>
     </w:p>
     <w:p>
@@ -9602,7 +9666,23 @@
     </w:p>
     <w:p>
       <w:r>
-        <w:t>El código fuente debe estar comentado con XML documentation comments (///) siguiendo las convenciones de C#.</w:t>
+        <w:t xml:space="preserve">El código fuente debe estar comentado con XML </w:t>
+      </w:r>
+      <w:proofErr w:type="spellStart"/>
+      <w:r>
+        <w:t>documentation</w:t>
+      </w:r>
+      <w:proofErr w:type="spellEnd"/>
+      <w:r>
+        <w:t xml:space="preserve"> </w:t>
+      </w:r>
+      <w:proofErr w:type="spellStart"/>
+      <w:r>
+        <w:t>comments</w:t>
+      </w:r>
+      <w:proofErr w:type="spellEnd"/>
+      <w:r>
+        <w:t xml:space="preserve"> (///) siguiendo las convenciones de C#.</w:t>
       </w:r>
     </w:p>
     <w:p>
@@ -9630,13 +9710,7 @@
       <w:bookmarkStart w:id="30" w:name="_Toc227416497"/>
       <w:bookmarkStart w:id="31" w:name="_Toc233886156"/>
       <w:r>
-        <w:t>G06. Diagrama</w:t>
-      </w:r>
-      <w:r>
-        <w:t>s</w:t>
-      </w:r>
-      <w:r>
-        <w:t xml:space="preserve"> de clases parcial de todos los módulos implementado</w:t>
+        <w:t>G06. Diagramas de clases parcial de todos los módulos implementado</w:t>
       </w:r>
       <w:bookmarkEnd w:id="29"/>
       <w:bookmarkEnd w:id="30"/>
@@ -9661,10 +9735,10 @@
           <w:noProof/>
         </w:rPr>
         <w:drawing>
-          <wp:inline distT="0" distB="0" distL="0" distR="0" wp14:anchorId="1FF713C6" wp14:editId="528050EC">
-            <wp:extent cx="5753100" cy="3726180"/>
-            <wp:effectExtent l="0" t="0" r="0" b="7620"/>
-            <wp:docPr id="1841455106" name="Imagen 4"/>
+          <wp:inline distT="0" distB="0" distL="0" distR="0" wp14:anchorId="12B6BE22" wp14:editId="6C694C2E">
+            <wp:extent cx="5743575" cy="3181350"/>
+            <wp:effectExtent l="0" t="0" r="9525" b="0"/>
+            <wp:docPr id="132074467" name="Imagen 1"/>
             <wp:cNvGraphicFramePr>
               <a:graphicFrameLocks xmlns:a="http://schemas.openxmlformats.org/drawingml/2006/main" noChangeAspect="1"/>
             </wp:cNvGraphicFramePr>
@@ -9672,7 +9746,7 @@
               <a:graphicData uri="http://schemas.openxmlformats.org/drawingml/2006/picture">
                 <pic:pic xmlns:pic="http://schemas.openxmlformats.org/drawingml/2006/picture">
                   <pic:nvPicPr>
-                    <pic:cNvPr id="0" name="Picture 4"/>
+                    <pic:cNvPr id="0" name="Picture 1"/>
                     <pic:cNvPicPr>
                       <a:picLocks noChangeAspect="1" noChangeArrowheads="1"/>
                     </pic:cNvPicPr>
@@ -9693,7 +9767,7 @@
                   <pic:spPr bwMode="auto">
                     <a:xfrm>
                       <a:off x="0" y="0"/>
-                      <a:ext cx="5753100" cy="3726180"/>
+                      <a:ext cx="5743575" cy="3181350"/>
                     </a:xfrm>
                     <a:prstGeom prst="rect">
                       <a:avLst/>
@@ -9717,17 +9791,7 @@
       </w:pPr>
       <w:bookmarkStart w:id="33" w:name="_Toc233886158"/>
       <w:r>
-        <w:lastRenderedPageBreak/>
-        <w:t>G06.</w:t>
-      </w:r>
-      <w:r>
-        <w:t>2</w:t>
-      </w:r>
-      <w:r>
-        <w:t xml:space="preserve"> Diagrama de clases </w:t>
-      </w:r>
-      <w:r>
-        <w:t>– Abstracciones</w:t>
+        <w:t>G06.2 Diagrama de clases – Abstracciones</w:t>
       </w:r>
       <w:bookmarkEnd w:id="33"/>
     </w:p>
@@ -9740,7 +9804,7 @@
           <w:noProof/>
         </w:rPr>
         <w:drawing>
-          <wp:inline distT="0" distB="0" distL="0" distR="0" wp14:anchorId="0ED46D0F" wp14:editId="26ACE956">
+          <wp:inline distT="0" distB="0" distL="0" distR="0" wp14:anchorId="0ED46D0F" wp14:editId="3BEF7506">
             <wp:extent cx="5745480" cy="3009900"/>
             <wp:effectExtent l="0" t="0" r="7620" b="0"/>
             <wp:docPr id="216764778" name="Imagen 5"/>
@@ -9801,16 +9865,7 @@
       <w:bookmarkStart w:id="34" w:name="_Toc233886159"/>
       <w:r>
         <w:lastRenderedPageBreak/>
-        <w:t>G06.</w:t>
-      </w:r>
-      <w:r>
-        <w:t>3</w:t>
-      </w:r>
-      <w:r>
-        <w:t xml:space="preserve"> Diagrama de clases </w:t>
-      </w:r>
-      <w:r>
-        <w:t>– BLL</w:t>
+        <w:t>G06.3 Diagrama de clases – BLL</w:t>
       </w:r>
       <w:bookmarkEnd w:id="34"/>
     </w:p>
@@ -9884,16 +9939,7 @@
       <w:bookmarkStart w:id="35" w:name="_Toc233886160"/>
       <w:r>
         <w:lastRenderedPageBreak/>
-        <w:t>G06.</w:t>
-      </w:r>
-      <w:r>
-        <w:t>4</w:t>
-      </w:r>
-      <w:r>
-        <w:t xml:space="preserve"> Diagrama de clases </w:t>
-      </w:r>
-      <w:r>
-        <w:t>– Servicios</w:t>
+        <w:t>G06.4 Diagrama de clases – Servicios</w:t>
       </w:r>
       <w:bookmarkEnd w:id="35"/>
     </w:p>
@@ -9906,7 +9952,7 @@
           <w:noProof/>
         </w:rPr>
         <w:drawing>
-          <wp:inline distT="0" distB="0" distL="0" distR="0" wp14:anchorId="1AB79CBF" wp14:editId="1D858786">
+          <wp:inline distT="0" distB="0" distL="0" distR="0" wp14:anchorId="1AB79CBF" wp14:editId="2A69E7D4">
             <wp:extent cx="5753100" cy="4533900"/>
             <wp:effectExtent l="0" t="0" r="0" b="0"/>
             <wp:docPr id="1931336489" name="Imagen 7"/>
@@ -9966,16 +10012,7 @@
       </w:pPr>
       <w:bookmarkStart w:id="36" w:name="_Toc233886161"/>
       <w:r>
-        <w:t>G06.</w:t>
-      </w:r>
-      <w:r>
-        <w:t>5</w:t>
-      </w:r>
-      <w:r>
-        <w:t xml:space="preserve"> Diagrama de clases </w:t>
-      </w:r>
-      <w:r>
-        <w:t>– DAL</w:t>
+        <w:t>G06.5 Diagrama de clases – DAL</w:t>
       </w:r>
       <w:bookmarkEnd w:id="36"/>
     </w:p>
@@ -10049,18 +10086,14 @@
       <w:bookmarkStart w:id="37" w:name="_Toc233886162"/>
       <w:r>
         <w:lastRenderedPageBreak/>
-        <w:t>G06.</w:t>
-      </w:r>
-      <w:r>
-        <w:t>6</w:t>
-      </w:r>
-      <w:r>
-        <w:t xml:space="preserve"> Diagrama de clases </w:t>
-      </w:r>
-      <w:r>
-        <w:t>– IoC</w:t>
+        <w:t xml:space="preserve">G06.6 Diagrama de clases – </w:t>
+      </w:r>
+      <w:proofErr w:type="spellStart"/>
+      <w:r>
+        <w:t>IoC</w:t>
       </w:r>
       <w:bookmarkEnd w:id="37"/>
+      <w:proofErr w:type="spellEnd"/>
     </w:p>
     <w:p>
       <w:pPr>
@@ -10131,16 +10164,7 @@
       </w:pPr>
       <w:bookmarkStart w:id="38" w:name="_Toc233886163"/>
       <w:r>
-        <w:t xml:space="preserve">G06.6 Diagrama de clases </w:t>
-      </w:r>
-      <w:r>
-        <w:t>–</w:t>
-      </w:r>
-      <w:r>
-        <w:t xml:space="preserve"> </w:t>
-      </w:r>
-      <w:r>
-        <w:t>GUI</w:t>
+        <w:t>G06.6 Diagrama de clases – GUI</w:t>
       </w:r>
       <w:bookmarkEnd w:id="38"/>
     </w:p>
@@ -10236,10 +10260,10 @@
           <w:noProof/>
         </w:rPr>
         <w:drawing>
-          <wp:inline distT="0" distB="0" distL="0" distR="0" wp14:anchorId="7FD2FF45" wp14:editId="76A8B611">
-            <wp:extent cx="5753100" cy="4389120"/>
+          <wp:inline distT="0" distB="0" distL="0" distR="0" wp14:anchorId="0FB3C5B9" wp14:editId="2A7741E1">
+            <wp:extent cx="5753100" cy="4381500"/>
             <wp:effectExtent l="0" t="0" r="0" b="0"/>
-            <wp:docPr id="1976158144" name="Imagen 2"/>
+            <wp:docPr id="820690913" name="Imagen 1"/>
             <wp:cNvGraphicFramePr>
               <a:graphicFrameLocks xmlns:a="http://schemas.openxmlformats.org/drawingml/2006/main" noChangeAspect="1"/>
             </wp:cNvGraphicFramePr>
@@ -10247,7 +10271,7 @@
               <a:graphicData uri="http://schemas.openxmlformats.org/drawingml/2006/picture">
                 <pic:pic xmlns:pic="http://schemas.openxmlformats.org/drawingml/2006/picture">
                   <pic:nvPicPr>
-                    <pic:cNvPr id="0" name="Picture 2"/>
+                    <pic:cNvPr id="0" name="Picture 1"/>
                     <pic:cNvPicPr>
                       <a:picLocks noChangeAspect="1" noChangeArrowheads="1"/>
                     </pic:cNvPicPr>
@@ -10268,7 +10292,7 @@
                   <pic:spPr bwMode="auto">
                     <a:xfrm>
                       <a:off x="0" y="0"/>
-                      <a:ext cx="5753100" cy="4389120"/>
+                      <a:ext cx="5753100" cy="4381500"/>
                     </a:xfrm>
                     <a:prstGeom prst="rect">
                       <a:avLst/>
@@ -10953,7 +10977,15 @@
               <w:pStyle w:val="Sinespaciado"/>
             </w:pPr>
             <w:r>
-              <w:t>Recomponer Versión (Rollback)</w:t>
+              <w:t>Recomponer Versión (</w:t>
+            </w:r>
+            <w:proofErr w:type="spellStart"/>
+            <w:r>
+              <w:t>Rollback</w:t>
+            </w:r>
+            <w:proofErr w:type="spellEnd"/>
+            <w:r>
+              <w:t>)</w:t>
             </w:r>
           </w:p>
         </w:tc>
@@ -11007,8 +11039,13 @@
               <w:pStyle w:val="Sinespaciado"/>
             </w:pPr>
             <w:r>
-              <w:t>Crear Backup</w:t>
-            </w:r>
+              <w:t xml:space="preserve">Crear </w:t>
+            </w:r>
+            <w:proofErr w:type="spellStart"/>
+            <w:r>
+              <w:t>Backup</w:t>
+            </w:r>
+            <w:proofErr w:type="spellEnd"/>
           </w:p>
         </w:tc>
         <w:tc>
@@ -11020,8 +11057,13 @@
               <w:pStyle w:val="Sinespaciado"/>
             </w:pPr>
             <w:r>
-              <w:t>T07 Backup</w:t>
-            </w:r>
+              <w:t xml:space="preserve">T07 </w:t>
+            </w:r>
+            <w:proofErr w:type="spellStart"/>
+            <w:r>
+              <w:t>Backup</w:t>
+            </w:r>
+            <w:proofErr w:type="spellEnd"/>
           </w:p>
         </w:tc>
         <w:tc>
@@ -11061,7 +11103,23 @@
               <w:pStyle w:val="Sinespaciado"/>
             </w:pPr>
             <w:r>
-              <w:t>Restaurar Backup (Wizard)</w:t>
+              <w:t xml:space="preserve">Restaurar </w:t>
+            </w:r>
+            <w:proofErr w:type="spellStart"/>
+            <w:r>
+              <w:t>Backup</w:t>
+            </w:r>
+            <w:proofErr w:type="spellEnd"/>
+            <w:r>
+              <w:t xml:space="preserve"> (</w:t>
+            </w:r>
+            <w:proofErr w:type="spellStart"/>
+            <w:r>
+              <w:t>Wizard</w:t>
+            </w:r>
+            <w:proofErr w:type="spellEnd"/>
+            <w:r>
+              <w:t>)</w:t>
             </w:r>
           </w:p>
         </w:tc>
@@ -11074,8 +11132,13 @@
               <w:pStyle w:val="Sinespaciado"/>
             </w:pPr>
             <w:r>
-              <w:t>T07 Backup</w:t>
-            </w:r>
+              <w:t xml:space="preserve">T07 </w:t>
+            </w:r>
+            <w:proofErr w:type="spellStart"/>
+            <w:r>
+              <w:t>Backup</w:t>
+            </w:r>
+            <w:proofErr w:type="spellEnd"/>
           </w:p>
         </w:tc>
         <w:tc>
@@ -11154,25 +11217,7 @@
       <w:bookmarkStart w:id="51" w:name="_Toc233886168"/>
       <w:r>
         <w:lastRenderedPageBreak/>
-        <w:t>N0</w:t>
-      </w:r>
-      <w:r>
-        <w:t>2</w:t>
-      </w:r>
-      <w:r>
-        <w:t>.</w:t>
-      </w:r>
-      <w:r>
-        <w:t>1</w:t>
-      </w:r>
-      <w:r>
-        <w:t xml:space="preserve"> </w:t>
-      </w:r>
-      <w:r>
-        <w:t>Diagrama</w:t>
-      </w:r>
-      <w:r>
-        <w:t xml:space="preserve"> de Casos de Uso</w:t>
+        <w:t>N02.1 Diagrama de Casos de Uso</w:t>
       </w:r>
       <w:bookmarkEnd w:id="51"/>
     </w:p>
@@ -11457,7 +11502,15 @@
           </w:tcPr>
           <w:p>
             <w:r>
-              <w:t>BE (Business Entities)</w:t>
+              <w:t xml:space="preserve">BE (Business </w:t>
+            </w:r>
+            <w:proofErr w:type="spellStart"/>
+            <w:r>
+              <w:t>Entities</w:t>
+            </w:r>
+            <w:proofErr w:type="spellEnd"/>
+            <w:r>
+              <w:t>)</w:t>
             </w:r>
           </w:p>
         </w:tc>
@@ -11529,7 +11582,15 @@
           </w:tcPr>
           <w:p>
             <w:r>
-              <w:t>Contiene todas las interfaces (contratos) y tipos abstractos necesarios para desacoplar las capas, incluyendo el componente global IoCContainer.</w:t>
+              <w:t xml:space="preserve">Contiene todas las interfaces (contratos) y tipos abstractos necesarios para desacoplar las capas, incluyendo el componente global </w:t>
+            </w:r>
+            <w:proofErr w:type="spellStart"/>
+            <w:r>
+              <w:t>IoCContainer</w:t>
+            </w:r>
+            <w:proofErr w:type="spellEnd"/>
+            <w:r>
+              <w:t>.</w:t>
             </w:r>
           </w:p>
         </w:tc>
@@ -11604,7 +11665,15 @@
           </w:tcPr>
           <w:p>
             <w:r>
-              <w:t>Servicios (Cross-cutting)</w:t>
+              <w:t>Servicios (Cross-</w:t>
+            </w:r>
+            <w:proofErr w:type="spellStart"/>
+            <w:r>
+              <w:t>cutting</w:t>
+            </w:r>
+            <w:proofErr w:type="spellEnd"/>
+            <w:r>
+              <w:t>)</w:t>
             </w:r>
           </w:p>
         </w:tc>
@@ -11627,7 +11696,23 @@
           </w:tcPr>
           <w:p>
             <w:r>
-              <w:t>Capa transversal que implementa los servicios comunes del sistema (cifrado AES-256/PBKDF2, copias de seguridad, multiidioma con Observer, auditoría de bitácora e integridad por dígitos verificadores).</w:t>
+              <w:t xml:space="preserve">Capa transversal que implementa los servicios comunes del sistema (cifrado AES-256/PBKDF2, copias de seguridad, </w:t>
+            </w:r>
+            <w:proofErr w:type="spellStart"/>
+            <w:r>
+              <w:t>multiidioma</w:t>
+            </w:r>
+            <w:proofErr w:type="spellEnd"/>
+            <w:r>
+              <w:t xml:space="preserve"> con </w:t>
+            </w:r>
+            <w:proofErr w:type="spellStart"/>
+            <w:r>
+              <w:t>Observer</w:t>
+            </w:r>
+            <w:proofErr w:type="spellEnd"/>
+            <w:r>
+              <w:t>, auditoría de bitácora e integridad por dígitos verificadores).</w:t>
             </w:r>
           </w:p>
         </w:tc>
@@ -11701,8 +11786,13 @@
             <w:hideMark/>
           </w:tcPr>
           <w:p>
-            <w:r>
-              <w:t>IoC (Inversión de Control)</w:t>
+            <w:proofErr w:type="spellStart"/>
+            <w:r>
+              <w:t>IoC</w:t>
+            </w:r>
+            <w:proofErr w:type="spellEnd"/>
+            <w:r>
+              <w:t xml:space="preserve"> (Inversión de Control)</w:t>
             </w:r>
           </w:p>
         </w:tc>
@@ -11725,7 +11815,15 @@
           </w:tcPr>
           <w:p>
             <w:r>
-              <w:t>Raíz de composición (Composition Root) que registra todas las implementaciones concretas de la solución en el contenedor al arrancar la aplicación.</w:t>
+              <w:t>Raíz de composición (</w:t>
+            </w:r>
+            <w:proofErr w:type="spellStart"/>
+            <w:r>
+              <w:t>Composition</w:t>
+            </w:r>
+            <w:proofErr w:type="spellEnd"/>
+            <w:r>
+              <w:t xml:space="preserve"> Root) que registra todas las implementaciones concretas de la solución en el contenedor al arrancar la aplicación.</w:t>
             </w:r>
           </w:p>
         </w:tc>
@@ -12172,7 +12270,7 @@
           <w:noProof/>
         </w:rPr>
         <w:drawing>
-          <wp:inline distT="0" distB="0" distL="0" distR="0" wp14:anchorId="5B1A5E04" wp14:editId="10D9A175">
+          <wp:inline distT="0" distB="0" distL="0" distR="0" wp14:anchorId="5B1A5E04" wp14:editId="24CEBE5E">
             <wp:extent cx="5760720" cy="4899660"/>
             <wp:effectExtent l="0" t="0" r="0" b="0"/>
             <wp:docPr id="1208570288" name="Imagen 4"/>
@@ -12246,7 +12344,7 @@
           <w:noProof/>
         </w:rPr>
         <w:drawing>
-          <wp:inline distT="0" distB="0" distL="0" distR="0" wp14:anchorId="326DDC78" wp14:editId="0A4EECA8">
+          <wp:inline distT="0" distB="0" distL="0" distR="0" wp14:anchorId="326DDC78" wp14:editId="5B63F584">
             <wp:extent cx="5753100" cy="4526280"/>
             <wp:effectExtent l="0" t="0" r="0" b="7620"/>
             <wp:docPr id="1325704531" name="Imagen 5"/>
@@ -12385,7 +12483,21 @@
           <w:lang w:val="es-ES"/>
         </w:rPr>
         <w:lastRenderedPageBreak/>
-        <w:t>T02. Gestión de Log In / Log Out del Sistema</w:t>
+        <w:t xml:space="preserve">T02. Gestión de Log In / Log </w:t>
+      </w:r>
+      <w:proofErr w:type="spellStart"/>
+      <w:r>
+        <w:rPr>
+          <w:lang w:val="es-ES"/>
+        </w:rPr>
+        <w:t>Out</w:t>
+      </w:r>
+      <w:proofErr w:type="spellEnd"/>
+      <w:r>
+        <w:rPr>
+          <w:lang w:val="es-ES"/>
+        </w:rPr>
+        <w:t xml:space="preserve"> del Sistema</w:t>
       </w:r>
       <w:bookmarkEnd w:id="65"/>
       <w:bookmarkEnd w:id="66"/>
@@ -12491,7 +12603,15 @@
         </w:numPr>
       </w:pPr>
       <w:r>
-        <w:t>Una vez autenticado, el patrón Singleton (SessionManager) persiste la identidad del usuario en memoria.</w:t>
+        <w:t>Una vez autenticado, el patrón Singleton (</w:t>
+      </w:r>
+      <w:proofErr w:type="spellStart"/>
+      <w:r>
+        <w:t>SessionManager</w:t>
+      </w:r>
+      <w:proofErr w:type="spellEnd"/>
+      <w:r>
+        <w:t>) persiste la identidad del usuario en memoria.</w:t>
       </w:r>
     </w:p>
     <w:p>
@@ -12511,7 +12631,15 @@
         </w:numPr>
       </w:pPr>
       <w:r>
-        <w:t>Se registra el cierre de sesión en la bitácora ANTES de limpiar la instancia del SessionManager.</w:t>
+        <w:t xml:space="preserve">Se registra el cierre de sesión en la bitácora ANTES de limpiar la instancia del </w:t>
+      </w:r>
+      <w:proofErr w:type="spellStart"/>
+      <w:r>
+        <w:t>SessionManager</w:t>
+      </w:r>
+      <w:proofErr w:type="spellEnd"/>
+      <w:r>
+        <w:t>.</w:t>
       </w:r>
     </w:p>
     <w:p>
@@ -12523,7 +12651,15 @@
         </w:numPr>
       </w:pPr>
       <w:r>
-        <w:t>Se limpia la instancia del SessionManager (usuario = nulo), y se reinicia la aplicación.</w:t>
+        <w:t xml:space="preserve">Se limpia la instancia del </w:t>
+      </w:r>
+      <w:proofErr w:type="spellStart"/>
+      <w:r>
+        <w:t>SessionManager</w:t>
+      </w:r>
+      <w:proofErr w:type="spellEnd"/>
+      <w:r>
+        <w:t xml:space="preserve"> (usuario = nulo), y se reinicia la aplicación.</w:t>
       </w:r>
     </w:p>
     <w:p>
@@ -12708,7 +12844,23 @@
           </w:tcPr>
           <w:p>
             <w:r>
-              <w:t>1. Verificar conexión a base de datos vía IConexionService (IoCContainer). 2. Si falla: mostrar mensaje de error y cerrar la aplicación. 3. Presentar formulario de Login.</w:t>
+              <w:t xml:space="preserve">1. Verificar conexión a base de datos vía </w:t>
+            </w:r>
+            <w:proofErr w:type="spellStart"/>
+            <w:r>
+              <w:t>IConexionService</w:t>
+            </w:r>
+            <w:proofErr w:type="spellEnd"/>
+            <w:r>
+              <w:t xml:space="preserve"> (</w:t>
+            </w:r>
+            <w:proofErr w:type="spellStart"/>
+            <w:r>
+              <w:t>IoCContainer</w:t>
+            </w:r>
+            <w:proofErr w:type="spellEnd"/>
+            <w:r>
+              <w:t>). 2. Si falla: mostrar mensaje de error y cerrar la aplicación. 3. Presentar formulario de Login.</w:t>
             </w:r>
           </w:p>
         </w:tc>
@@ -12775,7 +12927,23 @@
               <w:pStyle w:val="Sinespaciado"/>
             </w:pPr>
             <w:r>
-              <w:t>1. Recuperar Usuario por username (plaintext) desde la base de datos.</w:t>
+              <w:t xml:space="preserve">1. Recuperar Usuario por </w:t>
+            </w:r>
+            <w:proofErr w:type="spellStart"/>
+            <w:r>
+              <w:t>username</w:t>
+            </w:r>
+            <w:proofErr w:type="spellEnd"/>
+            <w:r>
+              <w:t xml:space="preserve"> (</w:t>
+            </w:r>
+            <w:proofErr w:type="spellStart"/>
+            <w:r>
+              <w:t>plaintext</w:t>
+            </w:r>
+            <w:proofErr w:type="spellEnd"/>
+            <w:r>
+              <w:t>) desde la base de datos.</w:t>
             </w:r>
           </w:p>
           <w:p>
@@ -12807,15 +12975,31 @@
               <w:pStyle w:val="Sinespaciado"/>
             </w:pPr>
             <w:r>
-              <w:t>5. Almacenar usuario activo en SessionManager.</w:t>
-            </w:r>
-          </w:p>
-          <w:p>
-            <w:pPr>
-              <w:pStyle w:val="Sinespaciado"/>
-            </w:pPr>
-            <w:r>
-              <w:t xml:space="preserve">6. Registrar en Bitácora (login exitoso). </w:t>
+              <w:t xml:space="preserve">5. Almacenar usuario activo en </w:t>
+            </w:r>
+            <w:proofErr w:type="spellStart"/>
+            <w:r>
+              <w:t>SessionManager</w:t>
+            </w:r>
+            <w:proofErr w:type="spellEnd"/>
+            <w:r>
+              <w:t>.</w:t>
+            </w:r>
+          </w:p>
+          <w:p>
+            <w:pPr>
+              <w:pStyle w:val="Sinespaciado"/>
+            </w:pPr>
+            <w:r>
+              <w:t>6. Registrar en Bitácora (</w:t>
+            </w:r>
+            <w:proofErr w:type="spellStart"/>
+            <w:r>
+              <w:t>login</w:t>
+            </w:r>
+            <w:proofErr w:type="spellEnd"/>
+            <w:r>
+              <w:t xml:space="preserve"> exitoso). </w:t>
             </w:r>
           </w:p>
           <w:p>
@@ -12989,7 +13173,15 @@
               <w:pStyle w:val="Sinespaciado"/>
             </w:pPr>
             <w:r>
-              <w:t>2. Realizar Logout y setear Usuario en nulo</w:t>
+              <w:t xml:space="preserve">2. Realizar Logout y </w:t>
+            </w:r>
+            <w:proofErr w:type="spellStart"/>
+            <w:r>
+              <w:t>setear</w:t>
+            </w:r>
+            <w:proofErr w:type="spellEnd"/>
+            <w:r>
+              <w:t xml:space="preserve"> Usuario en nulo</w:t>
             </w:r>
           </w:p>
           <w:p>
@@ -13072,7 +13264,15 @@
               <w:pStyle w:val="Sinespaciado"/>
             </w:pPr>
             <w:r>
-              <w:t>2. Recursos del SessionManager liberados por GC.</w:t>
+              <w:t xml:space="preserve">2. Recursos del </w:t>
+            </w:r>
+            <w:proofErr w:type="spellStart"/>
+            <w:r>
+              <w:t>SessionManager</w:t>
+            </w:r>
+            <w:proofErr w:type="spellEnd"/>
+            <w:r>
+              <w:t xml:space="preserve"> liberados por GC.</w:t>
             </w:r>
           </w:p>
         </w:tc>
@@ -13173,7 +13373,7 @@
           <w:noProof/>
         </w:rPr>
         <w:drawing>
-          <wp:inline distT="0" distB="0" distL="0" distR="0" wp14:anchorId="7B5C8B68" wp14:editId="06F5446E">
+          <wp:inline distT="0" distB="0" distL="0" distR="0" wp14:anchorId="7B5C8B68" wp14:editId="6F20E0FB">
             <wp:extent cx="5760720" cy="4207510"/>
             <wp:effectExtent l="0" t="0" r="0" b="2540"/>
             <wp:docPr id="2107352544" name="Imagen 8"/>
@@ -14426,26 +14626,82 @@
         <w:rPr>
           <w:lang w:val="es-ES"/>
         </w:rPr>
-        <w:t>Proteger los datos sensibles del sistema mediante algoritmos de encriptación robustos. Se implementa un mecanismo de hash irreversible con Salt para contraseñas (PBKDF2), resistente a ataques de fuerza bruta, tablas rainbow y diccionario. Adicionalmente, se implementa cifrado simétrico AES-256 para proteger datos sensibles almacenados en la base de datos.</w:t>
-      </w:r>
-    </w:p>
-    <w:p/>
-    <w:p>
-      <w:pPr>
-        <w:pStyle w:val="Ttulo3"/>
-      </w:pPr>
-      <w:bookmarkStart w:id="82" w:name="_Toc233886191"/>
-      <w:r>
-        <w:t>Algoritmos Implementados – Hash de Contraseñas PBKDF2</w:t>
-      </w:r>
-      <w:bookmarkEnd w:id="82"/>
-    </w:p>
-    <w:p>
+        <w:t xml:space="preserve">Proteger los datos sensibles del sistema mediante algoritmos de encriptación robustos. Se implementa un mecanismo de hash irreversible con Salt para contraseñas (PBKDF2), resistente a ataques de fuerza bruta, tablas </w:t>
+      </w:r>
+      <w:proofErr w:type="spellStart"/>
       <w:r>
         <w:rPr>
           <w:lang w:val="es-ES"/>
         </w:rPr>
-        <w:t>Se utiliza PBKDF2 (Password-Based Key Derivation Function 2) implementado mediante la clase Rfc2898DeriveBytes de .NET con HMAC-SHA256.</w:t>
+        <w:t>rainbow</w:t>
+      </w:r>
+      <w:proofErr w:type="spellEnd"/>
+      <w:r>
+        <w:rPr>
+          <w:lang w:val="es-ES"/>
+        </w:rPr>
+        <w:t xml:space="preserve"> y diccionario. Adicionalmente, se implementa cifrado simétrico AES-256 para proteger datos sensibles almacenados en la base de datos.</w:t>
+      </w:r>
+    </w:p>
+    <w:p/>
+    <w:p>
+      <w:pPr>
+        <w:pStyle w:val="Ttulo3"/>
+      </w:pPr>
+      <w:bookmarkStart w:id="82" w:name="_Toc233886191"/>
+      <w:r>
+        <w:t>Algoritmos Implementados – Hash de Contraseñas PBKDF2</w:t>
+      </w:r>
+      <w:bookmarkEnd w:id="82"/>
+    </w:p>
+    <w:p>
+      <w:r>
+        <w:rPr>
+          <w:lang w:val="es-ES"/>
+        </w:rPr>
+        <w:t>Se utiliza PBKDF2 (</w:t>
+      </w:r>
+      <w:proofErr w:type="spellStart"/>
+      <w:r>
+        <w:rPr>
+          <w:lang w:val="es-ES"/>
+        </w:rPr>
+        <w:t>Password-Based</w:t>
+      </w:r>
+      <w:proofErr w:type="spellEnd"/>
+      <w:r>
+        <w:rPr>
+          <w:lang w:val="es-ES"/>
+        </w:rPr>
+        <w:t xml:space="preserve"> Key </w:t>
+      </w:r>
+      <w:proofErr w:type="spellStart"/>
+      <w:r>
+        <w:rPr>
+          <w:lang w:val="es-ES"/>
+        </w:rPr>
+        <w:t>Derivation</w:t>
+      </w:r>
+      <w:proofErr w:type="spellEnd"/>
+      <w:r>
+        <w:rPr>
+          <w:lang w:val="es-ES"/>
+        </w:rPr>
+        <w:t xml:space="preserve"> </w:t>
+      </w:r>
+      <w:proofErr w:type="spellStart"/>
+      <w:r>
+        <w:rPr>
+          <w:lang w:val="es-ES"/>
+        </w:rPr>
+        <w:t>Function</w:t>
+      </w:r>
+      <w:proofErr w:type="spellEnd"/>
+      <w:r>
+        <w:rPr>
+          <w:lang w:val="es-ES"/>
+        </w:rPr>
+        <w:t xml:space="preserve"> 2) implementado mediante la clase Rfc2898DeriveBytes de .NET con HMAC-SHA256.</w:t>
       </w:r>
     </w:p>
     <w:p/>
@@ -14715,7 +14971,15 @@
               <w:pStyle w:val="Sinespaciado"/>
             </w:pPr>
             <w:r>
-              <w:t>16 bytes aleatorios (RandomNumberGenerator)</w:t>
+              <w:t>16 bytes aleatorios (</w:t>
+            </w:r>
+            <w:proofErr w:type="spellStart"/>
+            <w:r>
+              <w:t>RandomNumberGenerator</w:t>
+            </w:r>
+            <w:proofErr w:type="spellEnd"/>
+            <w:r>
+              <w:t>)</w:t>
             </w:r>
           </w:p>
         </w:tc>
@@ -14742,8 +15006,21 @@
               <w:pStyle w:val="Sinespaciado"/>
             </w:pPr>
             <w:r>
-              <w:t>Previene ataques de tablas rainbow y diccionario precomputados</w:t>
-            </w:r>
+              <w:t xml:space="preserve">Previene ataques de tablas </w:t>
+            </w:r>
+            <w:proofErr w:type="spellStart"/>
+            <w:r>
+              <w:t>rainbow</w:t>
+            </w:r>
+            <w:proofErr w:type="spellEnd"/>
+            <w:r>
+              <w:t xml:space="preserve"> y diccionario </w:t>
+            </w:r>
+            <w:proofErr w:type="spellStart"/>
+            <w:r>
+              <w:t>precomputados</w:t>
+            </w:r>
+            <w:proofErr w:type="spellEnd"/>
           </w:p>
         </w:tc>
       </w:tr>
@@ -14973,8 +15250,13 @@
               <w:pStyle w:val="Sinespaciado"/>
             </w:pPr>
             <w:r>
-              <w:t>Base64(Salt + hash) = 64 chars</w:t>
-            </w:r>
+              <w:t xml:space="preserve">Base64(Salt + hash) = 64 </w:t>
+            </w:r>
+            <w:proofErr w:type="spellStart"/>
+            <w:r>
+              <w:t>chars</w:t>
+            </w:r>
+            <w:proofErr w:type="spellEnd"/>
           </w:p>
         </w:tc>
         <w:tc>
@@ -15023,11 +15305,59 @@
     </w:p>
     <w:p>
       <w:r>
-        <w:t xml:space="preserve">Se utiliza AES-256 (Advanced Encryption Standard) en modo CBC para el cifrado de archivos de copia de seguridad. El sistema cifra el archivo .bak generando el archivo .stachbak protegido. La clave de cifrado se deriva mediante PBKDF2. El cifrado y </w:t>
+        <w:t>Se utiliza AES-256 (</w:t>
+      </w:r>
+      <w:proofErr w:type="spellStart"/>
+      <w:r>
+        <w:t>Advanced</w:t>
+      </w:r>
+      <w:proofErr w:type="spellEnd"/>
+      <w:r>
+        <w:t xml:space="preserve"> </w:t>
+      </w:r>
+      <w:proofErr w:type="spellStart"/>
+      <w:r>
+        <w:t>Encryption</w:t>
+      </w:r>
+      <w:proofErr w:type="spellEnd"/>
+      <w:r>
+        <w:t xml:space="preserve"> Standard) en modo CBC para el cifrado de archivos de copia de seguridad. El sistema cifra el archivo .</w:t>
+      </w:r>
+      <w:proofErr w:type="spellStart"/>
+      <w:r>
+        <w:t>bak</w:t>
+      </w:r>
+      <w:proofErr w:type="spellEnd"/>
+      <w:r>
+        <w:t xml:space="preserve"> generando el archivo .</w:t>
+      </w:r>
+      <w:proofErr w:type="spellStart"/>
+      <w:r>
+        <w:t>stachbak</w:t>
+      </w:r>
+      <w:proofErr w:type="spellEnd"/>
+      <w:r>
+        <w:t xml:space="preserve"> protegido. La clave de cifrado se deriva mediante PBKDF2. El cifrado y </w:t>
       </w:r>
       <w:r>
         <w:lastRenderedPageBreak/>
-        <w:t>descifrado se realizan íntegramente en la capa Servicios (BackupService y CifradorHelper), por lo que la DAL y la BLL nunca interactúan con datos cifrados.</w:t>
+        <w:t>descifrado se realizan íntegramente en la capa Servicios (</w:t>
+      </w:r>
+      <w:proofErr w:type="spellStart"/>
+      <w:r>
+        <w:t>BackupService</w:t>
+      </w:r>
+      <w:proofErr w:type="spellEnd"/>
+      <w:r>
+        <w:t xml:space="preserve"> y </w:t>
+      </w:r>
+      <w:proofErr w:type="spellStart"/>
+      <w:r>
+        <w:t>CifradorHelper</w:t>
+      </w:r>
+      <w:proofErr w:type="spellEnd"/>
+      <w:r>
+        <w:t>), por lo que la DAL y la BLL nunca interactúan con datos cifrados.</w:t>
       </w:r>
     </w:p>
     <w:p/>
@@ -15398,7 +15728,15 @@
               <w:pStyle w:val="Sinespaciado"/>
             </w:pPr>
             <w:r>
-              <w:t>Garantiza el descifrado consistente y reproducible del archivo de backup.</w:t>
+              <w:t xml:space="preserve">Garantiza el descifrado consistente y reproducible del archivo de </w:t>
+            </w:r>
+            <w:proofErr w:type="spellStart"/>
+            <w:r>
+              <w:t>backup</w:t>
+            </w:r>
+            <w:proofErr w:type="spellEnd"/>
+            <w:r>
+              <w:t>.</w:t>
             </w:r>
           </w:p>
         </w:tc>
@@ -15538,7 +15876,15 @@
               <w:pStyle w:val="Sinespaciado"/>
             </w:pPr>
             <w:r>
-              <w:t>Archivos de copia de seguridad (.stachbak)</w:t>
+              <w:t>Archivos de copia de seguridad (.</w:t>
+            </w:r>
+            <w:proofErr w:type="spellStart"/>
+            <w:r>
+              <w:t>stachbak</w:t>
+            </w:r>
+            <w:proofErr w:type="spellEnd"/>
+            <w:r>
+              <w:t>)</w:t>
             </w:r>
           </w:p>
         </w:tc>
@@ -15582,9 +15928,14 @@
       <w:bookmarkStart w:id="84" w:name="_Toc233886193"/>
       <w:r>
         <w:lastRenderedPageBreak/>
-        <w:t>Diagrama de Clases – Encriptador</w:t>
+        <w:t xml:space="preserve">Diagrama de Clases – </w:t>
+      </w:r>
+      <w:proofErr w:type="spellStart"/>
+      <w:r>
+        <w:t>Encriptador</w:t>
       </w:r>
       <w:bookmarkEnd w:id="84"/>
+      <w:proofErr w:type="spellEnd"/>
     </w:p>
     <w:p>
       <w:pPr>
@@ -15694,31 +16045,127 @@
     </w:p>
     <w:p>
       <w:r>
-        <w:t>Se implementa el patrón de diseño Composite. Los permisos del sistema se modelan bajo la clase abstracta ComponentePermiso (capa BE), la cual define las firmas básicas para agregar o quitar elementos, y expone propiedades como IdPermiso, Nombre y PermisoKey. De esta clase abstracta heredan dos de las implementaciones principales:</w:t>
+        <w:t xml:space="preserve">Se implementa el patrón de diseño Composite. Los permisos del sistema se modelan bajo la clase abstracta </w:t>
+      </w:r>
+      <w:proofErr w:type="spellStart"/>
+      <w:r>
+        <w:t>ComponentePermiso</w:t>
+      </w:r>
+      <w:proofErr w:type="spellEnd"/>
+      <w:r>
+        <w:t xml:space="preserve"> (capa BE), la cual define las firmas básicas para agregar o quitar elementos, y expone propiedades como </w:t>
+      </w:r>
+      <w:proofErr w:type="spellStart"/>
+      <w:r>
+        <w:t>IdPermiso</w:t>
+      </w:r>
+      <w:proofErr w:type="spellEnd"/>
+      <w:r>
+        <w:t xml:space="preserve">, Nombre y </w:t>
+      </w:r>
+      <w:proofErr w:type="spellStart"/>
+      <w:r>
+        <w:t>PermisoKey</w:t>
+      </w:r>
+      <w:proofErr w:type="spellEnd"/>
+      <w:r>
+        <w:t>. De esta clase abstracta heredan dos de las implementaciones principales:</w:t>
       </w:r>
     </w:p>
     <w:p/>
     <w:p>
       <w:r>
-        <w:t>1. Permiso (Leaf): Representa un permiso de granularidad atómica asociado a una función específica del sistema (por ejemplo, ‘Usuarios’ o ‘Backups’). Al ser una hoja en laestructura jerárquica, no admite elementos hijo y lanza una excepción si se intenta llamar a Agregar o Quitar.</w:t>
+        <w:t>1. Permiso (</w:t>
+      </w:r>
+      <w:proofErr w:type="spellStart"/>
+      <w:r>
+        <w:t>Leaf</w:t>
+      </w:r>
+      <w:proofErr w:type="spellEnd"/>
+      <w:r>
+        <w:t>): Representa un permiso de granularidad atómica asociado a una función específica del sistema (por ejemplo, ‘Usuarios’ o ‘</w:t>
+      </w:r>
+      <w:proofErr w:type="spellStart"/>
+      <w:r>
+        <w:t>Backups</w:t>
+      </w:r>
+      <w:proofErr w:type="spellEnd"/>
+      <w:r>
+        <w:t xml:space="preserve">’). Al ser una hoja en </w:t>
+      </w:r>
+      <w:proofErr w:type="spellStart"/>
+      <w:r>
+        <w:t>laestructura</w:t>
+      </w:r>
+      <w:proofErr w:type="spellEnd"/>
+      <w:r>
+        <w:t xml:space="preserve"> jerárquica, no admite elementos hijo y lanza una excepción si se intenta llamar a Agregar o Quitar.</w:t>
       </w:r>
     </w:p>
     <w:p/>
     <w:p>
       <w:r>
-        <w:t>2. Rol (Composite): Representa un permiso compuesto que puede contener tanto permisos simples como otros roles, permitiendo crear jerarquías de roles complejas (por ejemplo, el perfil Administrador que contiene el rol de Gestión de Usuarios y Gestión de Backups).</w:t>
+        <w:t xml:space="preserve">2. Rol (Composite): Representa un permiso compuesto que puede contener tanto permisos simples como otros roles, permitiendo crear jerarquías de roles complejas (por ejemplo, el perfil Administrador que contiene el rol de Gestión de Usuarios y Gestión de </w:t>
+      </w:r>
+      <w:proofErr w:type="spellStart"/>
+      <w:r>
+        <w:t>Backups</w:t>
+      </w:r>
+      <w:proofErr w:type="spellEnd"/>
+      <w:r>
+        <w:t>).</w:t>
       </w:r>
     </w:p>
     <w:p/>
     <w:p>
       <w:r>
-        <w:t>La asignación de permisos se vincula directamente entre la entidad Usuario y la clase ComponentePermiso (relación de muchos a muchos). Al iniciar la sesión, el sistema evalúa y resuelve recursivamente todos los permisos efectivos que posee el usuario, recorriendo la estructura de árbol y acumulando los permisos sin duplicados en el SessionManager.</w:t>
+        <w:t xml:space="preserve">La asignación de permisos se vincula directamente entre la entidad Usuario y la clase </w:t>
+      </w:r>
+      <w:proofErr w:type="spellStart"/>
+      <w:r>
+        <w:t>ComponentePermiso</w:t>
+      </w:r>
+      <w:proofErr w:type="spellEnd"/>
+      <w:r>
+        <w:t xml:space="preserve"> (relación de muchos a muchos). Al iniciar la sesión, el sistema evalúa y resuelve recursivamente todos los permisos efectivos que posee el usuario, recorriendo la estructura de árbol y acumulando los permisos sin duplicados en el </w:t>
+      </w:r>
+      <w:proofErr w:type="spellStart"/>
+      <w:r>
+        <w:t>SessionManager</w:t>
+      </w:r>
+      <w:proofErr w:type="spellEnd"/>
+      <w:r>
+        <w:t>.</w:t>
       </w:r>
     </w:p>
     <w:p/>
     <w:p>
       <w:r>
-        <w:t>En la interfaz gráfica, se utiliza una función recursiva que recorre el árbol de permisos del Composite y lo representa visualmente en un control TreeView de Windows Forms. Adicionalmente, el sistema permite quitar permisos del usuario seleccionándolos directamente desde el árbol gráfico en el formulario MisPermisosForm.</w:t>
+        <w:t xml:space="preserve">En la interfaz gráfica, se utiliza una función recursiva que recorre el árbol de permisos del Composite y lo representa visualmente en un control </w:t>
+      </w:r>
+      <w:proofErr w:type="spellStart"/>
+      <w:r>
+        <w:t>TreeView</w:t>
+      </w:r>
+      <w:proofErr w:type="spellEnd"/>
+      <w:r>
+        <w:t xml:space="preserve"> de Windows </w:t>
+      </w:r>
+      <w:proofErr w:type="spellStart"/>
+      <w:r>
+        <w:t>Forms</w:t>
+      </w:r>
+      <w:proofErr w:type="spellEnd"/>
+      <w:r>
+        <w:t xml:space="preserve">. Adicionalmente, el sistema permite quitar permisos del usuario seleccionándolos directamente desde el árbol gráfico en el formulario </w:t>
+      </w:r>
+      <w:proofErr w:type="spellStart"/>
+      <w:r>
+        <w:t>MisPermisosForm</w:t>
+      </w:r>
+      <w:proofErr w:type="spellEnd"/>
+      <w:r>
+        <w:t>.</w:t>
       </w:r>
     </w:p>
     <w:p/>
@@ -15810,10 +16257,10 @@
           <w:noProof/>
         </w:rPr>
         <w:drawing>
-          <wp:inline distT="0" distB="0" distL="0" distR="0" wp14:anchorId="5EE1BAC4" wp14:editId="1BC11975">
-            <wp:extent cx="5760720" cy="2886710"/>
-            <wp:effectExtent l="0" t="0" r="0" b="8890"/>
-            <wp:docPr id="147929209" name="Imagen 14"/>
+          <wp:inline distT="0" distB="0" distL="0" distR="0" wp14:anchorId="3FAC2217" wp14:editId="37514393">
+            <wp:extent cx="5753100" cy="2895600"/>
+            <wp:effectExtent l="0" t="0" r="0" b="0"/>
+            <wp:docPr id="73320327" name="Imagen 2"/>
             <wp:cNvGraphicFramePr>
               <a:graphicFrameLocks xmlns:a="http://schemas.openxmlformats.org/drawingml/2006/main" noChangeAspect="1"/>
             </wp:cNvGraphicFramePr>
@@ -15821,7 +16268,7 @@
               <a:graphicData uri="http://schemas.openxmlformats.org/drawingml/2006/picture">
                 <pic:pic xmlns:pic="http://schemas.openxmlformats.org/drawingml/2006/picture">
                   <pic:nvPicPr>
-                    <pic:cNvPr id="0" name="Picture 22"/>
+                    <pic:cNvPr id="0" name="Picture 2"/>
                     <pic:cNvPicPr>
                       <a:picLocks noChangeAspect="1" noChangeArrowheads="1"/>
                     </pic:cNvPicPr>
@@ -15842,7 +16289,7 @@
                   <pic:spPr bwMode="auto">
                     <a:xfrm>
                       <a:off x="0" y="0"/>
-                      <a:ext cx="5760720" cy="2886710"/>
+                      <a:ext cx="5753100" cy="2895600"/>
                     </a:xfrm>
                     <a:prstGeom prst="rect">
                       <a:avLst/>
@@ -16277,7 +16724,23 @@
               <w:pStyle w:val="Sinespaciado"/>
             </w:pPr>
             <w:r>
-              <w:t>1. El administrador selecciona Usuarios en el menú principal. 2. La interfaz muestra el formulario de Gestión de Usuarios con la grilla de usuarios. 3. El administrador selecciona la operación deseada (Nuevo / Modificar / Desactivar) e ingresa o modifica los datos correspondientes. 4. El administrador confirma la operación. 5. La interfaz actualiza la grilla reflejando el resultado.</w:t>
+              <w:t>1. El administrador selecciona Usuarios en el menú principal.</w:t>
+            </w:r>
+            <w:r>
+              <w:br/>
+              <w:t>2. La interfaz muestra el formulario de Gestión de Usuarios con la grilla de usuarios.</w:t>
+            </w:r>
+            <w:r>
+              <w:br/>
+              <w:t>3. El administrador selecciona la operación deseada (Nuevo / Modificar / Desactivar) e ingresa o modifica los datos correspondientes.</w:t>
+            </w:r>
+            <w:r>
+              <w:br/>
+              <w:t>4. El administrador confirma la operación.</w:t>
+            </w:r>
+            <w:r>
+              <w:br/>
+              <w:t>5. La interfaz actualiza la grilla reflejando el resultado.</w:t>
             </w:r>
           </w:p>
         </w:tc>
@@ -16318,7 +16781,27 @@
               <w:pStyle w:val="Sinespaciado"/>
             </w:pPr>
             <w:r>
-              <w:t>4.1.1. Los datos ingresados son inválidos o incompletos: 4.1.2. La interfaz muestra el mensaje de validación correspondiente. 4.1.3. Retorna al paso 3. 4.2.1. El nombre de usuario ya existe en el sistema (Alta): 4.2.2. La interfaz muestra El nombre de usuario ya está en uso. 4.2.3. Retorna al paso 3.</w:t>
+              <w:t>4.1.1. Los datos ingresados son inválidos o incompletos:</w:t>
+            </w:r>
+            <w:r>
+              <w:br/>
+              <w:t>4.1.2. La interfaz muestra el mensaje de validación correspondiente.</w:t>
+            </w:r>
+            <w:r>
+              <w:br/>
+              <w:t>4.1.3. Retorna al paso 3.</w:t>
+            </w:r>
+            <w:r>
+              <w:br/>
+              <w:t>4.2.1. El nombre de usuario ya existe en el sistema (Alta):</w:t>
+            </w:r>
+            <w:r>
+              <w:br/>
+              <w:t>4.2.2. La interfaz muestra El nombre de usuario ya está en uso.</w:t>
+            </w:r>
+            <w:r>
+              <w:br/>
+              <w:t>4.2.3. Retorna al paso 3.</w:t>
             </w:r>
           </w:p>
         </w:tc>
@@ -16586,7 +17069,7 @@
               <w:pStyle w:val="Sinespaciado"/>
             </w:pPr>
             <w:r>
-              <w:t>El usuario tiene sesión activa con permiso Usuarios. El menú principal está visible.</w:t>
+              <w:t>El usuario tiene sesión activa con permiso Permisos. El menú principal está visible.</w:t>
             </w:r>
           </w:p>
         </w:tc>
@@ -16709,7 +17192,23 @@
               <w:pStyle w:val="Sinespaciado"/>
             </w:pPr>
             <w:r>
-              <w:t>1. El administrador selecciona Permisos en el menú principal. 2. La interfaz muestra el formulario de Gestión de Permisos con la lista de usuarios y el árbol de permisos y roles disponibles. 3. El administrador selecciona un usuario y asigna o quita permisos desde el árbol interactivo. 4. El administrador confirma los cambios. 5. La interfaz actualiza la vista de permisos del usuario seleccionado.</w:t>
+              <w:t>1. El administrador selecciona Permisos en el menú principal.</w:t>
+            </w:r>
+            <w:r>
+              <w:br/>
+              <w:t>2. La interfaz muestra el formulario de Gestión de Permisos con la lista de usuarios y el árbol de permisos y roles disponibles.</w:t>
+            </w:r>
+            <w:r>
+              <w:br/>
+              <w:t>3. El administrador selecciona un usuario y asigna o quita permisos desde el árbol interactivo.</w:t>
+            </w:r>
+            <w:r>
+              <w:br/>
+              <w:t>4. El administrador confirma los cambios.</w:t>
+            </w:r>
+            <w:r>
+              <w:br/>
+              <w:t>5. La interfaz actualiza la vista de permisos del usuario seleccionado.</w:t>
             </w:r>
           </w:p>
         </w:tc>
@@ -16750,7 +17249,27 @@
               <w:pStyle w:val="Sinespaciado"/>
             </w:pPr>
             <w:r>
-              <w:t>3.1.1. El usuario seleccionado no tiene permisos asignados: 3.1.2. La interfaz muestra el árbol vacío para ese usuario. 3.1.3. Continúa en el paso 3. 4.1.1. Error al persistir los cambios: 4.1.2. La interfaz muestra un mensaje de error y no aplica los cambios. 4.1.3. El flujo finaliza.</w:t>
+              <w:t>3.1.1. El usuario seleccionado no tiene permisos asignados:</w:t>
+            </w:r>
+            <w:r>
+              <w:br/>
+              <w:t>3.1.2. La interfaz muestra el árbol vacío para ese usuario.</w:t>
+            </w:r>
+            <w:r>
+              <w:br/>
+              <w:t>3.1.3. Continúa en el paso 3.</w:t>
+            </w:r>
+            <w:r>
+              <w:br/>
+              <w:t>4.1.1. Error al persistir los cambios:</w:t>
+            </w:r>
+            <w:r>
+              <w:br/>
+              <w:t>4.1.2. La interfaz muestra un mensaje de error y no aplica los cambios.</w:t>
+            </w:r>
+            <w:r>
+              <w:br/>
+              <w:t>4.1.3. El flujo finaliza.</w:t>
             </w:r>
           </w:p>
         </w:tc>
@@ -16806,6 +17325,7 @@
       <w:bookmarkStart w:id="96" w:name="_Toc227416507"/>
       <w:bookmarkStart w:id="97" w:name="_Toc233886202"/>
       <w:r>
+        <w:lastRenderedPageBreak/>
         <w:t>T05. Gestión de Múltiples Idiomas</w:t>
       </w:r>
       <w:bookmarkEnd w:id="95"/>
@@ -16834,38 +17354,117 @@
       </w:pPr>
       <w:bookmarkStart w:id="99" w:name="_Toc233886204"/>
       <w:r>
-        <w:lastRenderedPageBreak/>
         <w:t>Descripción detallada de cómo funciona</w:t>
       </w:r>
       <w:bookmarkEnd w:id="99"/>
     </w:p>
     <w:p>
       <w:r>
-        <w:t>Se implementa mediante el patrón de diseño Observer. El sistema define dos contratos en la capa Abstracciones:</w:t>
+        <w:t xml:space="preserve">Se implementa mediante el patrón de diseño </w:t>
+      </w:r>
+      <w:proofErr w:type="spellStart"/>
+      <w:r>
+        <w:t>Observer</w:t>
+      </w:r>
+      <w:proofErr w:type="spellEnd"/>
+      <w:r>
+        <w:t>. El sistema define dos contratos en la capa Abstracciones:</w:t>
       </w:r>
     </w:p>
     <w:p/>
     <w:p>
       <w:r>
-        <w:t>1. IObserver: Interfaz implementada por los elementos que necesitan actualizar su idioma de forma activa (los formularios de la GUI). Define el método ActualizarIdioma().</w:t>
+        <w:t xml:space="preserve">1. </w:t>
+      </w:r>
+      <w:proofErr w:type="spellStart"/>
+      <w:r>
+        <w:t>IObserver</w:t>
+      </w:r>
+      <w:proofErr w:type="spellEnd"/>
+      <w:r>
+        <w:t xml:space="preserve">: Interfaz implementada por los elementos que necesitan actualizar su idioma de forma activa (los formularios de la GUI). Define el método </w:t>
+      </w:r>
+      <w:proofErr w:type="spellStart"/>
+      <w:r>
+        <w:t>ActualizarIdioma</w:t>
+      </w:r>
+      <w:proofErr w:type="spellEnd"/>
+      <w:r>
+        <w:t>().</w:t>
       </w:r>
     </w:p>
     <w:p/>
     <w:p>
       <w:r>
-        <w:t>2. ISubject (o IManejadorIdioma): Mantiene la lista de observadores registrados, el idioma actual de la sesión y notifica a los observadores cuando este cambia.</w:t>
+        <w:t xml:space="preserve">2. </w:t>
+      </w:r>
+      <w:proofErr w:type="spellStart"/>
+      <w:r>
+        <w:t>ISubject</w:t>
+      </w:r>
+      <w:proofErr w:type="spellEnd"/>
+      <w:r>
+        <w:t xml:space="preserve"> (o </w:t>
+      </w:r>
+      <w:proofErr w:type="spellStart"/>
+      <w:r>
+        <w:t>IManejadorIdioma</w:t>
+      </w:r>
+      <w:proofErr w:type="spellEnd"/>
+      <w:r>
+        <w:t>): Mantiene la lista de observadores registrados, el idioma actual de la sesión y notifica a los observadores cuando este cambia.</w:t>
       </w:r>
     </w:p>
     <w:p/>
     <w:p>
       <w:r>
-        <w:t>Al cargarse un formulario en la GUI, este se registra como observador en el ManejadorIdioma (Singleton de la capa de Servicios). El manejador lee las leyendas desde la base de datos (tablas Idioma y Traduccion) para el idioma seleccionado y las guarda en un diccionario en memoria.</w:t>
+        <w:t xml:space="preserve">Al cargarse un formulario en la GUI, este se registra como observador en el </w:t>
+      </w:r>
+      <w:proofErr w:type="spellStart"/>
+      <w:r>
+        <w:t>ManejadorIdioma</w:t>
+      </w:r>
+      <w:proofErr w:type="spellEnd"/>
+      <w:r>
+        <w:t xml:space="preserve"> (Singleton de la capa de Servicios). El manejador lee las leyendas desde la base de datos (tablas Idioma y </w:t>
+      </w:r>
+      <w:proofErr w:type="spellStart"/>
+      <w:r>
+        <w:t>Traduccion</w:t>
+      </w:r>
+      <w:proofErr w:type="spellEnd"/>
+      <w:r>
+        <w:t>) para el idioma seleccionado y las guarda en un diccionario en memoria.</w:t>
       </w:r>
     </w:p>
     <w:p/>
     <w:p>
       <w:r>
-        <w:t>Cuando el usuario selecciona un idioma diferente desde el Menú de la aplicación, el ManejadorIdioma cambia el idioma activo, recarga las traducciones y llama al método Notify(). Este recorre la lista de observadores activos llamando a ActualizarIdioma() en cada formulario, lo que actualiza las leyendas en la UI de forma inmediata sin reiniciar la aplicación.</w:t>
+        <w:t xml:space="preserve">Cuando el usuario selecciona un idioma diferente desde el Menú de la aplicación, el </w:t>
+      </w:r>
+      <w:proofErr w:type="spellStart"/>
+      <w:r>
+        <w:t>ManejadorIdioma</w:t>
+      </w:r>
+      <w:proofErr w:type="spellEnd"/>
+      <w:r>
+        <w:t xml:space="preserve"> cambia el idioma activo, recarga las traducciones y llama al método </w:t>
+      </w:r>
+      <w:proofErr w:type="spellStart"/>
+      <w:r>
+        <w:t>Notify</w:t>
+      </w:r>
+      <w:proofErr w:type="spellEnd"/>
+      <w:r>
+        <w:t xml:space="preserve">(). Este recorre la lista de observadores activos llamando a </w:t>
+      </w:r>
+      <w:proofErr w:type="spellStart"/>
+      <w:r>
+        <w:t>ActualizarIdioma</w:t>
+      </w:r>
+      <w:proofErr w:type="spellEnd"/>
+      <w:r>
+        <w:t>() en cada formulario, lo que actualiza las leyendas en la UI de forma inmediata sin reiniciar la aplicación.</w:t>
       </w:r>
     </w:p>
     <w:p/>
@@ -16884,8 +17483,13 @@
         <w:pStyle w:val="Ttulo3"/>
       </w:pPr>
       <w:bookmarkStart w:id="100" w:name="_Toc233886205"/>
-      <w:r>
-        <w:t>Especificacion de Casos de Uso - CU006 Cambiar Idioma</w:t>
+      <w:proofErr w:type="spellStart"/>
+      <w:r>
+        <w:t>Especificacion</w:t>
+      </w:r>
+      <w:proofErr w:type="spellEnd"/>
+      <w:r>
+        <w:t xml:space="preserve"> de Casos de Uso - CU006 Cambiar Idioma</w:t>
       </w:r>
       <w:bookmarkEnd w:id="100"/>
     </w:p>
@@ -16999,6 +17603,7 @@
                 <w:bCs/>
               </w:rPr>
             </w:pPr>
+            <w:proofErr w:type="spellStart"/>
             <w:r>
               <w:rPr>
                 <w:b/>
@@ -17006,6 +17611,7 @@
               </w:rPr>
               <w:t>Descripcion</w:t>
             </w:r>
+            <w:proofErr w:type="spellEnd"/>
           </w:p>
         </w:tc>
         <w:tc>
@@ -17017,7 +17623,15 @@
               <w:pStyle w:val="Sinespaciado"/>
             </w:pPr>
             <w:r>
-              <w:t>Permite al usuario cambiar el idioma de la interfaz en tiempo de ejecucion. El cambio se aplica inmediatamente en todos los formularios abiertos y queda persistido en el perfil del usuario.</w:t>
+              <w:t xml:space="preserve">Permite al usuario cambiar el idioma de la interfaz en tiempo de </w:t>
+            </w:r>
+            <w:proofErr w:type="spellStart"/>
+            <w:r>
+              <w:t>ejecucion</w:t>
+            </w:r>
+            <w:proofErr w:type="spellEnd"/>
+            <w:r>
+              <w:t>. El cambio se aplica inmediatamente en todos los formularios abiertos y queda persistido en el perfil del usuario.</w:t>
             </w:r>
           </w:p>
         </w:tc>
@@ -17099,7 +17713,23 @@
               <w:pStyle w:val="Sinespaciado"/>
             </w:pPr>
             <w:r>
-              <w:t>El usuario tiene sesion activa. Al menos dos idiomas estan configurados en el sistema.</w:t>
+              <w:t xml:space="preserve">El usuario tiene </w:t>
+            </w:r>
+            <w:proofErr w:type="spellStart"/>
+            <w:r>
+              <w:t>sesion</w:t>
+            </w:r>
+            <w:proofErr w:type="spellEnd"/>
+            <w:r>
+              <w:t xml:space="preserve"> activa. Al menos dos idiomas </w:t>
+            </w:r>
+            <w:proofErr w:type="spellStart"/>
+            <w:r>
+              <w:t>estan</w:t>
+            </w:r>
+            <w:proofErr w:type="spellEnd"/>
+            <w:r>
+              <w:t xml:space="preserve"> configurados en el sistema.</w:t>
             </w:r>
           </w:p>
         </w:tc>
@@ -17127,8 +17757,17 @@
                 <w:b/>
                 <w:bCs/>
               </w:rPr>
-              <w:t>Puntos de extension</w:t>
-            </w:r>
+              <w:t xml:space="preserve">Puntos de </w:t>
+            </w:r>
+            <w:proofErr w:type="spellStart"/>
+            <w:r>
+              <w:rPr>
+                <w:b/>
+                <w:bCs/>
+              </w:rPr>
+              <w:t>extension</w:t>
+            </w:r>
+            <w:proofErr w:type="spellEnd"/>
           </w:p>
         </w:tc>
         <w:tc>
@@ -17163,12 +17802,21 @@
                 <w:bCs/>
               </w:rPr>
             </w:pPr>
-            <w:r>
-              <w:rPr>
-                <w:b/>
-                <w:bCs/>
-              </w:rPr>
-              <w:t>Condicion extend</w:t>
+            <w:proofErr w:type="spellStart"/>
+            <w:r>
+              <w:rPr>
+                <w:b/>
+                <w:bCs/>
+              </w:rPr>
+              <w:t>Condicion</w:t>
+            </w:r>
+            <w:proofErr w:type="spellEnd"/>
+            <w:r>
+              <w:rPr>
+                <w:b/>
+                <w:bCs/>
+              </w:rPr>
+              <w:t xml:space="preserve"> extend</w:t>
             </w:r>
           </w:p>
         </w:tc>
@@ -17222,7 +17870,15 @@
               <w:pStyle w:val="Sinespaciado"/>
             </w:pPr>
             <w:r>
-              <w:t>1. El usuario selecciona un idioma en el selector del menú principal. 2. La interfaz actualiza inmediatamente todas las leyendas y textos de los formularios abiertos al idioma seleccionado. 3. La interfaz confirma el cambio mostrando los textos en el nuevo idioma.</w:t>
+              <w:t>1. El usuario selecciona un idioma en el selector del menú principal.</w:t>
+            </w:r>
+            <w:r>
+              <w:br/>
+              <w:t>2. La interfaz actualiza inmediatamente todas las leyendas y textos de los formularios abiertos al idioma seleccionado.</w:t>
+            </w:r>
+            <w:r>
+              <w:br/>
+              <w:t>3. La interfaz confirma el cambio mostrando los textos en el nuevo idioma.</w:t>
             </w:r>
           </w:p>
         </w:tc>
@@ -17263,7 +17919,19 @@
               <w:pStyle w:val="Sinespaciado"/>
             </w:pPr>
             <w:r>
-              <w:t>4.1.1. No existe traduccion para una clave en el idioma seleccionado: 4.1.2. El sistema muestra el texto del idioma por defecto para esa clave.</w:t>
+              <w:t xml:space="preserve">2.1.1. No existe </w:t>
+            </w:r>
+            <w:proofErr w:type="spellStart"/>
+            <w:r>
+              <w:t>traduccion</w:t>
+            </w:r>
+            <w:proofErr w:type="spellEnd"/>
+            <w:r>
+              <w:t xml:space="preserve"> para una clave en el idioma seleccionado:</w:t>
+            </w:r>
+            <w:r>
+              <w:br/>
+              <w:t>2.1.2. El sistema muestra el texto del idioma por defecto para esa clave.</w:t>
             </w:r>
           </w:p>
         </w:tc>
@@ -17291,6 +17959,7 @@
                 <w:b/>
                 <w:bCs/>
               </w:rPr>
+              <w:lastRenderedPageBreak/>
               <w:t>Post Condiciones</w:t>
             </w:r>
           </w:p>
@@ -17316,8 +17985,15 @@
       </w:pPr>
       <w:bookmarkStart w:id="101" w:name="_Toc233886206"/>
       <w:r>
-        <w:lastRenderedPageBreak/>
-        <w:t>Diagrama de Clases - Idiomas (Observer)</w:t>
+        <w:t>Diagrama de Clases - Idiomas (</w:t>
+      </w:r>
+      <w:proofErr w:type="spellStart"/>
+      <w:r>
+        <w:t>Observer</w:t>
+      </w:r>
+      <w:proofErr w:type="spellEnd"/>
+      <w:r>
+        <w:t>)</w:t>
       </w:r>
       <w:bookmarkEnd w:id="101"/>
     </w:p>
@@ -17385,7 +18061,15 @@
       </w:pPr>
       <w:bookmarkStart w:id="102" w:name="_Toc233886207"/>
       <w:r>
-        <w:t>Diagrama de Entidad Relacion - Idiomas</w:t>
+        <w:t xml:space="preserve">Diagrama de Entidad </w:t>
+      </w:r>
+      <w:proofErr w:type="spellStart"/>
+      <w:r>
+        <w:t>Relacion</w:t>
+      </w:r>
+      <w:proofErr w:type="spellEnd"/>
+      <w:r>
+        <w:t xml:space="preserve"> - Idiomas</w:t>
       </w:r>
       <w:bookmarkEnd w:id="102"/>
     </w:p>
@@ -17454,7 +18138,15 @@
       <w:bookmarkStart w:id="103" w:name="_Toc233886208"/>
       <w:r>
         <w:lastRenderedPageBreak/>
-        <w:t>Diagrama de Secuencia - Cambio Dinamico de Idioma</w:t>
+        <w:t xml:space="preserve">Diagrama de Secuencia - Cambio </w:t>
+      </w:r>
+      <w:proofErr w:type="spellStart"/>
+      <w:r>
+        <w:t>Dinamico</w:t>
+      </w:r>
+      <w:proofErr w:type="spellEnd"/>
+      <w:r>
+        <w:t xml:space="preserve"> de Idioma</w:t>
       </w:r>
       <w:bookmarkEnd w:id="103"/>
     </w:p>
@@ -17467,7 +18159,7 @@
           <w:noProof/>
         </w:rPr>
         <w:drawing>
-          <wp:inline distT="0" distB="0" distL="0" distR="0" wp14:anchorId="54B396BF" wp14:editId="1749D822">
+          <wp:inline distT="0" distB="0" distL="0" distR="0" wp14:anchorId="54B396BF" wp14:editId="14828B26">
             <wp:extent cx="5760720" cy="4201160"/>
             <wp:effectExtent l="0" t="0" r="0" b="8890"/>
             <wp:docPr id="1948732415" name="Imagen 19"/>
@@ -17595,7 +18287,15 @@
     <w:p/>
     <w:p>
       <w:r>
-        <w:t>Flujo de registro: el servicio recibe el módulo (nombre del formulario), la actividad, el detalle y si fue exitoso. Obtiene el usuario en sesión del SessionManager, determina la criticidad automáticamente mediante un diccionario estático en la BLL</w:t>
+        <w:t xml:space="preserve">Flujo de registro: el servicio recibe el módulo (nombre del formulario), la actividad, el detalle y si fue exitoso. Obtiene el usuario en sesión del </w:t>
+      </w:r>
+      <w:proofErr w:type="spellStart"/>
+      <w:r>
+        <w:t>SessionManager</w:t>
+      </w:r>
+      <w:proofErr w:type="spellEnd"/>
+      <w:r>
+        <w:t>, determina la criticidad automáticamente mediante un diccionario estático en la BLL</w:t>
       </w:r>
       <w:r>
         <w:rPr>
@@ -17619,7 +18319,39 @@
     <w:p/>
     <w:p>
       <w:r>
-        <w:t>Para el caso de eventos sin sesión activa (intentos de login fallidos), existe una sobrecarga del método Registrar que recibe el username como string en lugar de obtenerlo del SessionManager.</w:t>
+        <w:t xml:space="preserve">Para el caso de eventos sin sesión activa (intentos de </w:t>
+      </w:r>
+      <w:proofErr w:type="spellStart"/>
+      <w:r>
+        <w:t>login</w:t>
+      </w:r>
+      <w:proofErr w:type="spellEnd"/>
+      <w:r>
+        <w:t xml:space="preserve"> fallidos), existe una sobrecarga del método Registrar que recibe el </w:t>
+      </w:r>
+      <w:proofErr w:type="spellStart"/>
+      <w:r>
+        <w:t>username</w:t>
+      </w:r>
+      <w:proofErr w:type="spellEnd"/>
+      <w:r>
+        <w:t xml:space="preserve"> como </w:t>
+      </w:r>
+      <w:proofErr w:type="spellStart"/>
+      <w:r>
+        <w:t>string</w:t>
+      </w:r>
+      <w:proofErr w:type="spellEnd"/>
+      <w:r>
+        <w:t xml:space="preserve"> en lugar de obtenerlo del </w:t>
+      </w:r>
+      <w:proofErr w:type="spellStart"/>
+      <w:r>
+        <w:t>SessionManager</w:t>
+      </w:r>
+      <w:proofErr w:type="spellEnd"/>
+      <w:r>
+        <w:t>.</w:t>
       </w:r>
     </w:p>
     <w:p/>
@@ -17662,7 +18394,15 @@
         </w:numPr>
       </w:pPr>
       <w:r>
-        <w:t>Filtros en tiempo real: cualquier cambio en los controles (texto, checkboxes, combos, fechas) dispara el método que filtra la lista en memoria sin consultar la BD.</w:t>
+        <w:t xml:space="preserve">Filtros en tiempo real: cualquier cambio en los controles (texto, </w:t>
+      </w:r>
+      <w:proofErr w:type="spellStart"/>
+      <w:r>
+        <w:t>checkboxes</w:t>
+      </w:r>
+      <w:proofErr w:type="spellEnd"/>
+      <w:r>
+        <w:t>, combos, fechas) dispara el método que filtra la lista en memoria sin consultar la BD.</w:t>
       </w:r>
     </w:p>
     <w:p>
@@ -17695,7 +18435,49 @@
         <w:rPr>
           <w:szCs w:val="22"/>
         </w:rPr>
-        <w:t>Filtros disponibles: búsqueda de texto libre en Username, Detalle y/o Error (seleccionables por checkbox); filtro por Criticidad (combo con autocompletado); filtro por Actividad (combo con autocompletado); filtro Exitoso (checkbox triestado); rango de fechas Desde/Hasta (Selector de fecha con validación de rango).</w:t>
+        <w:t xml:space="preserve">Filtros disponibles: búsqueda de texto libre en </w:t>
+      </w:r>
+      <w:proofErr w:type="spellStart"/>
+      <w:r>
+        <w:rPr>
+          <w:szCs w:val="22"/>
+        </w:rPr>
+        <w:t>Username</w:t>
+      </w:r>
+      <w:proofErr w:type="spellEnd"/>
+      <w:r>
+        <w:rPr>
+          <w:szCs w:val="22"/>
+        </w:rPr>
+        <w:t xml:space="preserve">, Detalle y/o Error (seleccionables por </w:t>
+      </w:r>
+      <w:proofErr w:type="spellStart"/>
+      <w:r>
+        <w:rPr>
+          <w:szCs w:val="22"/>
+        </w:rPr>
+        <w:t>checkbox</w:t>
+      </w:r>
+      <w:proofErr w:type="spellEnd"/>
+      <w:r>
+        <w:rPr>
+          <w:szCs w:val="22"/>
+        </w:rPr>
+        <w:t>); filtro por Criticidad (combo con autocompletado); filtro por Actividad (combo con autocompletado); filtro Exitoso (</w:t>
+      </w:r>
+      <w:proofErr w:type="spellStart"/>
+      <w:r>
+        <w:rPr>
+          <w:szCs w:val="22"/>
+        </w:rPr>
+        <w:t>checkbox</w:t>
+      </w:r>
+      <w:proofErr w:type="spellEnd"/>
+      <w:r>
+        <w:rPr>
+          <w:szCs w:val="22"/>
+        </w:rPr>
+        <w:t xml:space="preserve"> triestado); rango de fechas Desde/Hasta (Selector de fecha con validación de rango).</w:t>
       </w:r>
     </w:p>
     <w:p>
@@ -17798,7 +18580,7 @@
           <w:noProof/>
         </w:rPr>
         <w:drawing>
-          <wp:inline distT="0" distB="0" distL="0" distR="0" wp14:anchorId="63C050F1" wp14:editId="79F06B1B">
+          <wp:inline distT="0" distB="0" distL="0" distR="0" wp14:anchorId="63C050F1" wp14:editId="64E73253">
             <wp:extent cx="5760720" cy="2706370"/>
             <wp:effectExtent l="0" t="0" r="0" b="0"/>
             <wp:docPr id="1451963989" name="Imagen 22"/>
@@ -18545,7 +19327,23 @@
     </w:p>
     <w:p>
       <w:r>
-        <w:t>Cada vez que se modifica un registro de usuario en BLL (cambio de estado, contraseña o permisos), el método correspondiente invoca a VersionUsuarioBLL. Se captura el estado del objeto Usuario, se asocia el ID del usuario que realizó la modificación y la fecha actual, y se guarda en la tabla de base de datos HistorialUsuario.</w:t>
+        <w:t xml:space="preserve">Cada vez que se modifica un registro de usuario en BLL (cambio de estado, contraseña o permisos), el método correspondiente invoca a </w:t>
+      </w:r>
+      <w:proofErr w:type="spellStart"/>
+      <w:r>
+        <w:t>VersionUsuarioBLL</w:t>
+      </w:r>
+      <w:proofErr w:type="spellEnd"/>
+      <w:r>
+        <w:t xml:space="preserve">. Se captura el estado del objeto Usuario, se asocia el ID del usuario que realizó la modificación y la fecha actual, y se guarda en la tabla de base de datos </w:t>
+      </w:r>
+      <w:proofErr w:type="spellStart"/>
+      <w:r>
+        <w:t>HistorialUsuario</w:t>
+      </w:r>
+      <w:proofErr w:type="spellEnd"/>
+      <w:r>
+        <w:t>.</w:t>
       </w:r>
     </w:p>
     <w:p/>
@@ -18565,8 +19363,13 @@
         <w:pStyle w:val="Ttulo3"/>
       </w:pPr>
       <w:bookmarkStart w:id="124" w:name="_Toc233886223"/>
-      <w:r>
-        <w:t>Especificacion de Casos de Uso - CU007 Ver Historial de Usuario</w:t>
+      <w:proofErr w:type="spellStart"/>
+      <w:r>
+        <w:t>Especificacion</w:t>
+      </w:r>
+      <w:proofErr w:type="spellEnd"/>
+      <w:r>
+        <w:t xml:space="preserve"> de Casos de Uso - CU007 Ver Historial de Usuario</w:t>
       </w:r>
       <w:bookmarkEnd w:id="124"/>
     </w:p>
@@ -18680,6 +19483,7 @@
                 <w:bCs/>
               </w:rPr>
             </w:pPr>
+            <w:proofErr w:type="spellStart"/>
             <w:r>
               <w:rPr>
                 <w:b/>
@@ -18687,6 +19491,7 @@
               </w:rPr>
               <w:t>Descripcion</w:t>
             </w:r>
+            <w:proofErr w:type="spellEnd"/>
           </w:p>
         </w:tc>
         <w:tc>
@@ -18698,7 +19503,15 @@
               <w:pStyle w:val="Sinespaciado"/>
             </w:pPr>
             <w:r>
-              <w:t>Permite al administrador consultar el historial cronologico de modificaciones realizadas sobre un usuario del sistema.</w:t>
+              <w:t xml:space="preserve">Permite al administrador consultar el historial </w:t>
+            </w:r>
+            <w:proofErr w:type="spellStart"/>
+            <w:r>
+              <w:t>cronologico</w:t>
+            </w:r>
+            <w:proofErr w:type="spellEnd"/>
+            <w:r>
+              <w:t xml:space="preserve"> de modificaciones realizadas sobre un usuario del sistema.</w:t>
             </w:r>
           </w:p>
         </w:tc>
@@ -18780,7 +19593,23 @@
               <w:pStyle w:val="Sinespaciado"/>
             </w:pPr>
             <w:r>
-              <w:t>El usuario tiene sesion activa con permiso 'Control de Cambios'. El menu principal esta visible.</w:t>
+              <w:t xml:space="preserve">El usuario tiene </w:t>
+            </w:r>
+            <w:proofErr w:type="spellStart"/>
+            <w:r>
+              <w:t>sesion</w:t>
+            </w:r>
+            <w:proofErr w:type="spellEnd"/>
+            <w:r>
+              <w:t xml:space="preserve"> activa con permiso 'Control de Cambios'. El </w:t>
+            </w:r>
+            <w:proofErr w:type="spellStart"/>
+            <w:r>
+              <w:t>menu</w:t>
+            </w:r>
+            <w:proofErr w:type="spellEnd"/>
+            <w:r>
+              <w:t xml:space="preserve"> principal esta visible.</w:t>
             </w:r>
           </w:p>
         </w:tc>
@@ -18808,8 +19637,17 @@
                 <w:b/>
                 <w:bCs/>
               </w:rPr>
-              <w:t>Puntos de extension</w:t>
-            </w:r>
+              <w:t xml:space="preserve">Puntos de </w:t>
+            </w:r>
+            <w:proofErr w:type="spellStart"/>
+            <w:r>
+              <w:rPr>
+                <w:b/>
+                <w:bCs/>
+              </w:rPr>
+              <w:t>extension</w:t>
+            </w:r>
+            <w:proofErr w:type="spellEnd"/>
           </w:p>
         </w:tc>
         <w:tc>
@@ -18844,12 +19682,21 @@
                 <w:bCs/>
               </w:rPr>
             </w:pPr>
-            <w:r>
-              <w:rPr>
-                <w:b/>
-                <w:bCs/>
-              </w:rPr>
-              <w:t>Condicion extend</w:t>
+            <w:proofErr w:type="spellStart"/>
+            <w:r>
+              <w:rPr>
+                <w:b/>
+                <w:bCs/>
+              </w:rPr>
+              <w:t>Condicion</w:t>
+            </w:r>
+            <w:proofErr w:type="spellEnd"/>
+            <w:r>
+              <w:rPr>
+                <w:b/>
+                <w:bCs/>
+              </w:rPr>
+              <w:t xml:space="preserve"> extend</w:t>
             </w:r>
           </w:p>
         </w:tc>
@@ -18903,7 +19750,35 @@
               <w:pStyle w:val="Sinespaciado"/>
             </w:pPr>
             <w:r>
-              <w:t>1. El administrador selecciona 'Control de Cambios' en el menu. 2. El sistema muestra el formulario con la lista de usuarios. 3. El administrador selecciona un usuario. 4. El sistema carga la grilla con todas las versiones historicas del usuario.</w:t>
+              <w:t xml:space="preserve">1. El administrador selecciona 'Control de Cambios' en el </w:t>
+            </w:r>
+            <w:proofErr w:type="spellStart"/>
+            <w:r>
+              <w:t>menu</w:t>
+            </w:r>
+            <w:proofErr w:type="spellEnd"/>
+            <w:r>
+              <w:t>.</w:t>
+            </w:r>
+            <w:r>
+              <w:br/>
+              <w:t>2. El sistema muestra el formulario con la lista de usuarios.</w:t>
+            </w:r>
+            <w:r>
+              <w:br/>
+              <w:t>3. El administrador selecciona un usuario.</w:t>
+            </w:r>
+            <w:r>
+              <w:br/>
+              <w:t xml:space="preserve">4. El sistema carga la grilla con todas las versiones </w:t>
+            </w:r>
+            <w:proofErr w:type="spellStart"/>
+            <w:r>
+              <w:t>historicas</w:t>
+            </w:r>
+            <w:proofErr w:type="spellEnd"/>
+            <w:r>
+              <w:t xml:space="preserve"> del usuario.</w:t>
             </w:r>
           </w:p>
         </w:tc>
@@ -18944,7 +19819,27 @@
               <w:pStyle w:val="Sinespaciado"/>
             </w:pPr>
             <w:r>
-              <w:t>3.1.1. El usuario no posee versiones historicas: 3.1.2. El sistema muestra la grilla vacia con un mensaje informativo.</w:t>
+              <w:t xml:space="preserve">3.1.1. El usuario no posee versiones </w:t>
+            </w:r>
+            <w:proofErr w:type="spellStart"/>
+            <w:r>
+              <w:t>historicas</w:t>
+            </w:r>
+            <w:proofErr w:type="spellEnd"/>
+            <w:r>
+              <w:t>:</w:t>
+            </w:r>
+            <w:r>
+              <w:br/>
+              <w:t xml:space="preserve">3.1.2. El sistema muestra la grilla </w:t>
+            </w:r>
+            <w:proofErr w:type="spellStart"/>
+            <w:r>
+              <w:t>vacia</w:t>
+            </w:r>
+            <w:proofErr w:type="spellEnd"/>
+            <w:r>
+              <w:t xml:space="preserve"> con un mensaje informativo.</w:t>
             </w:r>
           </w:p>
         </w:tc>
@@ -18985,7 +19880,15 @@
               <w:pStyle w:val="Sinespaciado"/>
             </w:pPr>
             <w:r>
-              <w:t>La grilla muestra el historial completo del usuario seleccionado. La sesion permanece activa.</w:t>
+              <w:t xml:space="preserve">La grilla muestra el historial completo del usuario seleccionado. La </w:t>
+            </w:r>
+            <w:proofErr w:type="spellStart"/>
+            <w:r>
+              <w:t>sesion</w:t>
+            </w:r>
+            <w:proofErr w:type="spellEnd"/>
+            <w:r>
+              <w:t xml:space="preserve"> permanece activa.</w:t>
             </w:r>
           </w:p>
         </w:tc>
@@ -18996,8 +19899,29 @@
         <w:pStyle w:val="Ttulo3"/>
       </w:pPr>
       <w:bookmarkStart w:id="125" w:name="_Toc233886224"/>
-      <w:r>
-        <w:t>Especificacion de Casos de Uso - CU008 Recomponer Version (Rollback)</w:t>
+      <w:proofErr w:type="spellStart"/>
+      <w:r>
+        <w:t>Especificacion</w:t>
+      </w:r>
+      <w:proofErr w:type="spellEnd"/>
+      <w:r>
+        <w:t xml:space="preserve"> de Casos de Uso - CU008 Recomponer </w:t>
+      </w:r>
+      <w:proofErr w:type="spellStart"/>
+      <w:r>
+        <w:t>Version</w:t>
+      </w:r>
+      <w:proofErr w:type="spellEnd"/>
+      <w:r>
+        <w:t xml:space="preserve"> (</w:t>
+      </w:r>
+      <w:proofErr w:type="spellStart"/>
+      <w:r>
+        <w:t>Rollback</w:t>
+      </w:r>
+      <w:proofErr w:type="spellEnd"/>
+      <w:r>
+        <w:t>)</w:t>
       </w:r>
       <w:bookmarkEnd w:id="125"/>
     </w:p>
@@ -19047,7 +19971,23 @@
               <w:pStyle w:val="Sinespaciado"/>
             </w:pPr>
             <w:r>
-              <w:t>CU008 - Recomponer Version (Rollback)</w:t>
+              <w:t xml:space="preserve">CU008 - Recomponer </w:t>
+            </w:r>
+            <w:proofErr w:type="spellStart"/>
+            <w:r>
+              <w:t>Version</w:t>
+            </w:r>
+            <w:proofErr w:type="spellEnd"/>
+            <w:r>
+              <w:t xml:space="preserve"> (</w:t>
+            </w:r>
+            <w:proofErr w:type="spellStart"/>
+            <w:r>
+              <w:t>Rollback</w:t>
+            </w:r>
+            <w:proofErr w:type="spellEnd"/>
+            <w:r>
+              <w:t>)</w:t>
             </w:r>
           </w:p>
         </w:tc>
@@ -19111,6 +20051,7 @@
                 <w:bCs/>
               </w:rPr>
             </w:pPr>
+            <w:proofErr w:type="spellStart"/>
             <w:r>
               <w:rPr>
                 <w:b/>
@@ -19118,6 +20059,7 @@
               </w:rPr>
               <w:t>Descripcion</w:t>
             </w:r>
+            <w:proofErr w:type="spellEnd"/>
           </w:p>
         </w:tc>
         <w:tc>
@@ -19129,7 +20071,39 @@
               <w:pStyle w:val="Sinespaciado"/>
             </w:pPr>
             <w:r>
-              <w:t>Permite al administrador restaurar el estado de un usuario a una version historica previa. Antes de aplicar el rollback, el sistema genera una version de respaldo del estado actual.</w:t>
+              <w:t xml:space="preserve">Permite al administrador restaurar el estado de un usuario a una </w:t>
+            </w:r>
+            <w:proofErr w:type="spellStart"/>
+            <w:r>
+              <w:t>version</w:t>
+            </w:r>
+            <w:proofErr w:type="spellEnd"/>
+            <w:r>
+              <w:t xml:space="preserve"> </w:t>
+            </w:r>
+            <w:proofErr w:type="spellStart"/>
+            <w:r>
+              <w:t>historica</w:t>
+            </w:r>
+            <w:proofErr w:type="spellEnd"/>
+            <w:r>
+              <w:t xml:space="preserve"> previa. Antes de aplicar el </w:t>
+            </w:r>
+            <w:proofErr w:type="spellStart"/>
+            <w:r>
+              <w:t>rollback</w:t>
+            </w:r>
+            <w:proofErr w:type="spellEnd"/>
+            <w:r>
+              <w:t xml:space="preserve">, el sistema genera una </w:t>
+            </w:r>
+            <w:proofErr w:type="spellStart"/>
+            <w:r>
+              <w:t>version</w:t>
+            </w:r>
+            <w:proofErr w:type="spellEnd"/>
+            <w:r>
+              <w:t xml:space="preserve"> de respaldo del estado actual.</w:t>
             </w:r>
           </w:p>
         </w:tc>
@@ -19211,7 +20185,31 @@
               <w:pStyle w:val="Sinespaciado"/>
             </w:pPr>
             <w:r>
-              <w:t>El usuario tiene sesion activa con permiso 'Control de Cambios'. Existe al menos una version historica para el usuario seleccionado.</w:t>
+              <w:t xml:space="preserve">El usuario tiene </w:t>
+            </w:r>
+            <w:proofErr w:type="spellStart"/>
+            <w:r>
+              <w:t>sesion</w:t>
+            </w:r>
+            <w:proofErr w:type="spellEnd"/>
+            <w:r>
+              <w:t xml:space="preserve"> activa con permiso 'Control de Cambios'. Existe al menos una </w:t>
+            </w:r>
+            <w:proofErr w:type="spellStart"/>
+            <w:r>
+              <w:t>version</w:t>
+            </w:r>
+            <w:proofErr w:type="spellEnd"/>
+            <w:r>
+              <w:t xml:space="preserve"> </w:t>
+            </w:r>
+            <w:proofErr w:type="spellStart"/>
+            <w:r>
+              <w:t>historica</w:t>
+            </w:r>
+            <w:proofErr w:type="spellEnd"/>
+            <w:r>
+              <w:t xml:space="preserve"> para el usuario seleccionado.</w:t>
             </w:r>
           </w:p>
         </w:tc>
@@ -19239,8 +20237,17 @@
                 <w:b/>
                 <w:bCs/>
               </w:rPr>
-              <w:t>Puntos de extension</w:t>
-            </w:r>
+              <w:t xml:space="preserve">Puntos de </w:t>
+            </w:r>
+            <w:proofErr w:type="spellStart"/>
+            <w:r>
+              <w:rPr>
+                <w:b/>
+                <w:bCs/>
+              </w:rPr>
+              <w:t>extension</w:t>
+            </w:r>
+            <w:proofErr w:type="spellEnd"/>
           </w:p>
         </w:tc>
         <w:tc>
@@ -19275,12 +20282,21 @@
                 <w:bCs/>
               </w:rPr>
             </w:pPr>
-            <w:r>
-              <w:rPr>
-                <w:b/>
-                <w:bCs/>
-              </w:rPr>
-              <w:t>Condicion extend</w:t>
+            <w:proofErr w:type="spellStart"/>
+            <w:r>
+              <w:rPr>
+                <w:b/>
+                <w:bCs/>
+              </w:rPr>
+              <w:t>Condicion</w:t>
+            </w:r>
+            <w:proofErr w:type="spellEnd"/>
+            <w:r>
+              <w:rPr>
+                <w:b/>
+                <w:bCs/>
+              </w:rPr>
+              <w:t xml:space="preserve"> extend</w:t>
             </w:r>
           </w:p>
         </w:tc>
@@ -19334,7 +20350,23 @@
               <w:pStyle w:val="Sinespaciado"/>
             </w:pPr>
             <w:r>
-              <w:t>1. El administrador selecciona un usuario y una versión histórica en la grilla. 2. El administrador presiona Recomponer. 3. La interfaz solicita confirmación indicando que el usuario será restaurado a la versión seleccionada. 4. El administrador confirma la acción. 5. La interfaz muestra un mensaje de éxito y actualiza la grilla del historial.</w:t>
+              <w:t>1. El administrador selecciona un usuario y una versión histórica en la grilla.</w:t>
+            </w:r>
+            <w:r>
+              <w:br/>
+              <w:t>2. El administrador presiona Recomponer.</w:t>
+            </w:r>
+            <w:r>
+              <w:br/>
+              <w:t>3. La interfaz solicita confirmación indicando que el usuario será restaurado a la versión seleccionada.</w:t>
+            </w:r>
+            <w:r>
+              <w:br/>
+              <w:t>4. El administrador confirma la acción.</w:t>
+            </w:r>
+            <w:r>
+              <w:br/>
+              <w:t>5. La interfaz muestra un mensaje de éxito y actualiza la grilla del historial.</w:t>
             </w:r>
           </w:p>
         </w:tc>
@@ -19375,7 +20407,23 @@
               <w:pStyle w:val="Sinespaciado"/>
             </w:pPr>
             <w:r>
-              <w:t>4.1.1. Error al persistir la restauracion: 4.1.2. El sistema muestra un mensaje de error y no aplica cambios. 4.1.3. El flujo finaliza.</w:t>
+              <w:t xml:space="preserve">4.1.1. Error al persistir la </w:t>
+            </w:r>
+            <w:proofErr w:type="spellStart"/>
+            <w:r>
+              <w:t>restauracion</w:t>
+            </w:r>
+            <w:proofErr w:type="spellEnd"/>
+            <w:r>
+              <w:t>:</w:t>
+            </w:r>
+            <w:r>
+              <w:br/>
+              <w:t>4.1.2. El sistema muestra un mensaje de error y no aplica cambios.</w:t>
+            </w:r>
+            <w:r>
+              <w:br/>
+              <w:t>4.1.3. El flujo finaliza.</w:t>
             </w:r>
           </w:p>
         </w:tc>
@@ -19416,7 +20464,31 @@
               <w:pStyle w:val="Sinespaciado"/>
             </w:pPr>
             <w:r>
-              <w:t>El usuario fue restaurado al estado de la version seleccionada. Los DVs fueron recalculados. El evento quedo registrado en la Bitacora.</w:t>
+              <w:t xml:space="preserve">El usuario fue restaurado al estado de la </w:t>
+            </w:r>
+            <w:proofErr w:type="spellStart"/>
+            <w:r>
+              <w:t>version</w:t>
+            </w:r>
+            <w:proofErr w:type="spellEnd"/>
+            <w:r>
+              <w:t xml:space="preserve"> seleccionada. Los </w:t>
+            </w:r>
+            <w:proofErr w:type="spellStart"/>
+            <w:r>
+              <w:t>DVs</w:t>
+            </w:r>
+            <w:proofErr w:type="spellEnd"/>
+            <w:r>
+              <w:t xml:space="preserve"> fueron recalculados. El evento quedo registrado en la </w:t>
+            </w:r>
+            <w:proofErr w:type="spellStart"/>
+            <w:r>
+              <w:t>Bitacora</w:t>
+            </w:r>
+            <w:proofErr w:type="spellEnd"/>
+            <w:r>
+              <w:t>.</w:t>
             </w:r>
           </w:p>
         </w:tc>
@@ -19442,7 +20514,7 @@
           <w:noProof/>
         </w:rPr>
         <w:drawing>
-          <wp:inline distT="0" distB="0" distL="0" distR="0" wp14:anchorId="0C9053FA" wp14:editId="2C6A028B">
+          <wp:inline distT="0" distB="0" distL="0" distR="0" wp14:anchorId="0C9053FA" wp14:editId="0FD120E2">
             <wp:extent cx="5760720" cy="4000500"/>
             <wp:effectExtent l="0" t="0" r="0" b="0"/>
             <wp:docPr id="915382737" name="Imagen 26"/>
@@ -19497,7 +20569,15 @@
       </w:pPr>
       <w:bookmarkStart w:id="127" w:name="_Toc233886226"/>
       <w:r>
-        <w:t>Diagrama de Entidad Relacion - Control de Cambios</w:t>
+        <w:t xml:space="preserve">Diagrama de Entidad </w:t>
+      </w:r>
+      <w:proofErr w:type="spellStart"/>
+      <w:r>
+        <w:t>Relacion</w:t>
+      </w:r>
+      <w:proofErr w:type="spellEnd"/>
+      <w:r>
+        <w:t xml:space="preserve"> - Control de Cambios</w:t>
       </w:r>
       <w:bookmarkEnd w:id="127"/>
     </w:p>
@@ -19567,9 +20647,14 @@
       <w:bookmarkStart w:id="128" w:name="_Toc233886227"/>
       <w:r>
         <w:lastRenderedPageBreak/>
-        <w:t>Diagrama de Secuencia - Recomponer Version</w:t>
+        <w:t xml:space="preserve">Diagrama de Secuencia - Recomponer </w:t>
+      </w:r>
+      <w:proofErr w:type="spellStart"/>
+      <w:r>
+        <w:t>Version</w:t>
       </w:r>
       <w:bookmarkEnd w:id="128"/>
+      <w:proofErr w:type="spellEnd"/>
     </w:p>
     <w:p>
       <w:pPr>
@@ -19580,7 +20665,7 @@
           <w:noProof/>
         </w:rPr>
         <w:drawing>
-          <wp:inline distT="0" distB="0" distL="0" distR="0" wp14:anchorId="7039C6CD" wp14:editId="3A6AC08F">
+          <wp:inline distT="0" distB="0" distL="0" distR="0" wp14:anchorId="7039C6CD" wp14:editId="37749DA9">
             <wp:extent cx="5760720" cy="2762885"/>
             <wp:effectExtent l="0" t="0" r="0" b="0"/>
             <wp:docPr id="98095432" name="Imagen 28"/>
@@ -19641,11 +20726,19 @@
         <w:rPr>
           <w:lang w:val="es-ES"/>
         </w:rPr>
-        <w:t>T07. Gestión de Backup</w:t>
+        <w:t xml:space="preserve">T07. Gestión de </w:t>
+      </w:r>
+      <w:proofErr w:type="spellStart"/>
+      <w:r>
+        <w:rPr>
+          <w:lang w:val="es-ES"/>
+        </w:rPr>
+        <w:t>Backup</w:t>
       </w:r>
       <w:bookmarkEnd w:id="129"/>
       <w:bookmarkEnd w:id="130"/>
       <w:bookmarkEnd w:id="131"/>
+      <w:proofErr w:type="spellEnd"/>
     </w:p>
     <w:p>
       <w:pPr>
@@ -19675,25 +20768,129 @@
     </w:p>
     <w:p>
       <w:r>
-        <w:t>El flujo de Backup y Restauración segura se implementa en la clase BackupService en la capa Servicios, interactuando con la base de datos y el sistema de archivos local:</w:t>
+        <w:t xml:space="preserve">El flujo de </w:t>
+      </w:r>
+      <w:proofErr w:type="spellStart"/>
+      <w:r>
+        <w:t>Backup</w:t>
+      </w:r>
+      <w:proofErr w:type="spellEnd"/>
+      <w:r>
+        <w:t xml:space="preserve"> y Restauración segura se implementa en la clase </w:t>
+      </w:r>
+      <w:proofErr w:type="spellStart"/>
+      <w:r>
+        <w:t>BackupService</w:t>
+      </w:r>
+      <w:proofErr w:type="spellEnd"/>
+      <w:r>
+        <w:t xml:space="preserve"> en la capa Servicios, interactuando con la base de datos y el sistema de archivos local:</w:t>
       </w:r>
     </w:p>
     <w:p/>
     <w:p>
       <w:r>
-        <w:t>1. Generación de Copia de Seguridad: El sistema solicita una contraseña privada al administrador. Se realiza un backup nativo de SQL Server hacia un archivo .bak plano temporal. Inmediatamente, la aplicación lee el archivo temporal, lo cifra en bloques utilizando AES-256 (modo CBC, con vector de inicialización e iteraciones de derivación PBKDF2), genera el archivo resguardado final con extensión. stachbak y finalmente destruye físicamente (tritura) el archivo .bak plano temporal del disco.</w:t>
+        <w:t xml:space="preserve">1. Generación de Copia de Seguridad: El sistema solicita una contraseña privada al administrador. Se realiza un </w:t>
+      </w:r>
+      <w:proofErr w:type="spellStart"/>
+      <w:r>
+        <w:t>backup</w:t>
+      </w:r>
+      <w:proofErr w:type="spellEnd"/>
+      <w:r>
+        <w:t xml:space="preserve"> nativo de SQL Server hacia un archivo .</w:t>
+      </w:r>
+      <w:proofErr w:type="spellStart"/>
+      <w:r>
+        <w:t>bak</w:t>
+      </w:r>
+      <w:proofErr w:type="spellEnd"/>
+      <w:r>
+        <w:t xml:space="preserve"> plano temporal. Inmediatamente, la aplicación lee el archivo temporal, lo cifra en bloques utilizando AES-256 (modo CBC, con vector de inicialización e iteraciones de derivación PBKDF2), genera el archivo resguardado final con extensión. </w:t>
+      </w:r>
+      <w:proofErr w:type="spellStart"/>
+      <w:r>
+        <w:t>stachbak</w:t>
+      </w:r>
+      <w:proofErr w:type="spellEnd"/>
+      <w:r>
+        <w:t xml:space="preserve"> y finalmente destruye físicamente (tritura) el archivo .</w:t>
+      </w:r>
+      <w:proofErr w:type="spellStart"/>
+      <w:r>
+        <w:t>bak</w:t>
+      </w:r>
+      <w:proofErr w:type="spellEnd"/>
+      <w:r>
+        <w:t xml:space="preserve"> plano temporal del disco.</w:t>
       </w:r>
     </w:p>
     <w:p/>
     <w:p>
       <w:r>
-        <w:t>2. Restauración de Copia de Seguridad: El administrador ingresa la contraseña de cifrado. El sistema valida la extensión. stachbak, descifra el contenido hacia un archivo .bak plano temporal, invoca la restauración nativa en el servidor SQL y elimina de inmediato el archivo temporal.</w:t>
+        <w:t xml:space="preserve">2. Restauración de Copia de Seguridad: El administrador ingresa la contraseña de cifrado. El sistema valida la extensión. </w:t>
+      </w:r>
+      <w:proofErr w:type="spellStart"/>
+      <w:r>
+        <w:t>stachbak</w:t>
+      </w:r>
+      <w:proofErr w:type="spellEnd"/>
+      <w:r>
+        <w:t>, descifra el contenido hacia un archivo .</w:t>
+      </w:r>
+      <w:proofErr w:type="spellStart"/>
+      <w:r>
+        <w:t>bak</w:t>
+      </w:r>
+      <w:proofErr w:type="spellEnd"/>
+      <w:r>
+        <w:t xml:space="preserve"> plano temporal, invoca la restauración nativa en el servidor SQL y elimina de inmediato el archivo temporal.</w:t>
       </w:r>
     </w:p>
     <w:p/>
     <w:p>
       <w:r>
-        <w:t>3. Clave de Recuperación Maestra: Al iniciar el sistema (Program.cs), se genera una clave maestra de recuperación de emergencia y se guarda hasheada en App.config. La sección se protege criptográficamente usando el proveedor DPAPI (Data Protection API) de Windows. Esta clave permite a un administrador saltar (bypass) la validación de base de datos ante errores graves de conexión o integridad y acceder directamente a restaurar un backup íntegro.</w:t>
+        <w:t>3. Clave de Recuperación Maestra: Al iniciar el sistema (</w:t>
+      </w:r>
+      <w:proofErr w:type="spellStart"/>
+      <w:r>
+        <w:t>Program.cs</w:t>
+      </w:r>
+      <w:proofErr w:type="spellEnd"/>
+      <w:r>
+        <w:t xml:space="preserve">), se genera una clave maestra de recuperación de emergencia y se guarda </w:t>
+      </w:r>
+      <w:proofErr w:type="spellStart"/>
+      <w:r>
+        <w:t>hasheada</w:t>
+      </w:r>
+      <w:proofErr w:type="spellEnd"/>
+      <w:r>
+        <w:t xml:space="preserve"> en </w:t>
+      </w:r>
+      <w:proofErr w:type="spellStart"/>
+      <w:r>
+        <w:t>App.config</w:t>
+      </w:r>
+      <w:proofErr w:type="spellEnd"/>
+      <w:r>
+        <w:t xml:space="preserve">. La sección se protege criptográficamente usando el proveedor DPAPI (Data </w:t>
+      </w:r>
+      <w:proofErr w:type="spellStart"/>
+      <w:r>
+        <w:t>Protection</w:t>
+      </w:r>
+      <w:proofErr w:type="spellEnd"/>
+      <w:r>
+        <w:t xml:space="preserve"> API) de Windows. Esta clave permite a un administrador saltar (bypass) la validación de base de datos ante errores graves de conexión o integridad y acceder directamente a restaurar un </w:t>
+      </w:r>
+      <w:proofErr w:type="spellStart"/>
+      <w:r>
+        <w:t>backup</w:t>
+      </w:r>
+      <w:proofErr w:type="spellEnd"/>
+      <w:r>
+        <w:t xml:space="preserve"> íntegro.</w:t>
       </w:r>
     </w:p>
     <w:p>
@@ -19701,39 +20898,161 @@
         <w:pStyle w:val="Ttulo3"/>
       </w:pPr>
       <w:bookmarkStart w:id="134" w:name="_Toc233886231"/>
-      <w:r>
-        <w:t>Politica de Backup</w:t>
+      <w:proofErr w:type="spellStart"/>
+      <w:r>
+        <w:t>Politica</w:t>
+      </w:r>
+      <w:proofErr w:type="spellEnd"/>
+      <w:r>
+        <w:t xml:space="preserve"> de </w:t>
+      </w:r>
+      <w:proofErr w:type="spellStart"/>
+      <w:r>
+        <w:t>Backup</w:t>
       </w:r>
       <w:bookmarkEnd w:id="134"/>
-    </w:p>
-    <w:p>
-      <w:r>
-        <w:t>Solo el usuario con permiso 'Backups' puede crear y restaurar copias de seguridad.</w:t>
+      <w:proofErr w:type="spellEnd"/>
+    </w:p>
+    <w:p>
+      <w:r>
+        <w:t>Solo el usuario con permiso '</w:t>
+      </w:r>
+      <w:proofErr w:type="spellStart"/>
+      <w:r>
+        <w:t>Backups</w:t>
+      </w:r>
+      <w:proofErr w:type="spellEnd"/>
+      <w:r>
+        <w:t>' puede crear y restaurar copias de seguridad.</w:t>
       </w:r>
     </w:p>
     <w:p/>
     <w:p>
       <w:r>
         <w:lastRenderedPageBreak/>
-        <w:t>No se permite crear un backup si la integridad de la base de datos esta comprometida (DVH/DVV invalidos).</w:t>
+        <w:t xml:space="preserve">No se permite crear un </w:t>
+      </w:r>
+      <w:proofErr w:type="spellStart"/>
+      <w:r>
+        <w:t>backup</w:t>
+      </w:r>
+      <w:proofErr w:type="spellEnd"/>
+      <w:r>
+        <w:t xml:space="preserve"> si la integridad de la base de datos </w:t>
+      </w:r>
+      <w:proofErr w:type="spellStart"/>
+      <w:r>
+        <w:t>esta</w:t>
+      </w:r>
+      <w:proofErr w:type="spellEnd"/>
+      <w:r>
+        <w:t xml:space="preserve"> comprometida (DVH/DVV </w:t>
+      </w:r>
+      <w:proofErr w:type="spellStart"/>
+      <w:r>
+        <w:t>invalidos</w:t>
+      </w:r>
+      <w:proofErr w:type="spellEnd"/>
+      <w:r>
+        <w:t>).</w:t>
       </w:r>
     </w:p>
     <w:p/>
     <w:p>
       <w:r>
-        <w:t>El archivo generado tiene extension .stachbak y esta cifrado con AES-256. Sin la contrasena correcta no es posible restaurar.</w:t>
+        <w:t xml:space="preserve">El archivo generado tiene </w:t>
+      </w:r>
+      <w:proofErr w:type="spellStart"/>
+      <w:r>
+        <w:t>extension</w:t>
+      </w:r>
+      <w:proofErr w:type="spellEnd"/>
+      <w:r>
+        <w:t xml:space="preserve"> .</w:t>
+      </w:r>
+      <w:proofErr w:type="spellStart"/>
+      <w:r>
+        <w:t>stachbak</w:t>
+      </w:r>
+      <w:proofErr w:type="spellEnd"/>
+      <w:r>
+        <w:t xml:space="preserve"> y </w:t>
+      </w:r>
+      <w:proofErr w:type="spellStart"/>
+      <w:r>
+        <w:t>esta</w:t>
+      </w:r>
+      <w:proofErr w:type="spellEnd"/>
+      <w:r>
+        <w:t xml:space="preserve"> cifrado con AES-256. Sin la </w:t>
+      </w:r>
+      <w:proofErr w:type="spellStart"/>
+      <w:r>
+        <w:t>contrasena</w:t>
+      </w:r>
+      <w:proofErr w:type="spellEnd"/>
+      <w:r>
+        <w:t xml:space="preserve"> correcta no es posible restaurar.</w:t>
       </w:r>
     </w:p>
     <w:p/>
     <w:p>
       <w:r>
-        <w:t>Al restaurar, el sistema calcula cuantos registros de Bitacora y Control de Cambios se perderan e informa al administrador antes de confirmar.</w:t>
+        <w:t xml:space="preserve">Al restaurar, el sistema calcula cuantos registros de </w:t>
+      </w:r>
+      <w:proofErr w:type="spellStart"/>
+      <w:r>
+        <w:t>Bitacora</w:t>
+      </w:r>
+      <w:proofErr w:type="spellEnd"/>
+      <w:r>
+        <w:t xml:space="preserve"> y Control de Cambios se </w:t>
+      </w:r>
+      <w:proofErr w:type="spellStart"/>
+      <w:r>
+        <w:t>perderan</w:t>
+      </w:r>
+      <w:proofErr w:type="spellEnd"/>
+      <w:r>
+        <w:t xml:space="preserve"> e informa al administrador antes de confirmar.</w:t>
       </w:r>
     </w:p>
     <w:p/>
     <w:p>
       <w:r>
-        <w:t>Tras la restauracion exitosa, la aplicacion se reinicia automaticamente y recalcula los digitos verificadores.</w:t>
+        <w:t xml:space="preserve">Tras la </w:t>
+      </w:r>
+      <w:proofErr w:type="spellStart"/>
+      <w:r>
+        <w:t>restauracion</w:t>
+      </w:r>
+      <w:proofErr w:type="spellEnd"/>
+      <w:r>
+        <w:t xml:space="preserve"> exitosa, la </w:t>
+      </w:r>
+      <w:proofErr w:type="spellStart"/>
+      <w:r>
+        <w:t>aplicacion</w:t>
+      </w:r>
+      <w:proofErr w:type="spellEnd"/>
+      <w:r>
+        <w:t xml:space="preserve"> se reinicia </w:t>
+      </w:r>
+      <w:proofErr w:type="spellStart"/>
+      <w:r>
+        <w:t>automaticamente</w:t>
+      </w:r>
+      <w:proofErr w:type="spellEnd"/>
+      <w:r>
+        <w:t xml:space="preserve"> y recalcula los </w:t>
+      </w:r>
+      <w:proofErr w:type="spellStart"/>
+      <w:r>
+        <w:t>digitos</w:t>
+      </w:r>
+      <w:proofErr w:type="spellEnd"/>
+      <w:r>
+        <w:t xml:space="preserve"> verificadores.</w:t>
       </w:r>
     </w:p>
     <w:p/>
@@ -19742,10 +21061,20 @@
         <w:pStyle w:val="Ttulo3"/>
       </w:pPr>
       <w:bookmarkStart w:id="135" w:name="_Toc233886232"/>
-      <w:r>
-        <w:t>Especificacion de Casos de Uso - CU009 Crear Backup</w:t>
+      <w:proofErr w:type="spellStart"/>
+      <w:r>
+        <w:t>Especificacion</w:t>
+      </w:r>
+      <w:proofErr w:type="spellEnd"/>
+      <w:r>
+        <w:t xml:space="preserve"> de Casos de Uso - CU009 Crear </w:t>
+      </w:r>
+      <w:proofErr w:type="spellStart"/>
+      <w:r>
+        <w:t>Backup</w:t>
       </w:r>
       <w:bookmarkEnd w:id="135"/>
+      <w:proofErr w:type="spellEnd"/>
     </w:p>
     <w:tbl>
       <w:tblPr>
@@ -19793,8 +21122,13 @@
               <w:pStyle w:val="Sinespaciado"/>
             </w:pPr>
             <w:r>
-              <w:t>CU009 - Crear Backup</w:t>
-            </w:r>
+              <w:t xml:space="preserve">CU009 - Crear </w:t>
+            </w:r>
+            <w:proofErr w:type="spellStart"/>
+            <w:r>
+              <w:t>Backup</w:t>
+            </w:r>
+            <w:proofErr w:type="spellEnd"/>
           </w:p>
         </w:tc>
       </w:tr>
@@ -19857,6 +21191,7 @@
                 <w:bCs/>
               </w:rPr>
             </w:pPr>
+            <w:proofErr w:type="spellStart"/>
             <w:r>
               <w:rPr>
                 <w:b/>
@@ -19864,6 +21199,7 @@
               </w:rPr>
               <w:t>Descripcion</w:t>
             </w:r>
+            <w:proofErr w:type="spellEnd"/>
           </w:p>
         </w:tc>
         <w:tc>
@@ -19875,7 +21211,15 @@
               <w:pStyle w:val="Sinespaciado"/>
             </w:pPr>
             <w:r>
-              <w:t>Permite al administrador generar una copia de seguridad cifrada de la base de datos en un archivo .stachbak.</w:t>
+              <w:t>Permite al administrador generar una copia de seguridad cifrada de la base de datos en un archivo .</w:t>
+            </w:r>
+            <w:proofErr w:type="spellStart"/>
+            <w:r>
+              <w:t>stachbak</w:t>
+            </w:r>
+            <w:proofErr w:type="spellEnd"/>
+            <w:r>
+              <w:t>.</w:t>
             </w:r>
           </w:p>
         </w:tc>
@@ -19957,7 +21301,23 @@
               <w:pStyle w:val="Sinespaciado"/>
             </w:pPr>
             <w:r>
-              <w:t>El usuario tiene sesion activa con permiso 'Backups'. La integridad de la BD esta integra.</w:t>
+              <w:t xml:space="preserve">El usuario tiene </w:t>
+            </w:r>
+            <w:proofErr w:type="spellStart"/>
+            <w:r>
+              <w:t>sesion</w:t>
+            </w:r>
+            <w:proofErr w:type="spellEnd"/>
+            <w:r>
+              <w:t xml:space="preserve"> activa con permiso '</w:t>
+            </w:r>
+            <w:proofErr w:type="spellStart"/>
+            <w:r>
+              <w:t>Backups</w:t>
+            </w:r>
+            <w:proofErr w:type="spellEnd"/>
+            <w:r>
+              <w:t>'. La integridad de la BD esta integra.</w:t>
             </w:r>
           </w:p>
         </w:tc>
@@ -19985,8 +21345,17 @@
                 <w:b/>
                 <w:bCs/>
               </w:rPr>
-              <w:t>Puntos de extension</w:t>
-            </w:r>
+              <w:t xml:space="preserve">Puntos de </w:t>
+            </w:r>
+            <w:proofErr w:type="spellStart"/>
+            <w:r>
+              <w:rPr>
+                <w:b/>
+                <w:bCs/>
+              </w:rPr>
+              <w:t>extension</w:t>
+            </w:r>
+            <w:proofErr w:type="spellEnd"/>
           </w:p>
         </w:tc>
         <w:tc>
@@ -20021,12 +21390,21 @@
                 <w:bCs/>
               </w:rPr>
             </w:pPr>
-            <w:r>
-              <w:rPr>
-                <w:b/>
-                <w:bCs/>
-              </w:rPr>
-              <w:t>Condicion extend</w:t>
+            <w:proofErr w:type="spellStart"/>
+            <w:r>
+              <w:rPr>
+                <w:b/>
+                <w:bCs/>
+              </w:rPr>
+              <w:t>Condicion</w:t>
+            </w:r>
+            <w:proofErr w:type="spellEnd"/>
+            <w:r>
+              <w:rPr>
+                <w:b/>
+                <w:bCs/>
+              </w:rPr>
+              <w:t xml:space="preserve"> extend</w:t>
             </w:r>
           </w:p>
         </w:tc>
@@ -20080,7 +21458,43 @@
               <w:pStyle w:val="Sinespaciado"/>
             </w:pPr>
             <w:r>
-              <w:t>1. El administrador selecciona Crear Backup en el formulario de Backup. 2. La interfaz solicita una contraseña de cifrado para proteger el archivo. 3. El administrador ingresa la contraseña y confirma. 4. La interfaz muestra un mensaje de éxito indicando que el archivo .stachbak fue generado correctamente.</w:t>
+              <w:t xml:space="preserve">1. El administrador selecciona Crear </w:t>
+            </w:r>
+            <w:proofErr w:type="spellStart"/>
+            <w:r>
+              <w:t>Backup</w:t>
+            </w:r>
+            <w:proofErr w:type="spellEnd"/>
+            <w:r>
+              <w:t xml:space="preserve"> en el formulario de </w:t>
+            </w:r>
+            <w:proofErr w:type="spellStart"/>
+            <w:r>
+              <w:t>Backup</w:t>
+            </w:r>
+            <w:proofErr w:type="spellEnd"/>
+            <w:r>
+              <w:t>.</w:t>
+            </w:r>
+            <w:r>
+              <w:br/>
+              <w:t>2. La interfaz solicita una contraseña de cifrado para proteger el archivo.</w:t>
+            </w:r>
+            <w:r>
+              <w:br/>
+              <w:t>3. El administrador ingresa la contraseña y confirma.</w:t>
+            </w:r>
+            <w:r>
+              <w:br/>
+              <w:t>4. La interfaz muestra un mensaje de éxito indicando que el archivo .</w:t>
+            </w:r>
+            <w:proofErr w:type="spellStart"/>
+            <w:r>
+              <w:t>stachbak</w:t>
+            </w:r>
+            <w:proofErr w:type="spellEnd"/>
+            <w:r>
+              <w:t xml:space="preserve"> fue generado correctamente.</w:t>
             </w:r>
           </w:p>
         </w:tc>
@@ -20121,7 +21535,71 @@
               <w:pStyle w:val="Sinespaciado"/>
             </w:pPr>
             <w:r>
-              <w:t>2.1.1. La integridad de la BD esta comprometida: 2.1.2. El sistema muestra un error y cancela la operacion. 3.1.1. La contrasena esta vacia: 3.1.2. El sistema muestra 'Ingrese una contrasena valida'. 3.1.3. Retorna al paso 3.</w:t>
+              <w:t xml:space="preserve">2.1.1. La integridad de la BD </w:t>
+            </w:r>
+            <w:proofErr w:type="spellStart"/>
+            <w:r>
+              <w:t>esta</w:t>
+            </w:r>
+            <w:proofErr w:type="spellEnd"/>
+            <w:r>
+              <w:t xml:space="preserve"> comprometida:</w:t>
+            </w:r>
+            <w:r>
+              <w:br/>
+              <w:t xml:space="preserve">2.1.2. El sistema muestra un error y cancela la </w:t>
+            </w:r>
+            <w:proofErr w:type="spellStart"/>
+            <w:r>
+              <w:t>operacion</w:t>
+            </w:r>
+            <w:proofErr w:type="spellEnd"/>
+            <w:r>
+              <w:t>.</w:t>
+            </w:r>
+            <w:r>
+              <w:br/>
+              <w:t xml:space="preserve">3.1.1. La </w:t>
+            </w:r>
+            <w:proofErr w:type="spellStart"/>
+            <w:r>
+              <w:t>contrasena</w:t>
+            </w:r>
+            <w:proofErr w:type="spellEnd"/>
+            <w:r>
+              <w:t xml:space="preserve"> </w:t>
+            </w:r>
+            <w:proofErr w:type="spellStart"/>
+            <w:r>
+              <w:t>esta</w:t>
+            </w:r>
+            <w:proofErr w:type="spellEnd"/>
+            <w:r>
+              <w:t xml:space="preserve"> </w:t>
+            </w:r>
+            <w:proofErr w:type="spellStart"/>
+            <w:r>
+              <w:t>vacia</w:t>
+            </w:r>
+            <w:proofErr w:type="spellEnd"/>
+            <w:r>
+              <w:t>:</w:t>
+            </w:r>
+            <w:r>
+              <w:br/>
+              <w:t xml:space="preserve">3.1.2. El sistema muestra 'Ingrese una </w:t>
+            </w:r>
+            <w:proofErr w:type="spellStart"/>
+            <w:r>
+              <w:t>contrasena</w:t>
+            </w:r>
+            <w:proofErr w:type="spellEnd"/>
+            <w:r>
+              <w:t xml:space="preserve"> valida'.</w:t>
+            </w:r>
+            <w:r>
+              <w:br/>
+              <w:t>3.1.3. Retorna al paso 3.</w:t>
             </w:r>
           </w:p>
         </w:tc>
@@ -20162,7 +21640,23 @@
               <w:pStyle w:val="Sinespaciado"/>
             </w:pPr>
             <w:r>
-              <w:t>El archivo .stachbak fue generado. El evento quedo registrado en la Bitacora.</w:t>
+              <w:t>El archivo .</w:t>
+            </w:r>
+            <w:proofErr w:type="spellStart"/>
+            <w:r>
+              <w:t>stachbak</w:t>
+            </w:r>
+            <w:proofErr w:type="spellEnd"/>
+            <w:r>
+              <w:t xml:space="preserve"> fue generado. El evento quedo registrado en la </w:t>
+            </w:r>
+            <w:proofErr w:type="spellStart"/>
+            <w:r>
+              <w:t>Bitacora</w:t>
+            </w:r>
+            <w:proofErr w:type="spellEnd"/>
+            <w:r>
+              <w:t>.</w:t>
             </w:r>
           </w:p>
         </w:tc>
@@ -20173,8 +21667,29 @@
         <w:pStyle w:val="Ttulo3"/>
       </w:pPr>
       <w:bookmarkStart w:id="136" w:name="_Toc233886233"/>
-      <w:r>
-        <w:t>Especificacion de Casos de Uso - CU010 Restaurar Backup (Wizard)</w:t>
+      <w:proofErr w:type="spellStart"/>
+      <w:r>
+        <w:t>Especificacion</w:t>
+      </w:r>
+      <w:proofErr w:type="spellEnd"/>
+      <w:r>
+        <w:t xml:space="preserve"> de Casos de Uso - CU010 Restaurar </w:t>
+      </w:r>
+      <w:proofErr w:type="spellStart"/>
+      <w:r>
+        <w:t>Backup</w:t>
+      </w:r>
+      <w:proofErr w:type="spellEnd"/>
+      <w:r>
+        <w:t xml:space="preserve"> (</w:t>
+      </w:r>
+      <w:proofErr w:type="spellStart"/>
+      <w:r>
+        <w:t>Wizard</w:t>
+      </w:r>
+      <w:proofErr w:type="spellEnd"/>
+      <w:r>
+        <w:t>)</w:t>
       </w:r>
       <w:bookmarkEnd w:id="136"/>
     </w:p>
@@ -20224,7 +21739,23 @@
               <w:pStyle w:val="Sinespaciado"/>
             </w:pPr>
             <w:r>
-              <w:t>CU010 - Restaurar Backup (Wizard)</w:t>
+              <w:t xml:space="preserve">CU010 - Restaurar </w:t>
+            </w:r>
+            <w:proofErr w:type="spellStart"/>
+            <w:r>
+              <w:t>Backup</w:t>
+            </w:r>
+            <w:proofErr w:type="spellEnd"/>
+            <w:r>
+              <w:t xml:space="preserve"> (</w:t>
+            </w:r>
+            <w:proofErr w:type="spellStart"/>
+            <w:r>
+              <w:t>Wizard</w:t>
+            </w:r>
+            <w:proofErr w:type="spellEnd"/>
+            <w:r>
+              <w:t>)</w:t>
             </w:r>
           </w:p>
         </w:tc>
@@ -20288,6 +21819,7 @@
                 <w:bCs/>
               </w:rPr>
             </w:pPr>
+            <w:proofErr w:type="spellStart"/>
             <w:r>
               <w:rPr>
                 <w:b/>
@@ -20295,6 +21827,7 @@
               </w:rPr>
               <w:t>Descripcion</w:t>
             </w:r>
+            <w:proofErr w:type="spellEnd"/>
           </w:p>
         </w:tc>
         <w:tc>
@@ -20306,7 +21839,15 @@
               <w:pStyle w:val="Sinespaciado"/>
             </w:pPr>
             <w:r>
-              <w:t>Permite al administrador restaurar la base de datos desde un archivo .stachbak mediante un asistente que informa la perdida de datos antes de confirmar.</w:t>
+              <w:t>Permite al administrador restaurar la base de datos desde un archivo .</w:t>
+            </w:r>
+            <w:proofErr w:type="spellStart"/>
+            <w:r>
+              <w:t>stachbak</w:t>
+            </w:r>
+            <w:proofErr w:type="spellEnd"/>
+            <w:r>
+              <w:t xml:space="preserve"> mediante un asistente que informa la perdida de datos antes de confirmar.</w:t>
             </w:r>
           </w:p>
         </w:tc>
@@ -20388,7 +21929,31 @@
               <w:pStyle w:val="Sinespaciado"/>
             </w:pPr>
             <w:r>
-              <w:t>El usuario tiene sesion activa con permiso 'Backups'. Existe un archivo .stachbak valido accesible.</w:t>
+              <w:t xml:space="preserve">El usuario tiene </w:t>
+            </w:r>
+            <w:proofErr w:type="spellStart"/>
+            <w:r>
+              <w:t>sesion</w:t>
+            </w:r>
+            <w:proofErr w:type="spellEnd"/>
+            <w:r>
+              <w:t xml:space="preserve"> activa con permiso '</w:t>
+            </w:r>
+            <w:proofErr w:type="spellStart"/>
+            <w:r>
+              <w:t>Backups</w:t>
+            </w:r>
+            <w:proofErr w:type="spellEnd"/>
+            <w:r>
+              <w:t>'. Existe un archivo .</w:t>
+            </w:r>
+            <w:proofErr w:type="spellStart"/>
+            <w:r>
+              <w:t>stachbak</w:t>
+            </w:r>
+            <w:proofErr w:type="spellEnd"/>
+            <w:r>
+              <w:t xml:space="preserve"> valido accesible.</w:t>
             </w:r>
           </w:p>
         </w:tc>
@@ -20416,8 +21981,17 @@
                 <w:b/>
                 <w:bCs/>
               </w:rPr>
-              <w:t>Puntos de extension</w:t>
-            </w:r>
+              <w:t xml:space="preserve">Puntos de </w:t>
+            </w:r>
+            <w:proofErr w:type="spellStart"/>
+            <w:r>
+              <w:rPr>
+                <w:b/>
+                <w:bCs/>
+              </w:rPr>
+              <w:t>extension</w:t>
+            </w:r>
+            <w:proofErr w:type="spellEnd"/>
           </w:p>
         </w:tc>
         <w:tc>
@@ -20452,12 +22026,21 @@
                 <w:bCs/>
               </w:rPr>
             </w:pPr>
-            <w:r>
-              <w:rPr>
-                <w:b/>
-                <w:bCs/>
-              </w:rPr>
-              <w:t>Condicion extend</w:t>
+            <w:proofErr w:type="spellStart"/>
+            <w:r>
+              <w:rPr>
+                <w:b/>
+                <w:bCs/>
+              </w:rPr>
+              <w:t>Condicion</w:t>
+            </w:r>
+            <w:proofErr w:type="spellEnd"/>
+            <w:r>
+              <w:rPr>
+                <w:b/>
+                <w:bCs/>
+              </w:rPr>
+              <w:t xml:space="preserve"> extend</w:t>
             </w:r>
           </w:p>
         </w:tc>
@@ -20512,7 +22095,67 @@
               <w:pStyle w:val="Sinespaciado"/>
             </w:pPr>
             <w:r>
-              <w:t>1. 1. El administrador selecciona Restaurar Backup en el formulario de Backup. 2. La interfaz (Wizard – Paso 1) solicita seleccionar el archivo .stachbak e ingresar la contraseña de cifrado. 3. El administrador selecciona el archivo e ingresa la contraseña. 4. La interfaz (Wizard – Paso 2) muestra la cantidad de registros que se perderán y solicita confirmación. 5. El administrador confirma. 6. La interfaz muestra un mensaje de éxito e inicia el reinicio automático de la aplicación.</w:t>
+              <w:t xml:space="preserve">1. El administrador selecciona Restaurar </w:t>
+            </w:r>
+            <w:proofErr w:type="spellStart"/>
+            <w:r>
+              <w:t>Backup</w:t>
+            </w:r>
+            <w:proofErr w:type="spellEnd"/>
+            <w:r>
+              <w:t xml:space="preserve"> en el formulario de </w:t>
+            </w:r>
+            <w:proofErr w:type="spellStart"/>
+            <w:r>
+              <w:t>Backup</w:t>
+            </w:r>
+            <w:proofErr w:type="spellEnd"/>
+            <w:r>
+              <w:t>.</w:t>
+            </w:r>
+            <w:r>
+              <w:br/>
+              <w:t>2. La interfaz (</w:t>
+            </w:r>
+            <w:proofErr w:type="spellStart"/>
+            <w:r>
+              <w:t>Wizard</w:t>
+            </w:r>
+            <w:proofErr w:type="spellEnd"/>
+            <w:r>
+              <w:t xml:space="preserve"> – Paso 1) solicita seleccionar el archivo .</w:t>
+            </w:r>
+            <w:proofErr w:type="spellStart"/>
+            <w:r>
+              <w:t>stachbak</w:t>
+            </w:r>
+            <w:proofErr w:type="spellEnd"/>
+            <w:r>
+              <w:t xml:space="preserve"> e ingresar la contraseña de cifrado.</w:t>
+            </w:r>
+            <w:r>
+              <w:br/>
+              <w:t>3. El administrador selecciona el archivo e ingresa la contraseña.</w:t>
+            </w:r>
+            <w:r>
+              <w:br/>
+              <w:t>4. La interfaz (</w:t>
+            </w:r>
+            <w:proofErr w:type="spellStart"/>
+            <w:r>
+              <w:t>Wizard</w:t>
+            </w:r>
+            <w:proofErr w:type="spellEnd"/>
+            <w:r>
+              <w:t xml:space="preserve"> – Paso 2) muestra la cantidad de registros que se perderán y solicita confirmación.</w:t>
+            </w:r>
+            <w:r>
+              <w:br/>
+              <w:t>5. El administrador confirma.</w:t>
+            </w:r>
+            <w:r>
+              <w:br/>
+              <w:t>6. La interfaz muestra un mensaje de éxito e inicia el reinicio automático de la aplicación.</w:t>
             </w:r>
           </w:p>
         </w:tc>
@@ -20553,7 +22196,59 @@
               <w:pStyle w:val="Sinespaciado"/>
             </w:pPr>
             <w:r>
-              <w:t>2.1.1. El archivo no tiene extension .stachbak: 2.1.2. El sistema muestra 'Archivo invalido'. 2.1.3. Retorna al Paso 1. 5.1.1. La contrasena es incorrecta o el archivo esta daniado: 5.1.2. El sistema muestra un error y no aplica cambios. 5.1.3. Retorna al Paso 1.</w:t>
+              <w:t xml:space="preserve">2.1.1. El archivo no tiene </w:t>
+            </w:r>
+            <w:proofErr w:type="spellStart"/>
+            <w:r>
+              <w:t>extension</w:t>
+            </w:r>
+            <w:proofErr w:type="spellEnd"/>
+            <w:r>
+              <w:t xml:space="preserve"> .</w:t>
+            </w:r>
+            <w:proofErr w:type="spellStart"/>
+            <w:r>
+              <w:t>stachbak</w:t>
+            </w:r>
+            <w:proofErr w:type="spellEnd"/>
+            <w:r>
+              <w:t>:</w:t>
+            </w:r>
+            <w:r>
+              <w:br/>
+              <w:t>2.1.2. El sistema muestra 'Archivo invalido'.</w:t>
+            </w:r>
+            <w:r>
+              <w:br/>
+              <w:t>2.1.3. Retorna al Paso 1.</w:t>
+            </w:r>
+            <w:r>
+              <w:br/>
+              <w:t xml:space="preserve">5.1.1. La </w:t>
+            </w:r>
+            <w:proofErr w:type="spellStart"/>
+            <w:r>
+              <w:t>contrasena</w:t>
+            </w:r>
+            <w:proofErr w:type="spellEnd"/>
+            <w:r>
+              <w:t xml:space="preserve"> es incorrecta o el archivo esta </w:t>
+            </w:r>
+            <w:proofErr w:type="spellStart"/>
+            <w:r>
+              <w:t>daniado</w:t>
+            </w:r>
+            <w:proofErr w:type="spellEnd"/>
+            <w:r>
+              <w:t>:</w:t>
+            </w:r>
+            <w:r>
+              <w:br/>
+              <w:t>5.1.2. El sistema muestra un error y no aplica cambios.</w:t>
+            </w:r>
+            <w:r>
+              <w:br/>
+              <w:t>5.1.3. Retorna al Paso 1.</w:t>
             </w:r>
           </w:p>
         </w:tc>
@@ -20594,7 +22289,47 @@
               <w:pStyle w:val="Sinespaciado"/>
             </w:pPr>
             <w:r>
-              <w:t>La BD fue restaurada. Los DVs fueron recalculados. La aplicacion se reinicio automaticamente. El evento quedo registrado en la Bitacora.</w:t>
+              <w:t xml:space="preserve">La BD fue restaurada. Los </w:t>
+            </w:r>
+            <w:proofErr w:type="spellStart"/>
+            <w:r>
+              <w:t>DVs</w:t>
+            </w:r>
+            <w:proofErr w:type="spellEnd"/>
+            <w:r>
+              <w:t xml:space="preserve"> fueron recalculados. La </w:t>
+            </w:r>
+            <w:proofErr w:type="spellStart"/>
+            <w:r>
+              <w:t>aplicacion</w:t>
+            </w:r>
+            <w:proofErr w:type="spellEnd"/>
+            <w:r>
+              <w:t xml:space="preserve"> se </w:t>
+            </w:r>
+            <w:proofErr w:type="spellStart"/>
+            <w:r>
+              <w:t>reinicio</w:t>
+            </w:r>
+            <w:proofErr w:type="spellEnd"/>
+            <w:r>
+              <w:t xml:space="preserve"> </w:t>
+            </w:r>
+            <w:proofErr w:type="spellStart"/>
+            <w:r>
+              <w:t>automaticamente</w:t>
+            </w:r>
+            <w:proofErr w:type="spellEnd"/>
+            <w:r>
+              <w:t xml:space="preserve">. El evento quedo registrado en la </w:t>
+            </w:r>
+            <w:proofErr w:type="spellStart"/>
+            <w:r>
+              <w:t>Bitacora</w:t>
+            </w:r>
+            <w:proofErr w:type="spellEnd"/>
+            <w:r>
+              <w:t>.</w:t>
             </w:r>
           </w:p>
         </w:tc>
@@ -20606,9 +22341,14 @@
       </w:pPr>
       <w:bookmarkStart w:id="137" w:name="_Toc233886234"/>
       <w:r>
-        <w:t>Diagrama de Clases - Backup</w:t>
+        <w:t xml:space="preserve">Diagrama de Clases - </w:t>
+      </w:r>
+      <w:proofErr w:type="spellStart"/>
+      <w:r>
+        <w:t>Backup</w:t>
       </w:r>
       <w:bookmarkEnd w:id="137"/>
+      <w:proofErr w:type="spellEnd"/>
     </w:p>
     <w:p>
       <w:pPr>
@@ -20619,7 +22359,7 @@
           <w:noProof/>
         </w:rPr>
         <w:drawing>
-          <wp:inline distT="0" distB="0" distL="0" distR="0" wp14:anchorId="7371D9D5" wp14:editId="60265A80">
+          <wp:inline distT="0" distB="0" distL="0" distR="0" wp14:anchorId="7371D9D5" wp14:editId="48170DAE">
             <wp:extent cx="5760720" cy="3289300"/>
             <wp:effectExtent l="0" t="0" r="0" b="6350"/>
             <wp:docPr id="1935190073" name="Imagen 29"/>
@@ -20676,9 +22416,22 @@
       <w:bookmarkStart w:id="138" w:name="_Toc233886235"/>
       <w:r>
         <w:lastRenderedPageBreak/>
-        <w:t>Diagrama de Secuencia - Restauracion con Wizard</w:t>
+        <w:t xml:space="preserve">Diagrama de Secuencia - </w:t>
+      </w:r>
+      <w:proofErr w:type="spellStart"/>
+      <w:r>
+        <w:t>Restauracion</w:t>
+      </w:r>
+      <w:proofErr w:type="spellEnd"/>
+      <w:r>
+        <w:t xml:space="preserve"> con </w:t>
+      </w:r>
+      <w:proofErr w:type="spellStart"/>
+      <w:r>
+        <w:t>Wizard</w:t>
       </w:r>
       <w:bookmarkEnd w:id="138"/>
+      <w:proofErr w:type="spellEnd"/>
     </w:p>
     <w:p>
       <w:pPr>
@@ -20689,7 +22442,7 @@
           <w:noProof/>
         </w:rPr>
         <w:drawing>
-          <wp:inline distT="0" distB="0" distL="0" distR="0" wp14:anchorId="03F44CD0" wp14:editId="6477B9F8">
+          <wp:inline distT="0" distB="0" distL="0" distR="0" wp14:anchorId="03F44CD0" wp14:editId="44FD64F6">
             <wp:extent cx="5760720" cy="4479290"/>
             <wp:effectExtent l="0" t="0" r="0" b="0"/>
             <wp:docPr id="1539221299" name="Imagen 30"/>
@@ -20788,20 +22541,52 @@
     <w:p/>
     <w:p>
       <w:r>
-        <w:t>1. Dígito Verificador Horizontal (DVH): Es un hash SHA-256 que se calcula sobre los atributos críticos de cada registro de usuario (ID, username, contraseña hasheada, estado). Para detectar el intercambio de registros, en el cálculo participa la posición del carácter y la posición del atributo. Se almacena en una columna específica del mismo registro.</w:t>
+        <w:t xml:space="preserve">1. Dígito Verificador Horizontal (DVH): Es un hash SHA-256 que se calcula sobre los atributos críticos de cada registro de usuario (ID, </w:t>
+      </w:r>
+      <w:proofErr w:type="spellStart"/>
+      <w:r>
+        <w:t>username</w:t>
+      </w:r>
+      <w:proofErr w:type="spellEnd"/>
+      <w:r>
+        <w:t xml:space="preserve">, contraseña </w:t>
+      </w:r>
+      <w:proofErr w:type="spellStart"/>
+      <w:r>
+        <w:t>hasheada</w:t>
+      </w:r>
+      <w:proofErr w:type="spellEnd"/>
+      <w:r>
+        <w:t>, estado). Para detectar el intercambio de registros, en el cálculo participa la posición del carácter y la posición del atributo. Se almacena en una columna específica del mismo registro.</w:t>
       </w:r>
     </w:p>
     <w:p/>
     <w:p>
       <w:r>
-        <w:t>2. Dígito Verificador Vertical (DVV): Es un hash calculado sobre la suma/concatenación de todos los DVH individuales de la tabla en cuestión. Se almacena en la tabla separada llamada VerificacionVertical en la base de datos.</w:t>
+        <w:t xml:space="preserve">2. Dígito Verificador Vertical (DVV): Es un hash calculado sobre la suma/concatenación de todos los DVH individuales de la tabla en cuestión. Se almacena en la tabla separada llamada </w:t>
+      </w:r>
+      <w:proofErr w:type="spellStart"/>
+      <w:r>
+        <w:t>VerificacionVertical</w:t>
+      </w:r>
+      <w:proofErr w:type="spellEnd"/>
+      <w:r>
+        <w:t xml:space="preserve"> en la base de datos.</w:t>
       </w:r>
     </w:p>
     <w:p/>
     <w:p>
       <w:r>
         <w:lastRenderedPageBreak/>
-        <w:t>Verificación en Arranque: Al arrancar el sistema (Program.cs) y antes de mostrar el Login, se recalculan y verifican los DVH y el DVV de la tabla Usuario. Si se detectan inconsistencias (registros faltantes, agregados por fuera, o modificados directamente en la base de datos), la aplicación bloquea el ingreso regular y abre de forma obligatoria el panel de restauración de emergencia, solicitando credenciales válidas o la Clave de Recuperación Maestra.</w:t>
+        <w:t>Verificación en Arranque: Al arrancar el sistema (</w:t>
+      </w:r>
+      <w:proofErr w:type="spellStart"/>
+      <w:r>
+        <w:t>Program.cs</w:t>
+      </w:r>
+      <w:proofErr w:type="spellEnd"/>
+      <w:r>
+        <w:t>) y antes de mostrar el Login, se recalculan y verifican los DVH y el DVV de la tabla Usuario. Si se detectan inconsistencias (registros faltantes, agregados por fuera, o modificados directamente en la base de datos), la aplicación bloquea el ingreso regular y abre de forma obligatoria el panel de restauración de emergencia, solicitando credenciales válidas o la Clave de Recuperación Maestra.</w:t>
       </w:r>
     </w:p>
     <w:p>
@@ -20809,26 +22594,151 @@
         <w:pStyle w:val="Ttulo3"/>
       </w:pPr>
       <w:bookmarkStart w:id="144" w:name="_Toc233886239"/>
-      <w:r>
-        <w:t>Politica de Digitos Verificadores</w:t>
+      <w:proofErr w:type="spellStart"/>
+      <w:r>
+        <w:t>Politica</w:t>
+      </w:r>
+      <w:proofErr w:type="spellEnd"/>
+      <w:r>
+        <w:t xml:space="preserve"> de </w:t>
+      </w:r>
+      <w:proofErr w:type="spellStart"/>
+      <w:r>
+        <w:t>Digitos</w:t>
+      </w:r>
+      <w:proofErr w:type="spellEnd"/>
+      <w:r>
+        <w:t xml:space="preserve"> Verificadores</w:t>
       </w:r>
       <w:bookmarkEnd w:id="144"/>
     </w:p>
     <w:p>
       <w:r>
-        <w:t>El calculo y verificacion de DVs es completamente automatico y transparente al usuario. No requiere intervencion manual durante la operacion normal.</w:t>
+        <w:t xml:space="preserve">El </w:t>
+      </w:r>
+      <w:proofErr w:type="spellStart"/>
+      <w:r>
+        <w:t>calculo</w:t>
+      </w:r>
+      <w:proofErr w:type="spellEnd"/>
+      <w:r>
+        <w:t xml:space="preserve"> y </w:t>
+      </w:r>
+      <w:proofErr w:type="spellStart"/>
+      <w:r>
+        <w:t>verificacion</w:t>
+      </w:r>
+      <w:proofErr w:type="spellEnd"/>
+      <w:r>
+        <w:t xml:space="preserve"> de </w:t>
+      </w:r>
+      <w:proofErr w:type="spellStart"/>
+      <w:r>
+        <w:t>DVs</w:t>
+      </w:r>
+      <w:proofErr w:type="spellEnd"/>
+      <w:r>
+        <w:t xml:space="preserve"> es completamente </w:t>
+      </w:r>
+      <w:proofErr w:type="spellStart"/>
+      <w:r>
+        <w:t>automatico</w:t>
+      </w:r>
+      <w:proofErr w:type="spellEnd"/>
+      <w:r>
+        <w:t xml:space="preserve"> y transparente al usuario. No requiere </w:t>
+      </w:r>
+      <w:proofErr w:type="spellStart"/>
+      <w:r>
+        <w:t>intervencion</w:t>
+      </w:r>
+      <w:proofErr w:type="spellEnd"/>
+      <w:r>
+        <w:t xml:space="preserve"> manual durante la </w:t>
+      </w:r>
+      <w:proofErr w:type="spellStart"/>
+      <w:r>
+        <w:t>operacion</w:t>
+      </w:r>
+      <w:proofErr w:type="spellEnd"/>
+      <w:r>
+        <w:t xml:space="preserve"> normal.</w:t>
       </w:r>
     </w:p>
     <w:p/>
     <w:p>
       <w:r>
-        <w:t>Los DVs son recalculados tras toda operacion de escritura sobre la tabla Usuario (alta, modificacion, cambio de estado, asignacion de permisos, rollback).</w:t>
+        <w:t xml:space="preserve">Los </w:t>
+      </w:r>
+      <w:proofErr w:type="spellStart"/>
+      <w:r>
+        <w:t>DVs</w:t>
+      </w:r>
+      <w:proofErr w:type="spellEnd"/>
+      <w:r>
+        <w:t xml:space="preserve"> son recalculados tras toda </w:t>
+      </w:r>
+      <w:proofErr w:type="spellStart"/>
+      <w:r>
+        <w:t>operacion</w:t>
+      </w:r>
+      <w:proofErr w:type="spellEnd"/>
+      <w:r>
+        <w:t xml:space="preserve"> de escritura sobre la tabla Usuario (alta, </w:t>
+      </w:r>
+      <w:proofErr w:type="spellStart"/>
+      <w:r>
+        <w:t>modificacion</w:t>
+      </w:r>
+      <w:proofErr w:type="spellEnd"/>
+      <w:r>
+        <w:t xml:space="preserve">, cambio de estado, </w:t>
+      </w:r>
+      <w:proofErr w:type="spellStart"/>
+      <w:r>
+        <w:t>asignacion</w:t>
+      </w:r>
+      <w:proofErr w:type="spellEnd"/>
+      <w:r>
+        <w:t xml:space="preserve"> de permisos, </w:t>
+      </w:r>
+      <w:proofErr w:type="spellStart"/>
+      <w:r>
+        <w:t>rollback</w:t>
+      </w:r>
+      <w:proofErr w:type="spellEnd"/>
+      <w:r>
+        <w:t>).</w:t>
       </w:r>
     </w:p>
     <w:p/>
     <w:p>
       <w:r>
-        <w:t>Si se detecta corrupcion en el arranque, el unico acceso posible es mediante credenciales de administrador validas o la Clave de Recuperacion Maestra (DPAPI).</w:t>
+        <w:t xml:space="preserve">Si se detecta </w:t>
+      </w:r>
+      <w:proofErr w:type="spellStart"/>
+      <w:r>
+        <w:t>corrupcion</w:t>
+      </w:r>
+      <w:proofErr w:type="spellEnd"/>
+      <w:r>
+        <w:t xml:space="preserve"> en el arranque, el </w:t>
+      </w:r>
+      <w:proofErr w:type="spellStart"/>
+      <w:r>
+        <w:t>unico</w:t>
+      </w:r>
+      <w:proofErr w:type="spellEnd"/>
+      <w:r>
+        <w:t xml:space="preserve"> acceso posible es mediante credenciales de administrador validas o la Clave de </w:t>
+      </w:r>
+      <w:proofErr w:type="spellStart"/>
+      <w:r>
+        <w:t>Recuperacion</w:t>
+      </w:r>
+      <w:proofErr w:type="spellEnd"/>
+      <w:r>
+        <w:t xml:space="preserve"> Maestra (DPAPI).</w:t>
       </w:r>
     </w:p>
     <w:p/>
@@ -20837,8 +22747,13 @@
         <w:pStyle w:val="Ttulo3"/>
       </w:pPr>
       <w:bookmarkStart w:id="145" w:name="_Toc233886240"/>
-      <w:r>
-        <w:t>Especificacion de Casos de Uso - CU011 Verificar Integridad y Acceder a Contingencia</w:t>
+      <w:proofErr w:type="spellStart"/>
+      <w:r>
+        <w:t>Especificacion</w:t>
+      </w:r>
+      <w:proofErr w:type="spellEnd"/>
+      <w:r>
+        <w:t xml:space="preserve"> de Casos de Uso - CU011 Verificar Integridad y Acceder a Contingencia</w:t>
       </w:r>
       <w:bookmarkEnd w:id="145"/>
     </w:p>
@@ -20952,6 +22867,7 @@
                 <w:bCs/>
               </w:rPr>
             </w:pPr>
+            <w:proofErr w:type="spellStart"/>
             <w:r>
               <w:rPr>
                 <w:b/>
@@ -20959,6 +22875,7 @@
               </w:rPr>
               <w:t>Descripcion</w:t>
             </w:r>
+            <w:proofErr w:type="spellEnd"/>
           </w:p>
         </w:tc>
         <w:tc>
@@ -20970,7 +22887,31 @@
               <w:pStyle w:val="Sinespaciado"/>
             </w:pPr>
             <w:r>
-              <w:t>Al arrancar el sistema, se verifican automaticamente los DVH y DVV. Si se detecta corrupcion, el sistema bloquea el flujo normal y habilita el panel de restauracion de emergencia.</w:t>
+              <w:t xml:space="preserve">Al arrancar el sistema, se verifican </w:t>
+            </w:r>
+            <w:proofErr w:type="spellStart"/>
+            <w:r>
+              <w:t>automaticamente</w:t>
+            </w:r>
+            <w:proofErr w:type="spellEnd"/>
+            <w:r>
+              <w:t xml:space="preserve"> los DVH y DVV. Si se detecta </w:t>
+            </w:r>
+            <w:proofErr w:type="spellStart"/>
+            <w:r>
+              <w:t>corrupcion</w:t>
+            </w:r>
+            <w:proofErr w:type="spellEnd"/>
+            <w:r>
+              <w:t xml:space="preserve">, el sistema bloquea el flujo normal y habilita el panel de </w:t>
+            </w:r>
+            <w:proofErr w:type="spellStart"/>
+            <w:r>
+              <w:t>restauracion</w:t>
+            </w:r>
+            <w:proofErr w:type="spellEnd"/>
+            <w:r>
+              <w:t xml:space="preserve"> de emergencia.</w:t>
             </w:r>
           </w:p>
         </w:tc>
@@ -21011,7 +22952,15 @@
               <w:pStyle w:val="Sinespaciado"/>
             </w:pPr>
             <w:r>
-              <w:t>Sistema (automatico) / Administrador</w:t>
+              <w:t>Sistema (</w:t>
+            </w:r>
+            <w:proofErr w:type="spellStart"/>
+            <w:r>
+              <w:t>automatico</w:t>
+            </w:r>
+            <w:proofErr w:type="spellEnd"/>
+            <w:r>
+              <w:t>) / Administrador</w:t>
             </w:r>
           </w:p>
         </w:tc>
@@ -21052,7 +23001,31 @@
               <w:pStyle w:val="Sinespaciado"/>
             </w:pPr>
             <w:r>
-              <w:t>La aplicacion esta iniciando. Existe conexion valida a la base de datos.</w:t>
+              <w:t xml:space="preserve">La </w:t>
+            </w:r>
+            <w:proofErr w:type="spellStart"/>
+            <w:r>
+              <w:t>aplicacion</w:t>
+            </w:r>
+            <w:proofErr w:type="spellEnd"/>
+            <w:r>
+              <w:t xml:space="preserve"> </w:t>
+            </w:r>
+            <w:proofErr w:type="spellStart"/>
+            <w:r>
+              <w:t>esta</w:t>
+            </w:r>
+            <w:proofErr w:type="spellEnd"/>
+            <w:r>
+              <w:t xml:space="preserve"> iniciando. Existe </w:t>
+            </w:r>
+            <w:proofErr w:type="spellStart"/>
+            <w:r>
+              <w:t>conexion</w:t>
+            </w:r>
+            <w:proofErr w:type="spellEnd"/>
+            <w:r>
+              <w:t xml:space="preserve"> valida a la base de datos.</w:t>
             </w:r>
           </w:p>
         </w:tc>
@@ -21080,8 +23053,17 @@
                 <w:b/>
                 <w:bCs/>
               </w:rPr>
-              <w:t>Puntos de extension</w:t>
-            </w:r>
+              <w:t xml:space="preserve">Puntos de </w:t>
+            </w:r>
+            <w:proofErr w:type="spellStart"/>
+            <w:r>
+              <w:rPr>
+                <w:b/>
+                <w:bCs/>
+              </w:rPr>
+              <w:t>extension</w:t>
+            </w:r>
+            <w:proofErr w:type="spellEnd"/>
           </w:p>
         </w:tc>
         <w:tc>
@@ -21116,12 +23098,21 @@
                 <w:bCs/>
               </w:rPr>
             </w:pPr>
-            <w:r>
-              <w:rPr>
-                <w:b/>
-                <w:bCs/>
-              </w:rPr>
-              <w:t>Condicion extend</w:t>
+            <w:proofErr w:type="spellStart"/>
+            <w:r>
+              <w:rPr>
+                <w:b/>
+                <w:bCs/>
+              </w:rPr>
+              <w:t>Condicion</w:t>
+            </w:r>
+            <w:proofErr w:type="spellEnd"/>
+            <w:r>
+              <w:rPr>
+                <w:b/>
+                <w:bCs/>
+              </w:rPr>
+              <w:t xml:space="preserve"> extend</w:t>
             </w:r>
           </w:p>
         </w:tc>
@@ -21175,7 +23166,79 @@
               <w:pStyle w:val="Sinespaciado"/>
             </w:pPr>
             <w:r>
-              <w:t>1. Al iniciar, el sistema invoca VerificarIntegridad(). 2. Si la integridad es correcta: presenta el LoginForm. 3. Si se detecta corrupcion: abre RestauracionForm en modo de contingencia. 4. El administrador ingresa credenciales validas o la Clave de Recuperacion Maestra. 5. El sistema habilita las opciones de recalcular DVs o restaurar backup.</w:t>
+              <w:t xml:space="preserve">1. Al iniciar, el sistema invoca </w:t>
+            </w:r>
+            <w:proofErr w:type="spellStart"/>
+            <w:r>
+              <w:t>VerificarIntegridad</w:t>
+            </w:r>
+            <w:proofErr w:type="spellEnd"/>
+            <w:r>
+              <w:t>().</w:t>
+            </w:r>
+            <w:r>
+              <w:br/>
+              <w:t xml:space="preserve">2. Si la integridad es correcta: presenta el </w:t>
+            </w:r>
+            <w:proofErr w:type="spellStart"/>
+            <w:r>
+              <w:t>LoginForm</w:t>
+            </w:r>
+            <w:proofErr w:type="spellEnd"/>
+            <w:r>
+              <w:t>.</w:t>
+            </w:r>
+            <w:r>
+              <w:br/>
+              <w:t xml:space="preserve">3. Si se detecta </w:t>
+            </w:r>
+            <w:proofErr w:type="spellStart"/>
+            <w:r>
+              <w:t>corrupcion</w:t>
+            </w:r>
+            <w:proofErr w:type="spellEnd"/>
+            <w:r>
+              <w:t xml:space="preserve">: abre </w:t>
+            </w:r>
+            <w:proofErr w:type="spellStart"/>
+            <w:r>
+              <w:t>RestauracionForm</w:t>
+            </w:r>
+            <w:proofErr w:type="spellEnd"/>
+            <w:r>
+              <w:t xml:space="preserve"> en modo de contingencia.</w:t>
+            </w:r>
+            <w:r>
+              <w:br/>
+              <w:t xml:space="preserve">4. El administrador ingresa credenciales validas o la Clave de </w:t>
+            </w:r>
+            <w:proofErr w:type="spellStart"/>
+            <w:r>
+              <w:t>Recuperacion</w:t>
+            </w:r>
+            <w:proofErr w:type="spellEnd"/>
+            <w:r>
+              <w:t xml:space="preserve"> Maestra.</w:t>
+            </w:r>
+            <w:r>
+              <w:br/>
+              <w:t xml:space="preserve">5. El sistema habilita las opciones de recalcular </w:t>
+            </w:r>
+            <w:proofErr w:type="spellStart"/>
+            <w:r>
+              <w:t>DVs</w:t>
+            </w:r>
+            <w:proofErr w:type="spellEnd"/>
+            <w:r>
+              <w:t xml:space="preserve"> o restaurar </w:t>
+            </w:r>
+            <w:proofErr w:type="spellStart"/>
+            <w:r>
+              <w:t>backup</w:t>
+            </w:r>
+            <w:proofErr w:type="spellEnd"/>
+            <w:r>
+              <w:t>.</w:t>
             </w:r>
           </w:p>
         </w:tc>
@@ -21216,7 +23279,23 @@
               <w:pStyle w:val="Sinespaciado"/>
             </w:pPr>
             <w:r>
-              <w:t>4.1.1. Las credenciales son invalidas: 4.1.2. El sistema muestra 'Credenciales invalidas' y no habilita las opciones de recuperacion. 4.1.3. Retorna al paso 4.</w:t>
+              <w:t>4.1.1. Las credenciales son invalidas:</w:t>
+            </w:r>
+            <w:r>
+              <w:br/>
+              <w:t xml:space="preserve">4.1.2. El sistema muestra 'Credenciales invalidas' y no habilita las opciones de </w:t>
+            </w:r>
+            <w:proofErr w:type="spellStart"/>
+            <w:r>
+              <w:t>recuperacion</w:t>
+            </w:r>
+            <w:proofErr w:type="spellEnd"/>
+            <w:r>
+              <w:t>.</w:t>
+            </w:r>
+            <w:r>
+              <w:br/>
+              <w:t>4.1.3. Retorna al paso 4.</w:t>
             </w:r>
           </w:p>
         </w:tc>
@@ -21257,7 +23336,47 @@
               <w:pStyle w:val="Sinespaciado"/>
             </w:pPr>
             <w:r>
-              <w:t>Si integridad correcta: LoginForm visible. Si hubo corrupcion: administrador con acceso al panel de recuperacion para recalcular DVs o restaurar backup.</w:t>
+              <w:t xml:space="preserve">Si integridad correcta: </w:t>
+            </w:r>
+            <w:proofErr w:type="spellStart"/>
+            <w:r>
+              <w:t>LoginForm</w:t>
+            </w:r>
+            <w:proofErr w:type="spellEnd"/>
+            <w:r>
+              <w:t xml:space="preserve"> visible. Si hubo </w:t>
+            </w:r>
+            <w:proofErr w:type="spellStart"/>
+            <w:r>
+              <w:t>corrupcion</w:t>
+            </w:r>
+            <w:proofErr w:type="spellEnd"/>
+            <w:r>
+              <w:t xml:space="preserve">: administrador con acceso al panel de </w:t>
+            </w:r>
+            <w:proofErr w:type="spellStart"/>
+            <w:r>
+              <w:t>recuperacion</w:t>
+            </w:r>
+            <w:proofErr w:type="spellEnd"/>
+            <w:r>
+              <w:t xml:space="preserve"> para recalcular </w:t>
+            </w:r>
+            <w:proofErr w:type="spellStart"/>
+            <w:r>
+              <w:t>DVs</w:t>
+            </w:r>
+            <w:proofErr w:type="spellEnd"/>
+            <w:r>
+              <w:t xml:space="preserve"> o restaurar </w:t>
+            </w:r>
+            <w:proofErr w:type="spellStart"/>
+            <w:r>
+              <w:t>backup</w:t>
+            </w:r>
+            <w:proofErr w:type="spellEnd"/>
+            <w:r>
+              <w:t>.</w:t>
             </w:r>
           </w:p>
         </w:tc>
@@ -21270,7 +23389,15 @@
       <w:bookmarkStart w:id="146" w:name="_Toc233886241"/>
       <w:r>
         <w:lastRenderedPageBreak/>
-        <w:t>Diagrama de Clases - Digitos Verificadores</w:t>
+        <w:t xml:space="preserve">Diagrama de Clases - </w:t>
+      </w:r>
+      <w:proofErr w:type="spellStart"/>
+      <w:r>
+        <w:t>Digitos</w:t>
+      </w:r>
+      <w:proofErr w:type="spellEnd"/>
+      <w:r>
+        <w:t xml:space="preserve"> Verificadores</w:t>
       </w:r>
       <w:bookmarkEnd w:id="146"/>
     </w:p>
@@ -21338,7 +23465,23 @@
       </w:pPr>
       <w:bookmarkStart w:id="147" w:name="_Toc233886242"/>
       <w:r>
-        <w:t>Diagrama de Entidad Relacion - Digitos Verificadores</w:t>
+        <w:t xml:space="preserve">Diagrama de Entidad </w:t>
+      </w:r>
+      <w:proofErr w:type="spellStart"/>
+      <w:r>
+        <w:t>Relacion</w:t>
+      </w:r>
+      <w:proofErr w:type="spellEnd"/>
+      <w:r>
+        <w:t xml:space="preserve"> - </w:t>
+      </w:r>
+      <w:proofErr w:type="spellStart"/>
+      <w:r>
+        <w:t>Digitos</w:t>
+      </w:r>
+      <w:proofErr w:type="spellEnd"/>
+      <w:r>
+        <w:t xml:space="preserve"> Verificadores</w:t>
       </w:r>
       <w:bookmarkEnd w:id="147"/>
     </w:p>
@@ -21407,7 +23550,13 @@
       <w:bookmarkStart w:id="148" w:name="_Toc233886243"/>
       <w:r>
         <w:lastRenderedPageBreak/>
-        <w:t>Diagrama de Secuencia - Verificacion de Integridad en Arranque</w:t>
+        <w:t xml:space="preserve">Diagrama de Secuencia - </w:t>
+      </w:r>
+      <w:r>
+        <w:t>Verificación</w:t>
+      </w:r>
+      <w:r>
+        <w:t xml:space="preserve"> de Integridad en Arranque</w:t>
       </w:r>
       <w:bookmarkEnd w:id="148"/>
     </w:p>
@@ -21420,10 +23569,10 @@
           <w:noProof/>
         </w:rPr>
         <w:drawing>
-          <wp:inline distT="0" distB="0" distL="0" distR="0" wp14:anchorId="0CA3CB82" wp14:editId="31639CE8">
-            <wp:extent cx="5760720" cy="5333365"/>
-            <wp:effectExtent l="0" t="0" r="0" b="635"/>
-            <wp:docPr id="1302778467" name="Imagen 33"/>
+          <wp:inline distT="0" distB="0" distL="0" distR="0" wp14:anchorId="17AB40BD" wp14:editId="1EE139F0">
+            <wp:extent cx="5753100" cy="6248400"/>
+            <wp:effectExtent l="0" t="0" r="0" b="0"/>
+            <wp:docPr id="1469990241" name="Imagen 2"/>
             <wp:cNvGraphicFramePr>
               <a:graphicFrameLocks xmlns:a="http://schemas.openxmlformats.org/drawingml/2006/main" noChangeAspect="1"/>
             </wp:cNvGraphicFramePr>
@@ -21431,7 +23580,7 @@
               <a:graphicData uri="http://schemas.openxmlformats.org/drawingml/2006/picture">
                 <pic:pic xmlns:pic="http://schemas.openxmlformats.org/drawingml/2006/picture">
                   <pic:nvPicPr>
-                    <pic:cNvPr id="0" name="Picture 66"/>
+                    <pic:cNvPr id="0" name="Picture 2"/>
                     <pic:cNvPicPr>
                       <a:picLocks noChangeAspect="1" noChangeArrowheads="1"/>
                     </pic:cNvPicPr>
@@ -21452,7 +23601,7 @@
                   <pic:spPr bwMode="auto">
                     <a:xfrm>
                       <a:off x="0" y="0"/>
-                      <a:ext cx="5760720" cy="5333365"/>
+                      <a:ext cx="5753100" cy="6248400"/>
                     </a:xfrm>
                     <a:prstGeom prst="rect">
                       <a:avLst/>
@@ -21479,6 +23628,7 @@
       <w:bookmarkStart w:id="150" w:name="_Toc227416513"/>
       <w:bookmarkStart w:id="151" w:name="_Toc233886244"/>
       <w:r>
+        <w:lastRenderedPageBreak/>
         <w:t>A00. Características y funcionalidades adicionales</w:t>
       </w:r>
       <w:bookmarkEnd w:id="149"/>

</xml_diff>

<commit_message>
Doc: agregar fila v3.0 en Historial de Revision de Carpeta de Proyecto
</commit_message>
<xml_diff>
--- a/Documentacion/Carpeta_Proyecto_Stach.docx
+++ b/Documentacion/Carpeta_Proyecto_Stach.docx
@@ -1,5 +1,52 @@
 
-<file path=word/document.xml><?xml version="1.0" encoding="utf-8"?>
+<file path=customXml\item1.xml><?xml version="1.0" encoding="utf-8"?>
+<b:Sources xmlns:b="http://schemas.openxmlformats.org/officeDocument/2006/bibliography" xmlns="http://schemas.openxmlformats.org/officeDocument/2006/bibliography" SelectedStyle="\APASixthEditionOfficeOnline.xsl" StyleName="APA" Version="6"/>
+</file>
+
+<file path=customXml\itemProps1.xml><?xml version="1.0" encoding="utf-8"?>
+<ds:datastoreItem xmlns:ds="http://schemas.openxmlformats.org/officeDocument/2006/customXml" ds:itemID="{A1620483-8240-496A-8E3B-5ED9D0093773}">
+  <ds:schemaRefs>
+    <ds:schemaRef ds:uri="http://schemas.openxmlformats.org/officeDocument/2006/bibliography"/>
+  </ds:schemaRefs>
+</ds:datastoreItem>
+</file>
+
+<file path=docProps\app.xml><?xml version="1.0" encoding="utf-8"?>
+<Properties xmlns="http://schemas.openxmlformats.org/officeDocument/2006/extended-properties" xmlns:vt="http://schemas.openxmlformats.org/officeDocument/2006/docPropsVTypes">
+  <Template>Normal.dotm</Template>
+  <TotalTime>153</TotalTime>
+  <Pages>46</Pages>
+  <Words>7382</Words>
+  <Characters>40603</Characters>
+  <Application>Microsoft Office Word</Application>
+  <DocSecurity>0</DocSecurity>
+  <Lines>338</Lines>
+  <Paragraphs>95</Paragraphs>
+  <ScaleCrop>false</ScaleCrop>
+  <Company/>
+  <LinksUpToDate>false</LinksUpToDate>
+  <CharactersWithSpaces>47890</CharactersWithSpaces>
+  <SharedDoc>false</SharedDoc>
+  <HyperlinksChanged>false</HyperlinksChanged>
+  <AppVersion>16.0000</AppVersion>
+</Properties>
+</file>
+
+<file path=docProps\core.xml><?xml version="1.0" encoding="utf-8"?>
+<cp:coreProperties xmlns:cp="http://schemas.openxmlformats.org/package/2006/metadata/core-properties" xmlns:dc="http://purl.org/dc/elements/1.1/" xmlns:dcterms="http://purl.org/dc/terms/" xmlns:dcmitype="http://purl.org/dc/dcmitype/" xmlns:xsi="http://www.w3.org/2001/XMLSchema-instance">
+  <dc:title/>
+  <dc:subject/>
+  <dc:creator>Smyth, Lautaro Agustin</dc:creator>
+  <cp:keywords/>
+  <dc:description/>
+  <cp:lastModifiedBy>Lautaro Smyth</cp:lastModifiedBy>
+  <cp:revision>472</cp:revision>
+  <dcterms:created xsi:type="dcterms:W3CDTF">2026-04-18T15:50:00Z</dcterms:created>
+  <dcterms:modified xsi:type="dcterms:W3CDTF">2026-07-02T20:38:00Z</dcterms:modified>
+</cp:coreProperties>
+</file>
+
+<file path=word\document.xml><?xml version="1.0" encoding="utf-8"?>
 <w:document xmlns:wpc="http://schemas.microsoft.com/office/word/2010/wordprocessingCanvas" xmlns:cx="http://schemas.microsoft.com/office/drawing/2014/chartex" xmlns:cx1="http://schemas.microsoft.com/office/drawing/2015/9/8/chartex" xmlns:cx2="http://schemas.microsoft.com/office/drawing/2015/10/21/chartex" xmlns:cx3="http://schemas.microsoft.com/office/drawing/2016/5/9/chartex" xmlns:cx4="http://schemas.microsoft.com/office/drawing/2016/5/10/chartex" xmlns:cx5="http://schemas.microsoft.com/office/drawing/2016/5/11/chartex" xmlns:cx6="http://schemas.microsoft.com/office/drawing/2016/5/12/chartex" xmlns:cx7="http://schemas.microsoft.com/office/drawing/2016/5/13/chartex" xmlns:cx8="http://schemas.microsoft.com/office/drawing/2016/5/14/chartex" xmlns:mc="http://schemas.openxmlformats.org/markup-compatibility/2006" xmlns:aink="http://schemas.microsoft.com/office/drawing/2016/ink" xmlns:am3d="http://schemas.microsoft.com/office/drawing/2017/model3d" xmlns:o="urn:schemas-microsoft-com:office:office" xmlns:oel="http://schemas.microsoft.com/office/2019/extlst" xmlns:r="http://schemas.openxmlformats.org/officeDocument/2006/relationships" xmlns:m="http://schemas.openxmlformats.org/officeDocument/2006/math" xmlns:v="urn:schemas-microsoft-com:vml" xmlns:wp14="http://schemas.microsoft.com/office/word/2010/wordprocessingDrawing" xmlns:wp="http://schemas.openxmlformats.org/drawingml/2006/wordprocessingDrawing" xmlns:w10="urn:schemas-microsoft-com:office:word" xmlns:w="http://schemas.openxmlformats.org/wordprocessingml/2006/main" xmlns:w14="http://schemas.microsoft.com/office/word/2010/wordml" xmlns:w15="http://schemas.microsoft.com/office/word/2012/wordml" xmlns:w16cex="http://schemas.microsoft.com/office/word/2018/wordml/cex" xmlns:w16cid="http://schemas.microsoft.com/office/word/2016/wordml/cid" xmlns:w16="http://schemas.microsoft.com/office/word/2018/wordml" xmlns:w16du="http://schemas.microsoft.com/office/word/2023/wordml/word16du" xmlns:w16sdtdh="http://schemas.microsoft.com/office/word/2020/wordml/sdtdatahash" xmlns:w16sdtfl="http://schemas.microsoft.com/office/word/2024/wordml/sdtformatlock" xmlns:w16se="http://schemas.microsoft.com/office/word/2015/wordml/symex" xmlns:wpg="http://schemas.microsoft.com/office/word/2010/wordprocessingGroup" xmlns:wpi="http://schemas.microsoft.com/office/word/2010/wordprocessingInk" xmlns:wne="http://schemas.microsoft.com/office/word/2006/wordml" xmlns:wps="http://schemas.microsoft.com/office/word/2010/wordprocessingShape" mc:Ignorable="w14 w15 w16se w16cid w16 w16cex w16sdtdh w16sdtfl w16du wp14">
   <w:body>
     <w:p>
@@ -9082,6 +9129,48 @@
           </w:p>
         </w:tc>
       </w:tr>
+      <w:tr>
+        <w:tc>
+          <w:tcPr>
+            <w:tcW w:w="1318" w:type="dxa"/>
+          </w:tcPr>
+          <w:p>
+            <w:r>
+              <w:t>02/07/2026</w:t>
+            </w:r>
+          </w:p>
+        </w:tc>
+        <w:tc>
+          <w:tcPr>
+            <w:tcW w:w="1229" w:type="dxa"/>
+          </w:tcPr>
+          <w:p>
+            <w:r>
+              <w:t>3.0</w:t>
+            </w:r>
+          </w:p>
+        </w:tc>
+        <w:tc>
+          <w:tcPr>
+            <w:tcW w:w="1843" w:type="dxa"/>
+          </w:tcPr>
+          <w:p>
+            <w:r>
+              <w:t>Smyth, Lautaro</w:t>
+            </w:r>
+          </w:p>
+        </w:tc>
+        <w:tc>
+          <w:tcPr>
+            <w:tcW w:w="4672" w:type="dxa"/>
+          </w:tcPr>
+          <w:p>
+            <w:r>
+              <w:t>3era Entrega. Protección de permisos del sistema (EsSistema), flujo de contingencia DVV oculto en LoginForm, verificación periódica de integridad en sesión (timer), refactors de thread-safety, MERGE DVV y actualización de documentación CU011.</w:t>
+            </w:r>
+          </w:p>
+        </w:tc>
+      </w:tr>
     </w:tbl>
     <w:p/>
     <w:p>
@@ -23749,7 +23838,7 @@
 </w:document>
 </file>
 
-<file path=word/endnotes.xml><?xml version="1.0" encoding="utf-8"?>
+<file path=word\endnotes.xml><?xml version="1.0" encoding="utf-8"?>
 <w:endnotes xmlns:wpc="http://schemas.microsoft.com/office/word/2010/wordprocessingCanvas" xmlns:cx="http://schemas.microsoft.com/office/drawing/2014/chartex" xmlns:cx1="http://schemas.microsoft.com/office/drawing/2015/9/8/chartex" xmlns:cx2="http://schemas.microsoft.com/office/drawing/2015/10/21/chartex" xmlns:cx3="http://schemas.microsoft.com/office/drawing/2016/5/9/chartex" xmlns:cx4="http://schemas.microsoft.com/office/drawing/2016/5/10/chartex" xmlns:cx5="http://schemas.microsoft.com/office/drawing/2016/5/11/chartex" xmlns:cx6="http://schemas.microsoft.com/office/drawing/2016/5/12/chartex" xmlns:cx7="http://schemas.microsoft.com/office/drawing/2016/5/13/chartex" xmlns:cx8="http://schemas.microsoft.com/office/drawing/2016/5/14/chartex" xmlns:mc="http://schemas.openxmlformats.org/markup-compatibility/2006" xmlns:aink="http://schemas.microsoft.com/office/drawing/2016/ink" xmlns:am3d="http://schemas.microsoft.com/office/drawing/2017/model3d" xmlns:o="urn:schemas-microsoft-com:office:office" xmlns:oel="http://schemas.microsoft.com/office/2019/extlst" xmlns:r="http://schemas.openxmlformats.org/officeDocument/2006/relationships" xmlns:m="http://schemas.openxmlformats.org/officeDocument/2006/math" xmlns:v="urn:schemas-microsoft-com:vml" xmlns:wp14="http://schemas.microsoft.com/office/word/2010/wordprocessingDrawing" xmlns:wp="http://schemas.openxmlformats.org/drawingml/2006/wordprocessingDrawing" xmlns:w10="urn:schemas-microsoft-com:office:word" xmlns:w="http://schemas.openxmlformats.org/wordprocessingml/2006/main" xmlns:w14="http://schemas.microsoft.com/office/word/2010/wordml" xmlns:w15="http://schemas.microsoft.com/office/word/2012/wordml" xmlns:w16cex="http://schemas.microsoft.com/office/word/2018/wordml/cex" xmlns:w16cid="http://schemas.microsoft.com/office/word/2016/wordml/cid" xmlns:w16="http://schemas.microsoft.com/office/word/2018/wordml" xmlns:w16du="http://schemas.microsoft.com/office/word/2023/wordml/word16du" xmlns:w16sdtdh="http://schemas.microsoft.com/office/word/2020/wordml/sdtdatahash" xmlns:w16sdtfl="http://schemas.microsoft.com/office/word/2024/wordml/sdtformatlock" xmlns:w16se="http://schemas.microsoft.com/office/word/2015/wordml/symex" xmlns:wpg="http://schemas.microsoft.com/office/word/2010/wordprocessingGroup" xmlns:wpi="http://schemas.microsoft.com/office/word/2010/wordprocessingInk" xmlns:wne="http://schemas.microsoft.com/office/word/2006/wordml" xmlns:wps="http://schemas.microsoft.com/office/word/2010/wordprocessingShape" mc:Ignorable="w14 w15 w16se w16cid w16 w16cex w16sdtdh w16sdtfl w16du wp14">
   <w:endnote w:type="separator" w:id="-1">
     <w:p>
@@ -23768,7 +23857,74 @@
 </w:endnotes>
 </file>
 
-<file path=word/footnotes.xml><?xml version="1.0" encoding="utf-8"?>
+<file path=word\fontTable.xml><?xml version="1.0" encoding="utf-8"?>
+<w:fonts xmlns:mc="http://schemas.openxmlformats.org/markup-compatibility/2006" xmlns:r="http://schemas.openxmlformats.org/officeDocument/2006/relationships" xmlns:w="http://schemas.openxmlformats.org/wordprocessingml/2006/main" xmlns:w14="http://schemas.microsoft.com/office/word/2010/wordml" xmlns:w15="http://schemas.microsoft.com/office/word/2012/wordml" xmlns:w16cex="http://schemas.microsoft.com/office/word/2018/wordml/cex" xmlns:w16cid="http://schemas.microsoft.com/office/word/2016/wordml/cid" xmlns:w16="http://schemas.microsoft.com/office/word/2018/wordml" xmlns:w16du="http://schemas.microsoft.com/office/word/2023/wordml/word16du" xmlns:w16sdtdh="http://schemas.microsoft.com/office/word/2020/wordml/sdtdatahash" xmlns:w16sdtfl="http://schemas.microsoft.com/office/word/2024/wordml/sdtformatlock" xmlns:w16se="http://schemas.microsoft.com/office/word/2015/wordml/symex" mc:Ignorable="w14 w15 w16se w16cid w16 w16cex w16sdtdh w16sdtfl w16du">
+  <w:font w:name="Symbol">
+    <w:panose1 w:val="05050102010706020507"/>
+    <w:charset w:val="02"/>
+    <w:family w:val="roman"/>
+    <w:pitch w:val="variable"/>
+    <w:sig w:usb0="00000000" w:usb1="10000000" w:usb2="00000000" w:usb3="00000000" w:csb0="80000000" w:csb1="00000000"/>
+  </w:font>
+  <w:font w:name="Times New Roman">
+    <w:panose1 w:val="02020603050405020304"/>
+    <w:charset w:val="00"/>
+    <w:family w:val="roman"/>
+    <w:pitch w:val="variable"/>
+    <w:sig w:usb0="E0002EFF" w:usb1="C000785B" w:usb2="00000009" w:usb3="00000000" w:csb0="000001FF" w:csb1="00000000"/>
+  </w:font>
+  <w:font w:name="Courier New">
+    <w:panose1 w:val="02070309020205020404"/>
+    <w:charset w:val="00"/>
+    <w:family w:val="modern"/>
+    <w:pitch w:val="fixed"/>
+    <w:sig w:usb0="E0002EFF" w:usb1="C0007843" w:usb2="00000009" w:usb3="00000000" w:csb0="000001FF" w:csb1="00000000"/>
+  </w:font>
+  <w:font w:name="Wingdings">
+    <w:panose1 w:val="05000000000000000000"/>
+    <w:charset w:val="02"/>
+    <w:family w:val="auto"/>
+    <w:pitch w:val="variable"/>
+    <w:sig w:usb0="00000000" w:usb1="10000000" w:usb2="00000000" w:usb3="00000000" w:csb0="80000000" w:csb1="00000000"/>
+  </w:font>
+  <w:font w:name="Arial">
+    <w:panose1 w:val="020B0604020202020204"/>
+    <w:charset w:val="00"/>
+    <w:family w:val="swiss"/>
+    <w:pitch w:val="variable"/>
+    <w:sig w:usb0="E0002EFF" w:usb1="C000785B" w:usb2="00000009" w:usb3="00000000" w:csb0="000001FF" w:csb1="00000000"/>
+  </w:font>
+  <w:font w:name="MS Mincho">
+    <w:panose1 w:val="02020609040205080304"/>
+    <w:charset w:val="80"/>
+    <w:family w:val="modern"/>
+    <w:pitch w:val="fixed"/>
+    <w:sig w:usb0="E00002FF" w:usb1="6AC7FDFB" w:usb2="08000012" w:usb3="00000000" w:csb0="0002009F" w:csb1="00000000"/>
+  </w:font>
+  <w:font w:name="MS Gothic">
+    <w:altName w:val="ＭＳ ゴシック"/>
+    <w:panose1 w:val="020B0609070205080204"/>
+    <w:charset w:val="80"/>
+    <w:family w:val="modern"/>
+    <w:pitch w:val="fixed"/>
+    <w:sig w:usb0="E00002FF" w:usb1="6AC7FDFB" w:usb2="08000012" w:usb3="00000000" w:csb0="0002009F" w:csb1="00000000"/>
+  </w:font>
+  <w:font w:name="Aptos">
+    <w:charset w:val="00"/>
+    <w:family w:val="swiss"/>
+    <w:pitch w:val="variable"/>
+    <w:sig w:usb0="20000287" w:usb1="00000003" w:usb2="00000000" w:usb3="00000000" w:csb0="0000019F" w:csb1="00000000"/>
+  </w:font>
+  <w:font w:name="Aptos Display">
+    <w:charset w:val="00"/>
+    <w:family w:val="swiss"/>
+    <w:pitch w:val="variable"/>
+    <w:sig w:usb0="20000287" w:usb1="00000003" w:usb2="00000000" w:usb3="00000000" w:csb0="0000019F" w:csb1="00000000"/>
+  </w:font>
+</w:fonts>
+</file>
+
+<file path=word\footnotes.xml><?xml version="1.0" encoding="utf-8"?>
 <w:footnotes xmlns:wpc="http://schemas.microsoft.com/office/word/2010/wordprocessingCanvas" xmlns:cx="http://schemas.microsoft.com/office/drawing/2014/chartex" xmlns:cx1="http://schemas.microsoft.com/office/drawing/2015/9/8/chartex" xmlns:cx2="http://schemas.microsoft.com/office/drawing/2015/10/21/chartex" xmlns:cx3="http://schemas.microsoft.com/office/drawing/2016/5/9/chartex" xmlns:cx4="http://schemas.microsoft.com/office/drawing/2016/5/10/chartex" xmlns:cx5="http://schemas.microsoft.com/office/drawing/2016/5/11/chartex" xmlns:cx6="http://schemas.microsoft.com/office/drawing/2016/5/12/chartex" xmlns:cx7="http://schemas.microsoft.com/office/drawing/2016/5/13/chartex" xmlns:cx8="http://schemas.microsoft.com/office/drawing/2016/5/14/chartex" xmlns:mc="http://schemas.openxmlformats.org/markup-compatibility/2006" xmlns:aink="http://schemas.microsoft.com/office/drawing/2016/ink" xmlns:am3d="http://schemas.microsoft.com/office/drawing/2017/model3d" xmlns:o="urn:schemas-microsoft-com:office:office" xmlns:oel="http://schemas.microsoft.com/office/2019/extlst" xmlns:r="http://schemas.openxmlformats.org/officeDocument/2006/relationships" xmlns:m="http://schemas.openxmlformats.org/officeDocument/2006/math" xmlns:v="urn:schemas-microsoft-com:vml" xmlns:wp14="http://schemas.microsoft.com/office/word/2010/wordprocessingDrawing" xmlns:wp="http://schemas.openxmlformats.org/drawingml/2006/wordprocessingDrawing" xmlns:w10="urn:schemas-microsoft-com:office:word" xmlns:w="http://schemas.openxmlformats.org/wordprocessingml/2006/main" xmlns:w14="http://schemas.microsoft.com/office/word/2010/wordml" xmlns:w15="http://schemas.microsoft.com/office/word/2012/wordml" xmlns:w16cex="http://schemas.microsoft.com/office/word/2018/wordml/cex" xmlns:w16cid="http://schemas.microsoft.com/office/word/2016/wordml/cid" xmlns:w16="http://schemas.microsoft.com/office/word/2018/wordml" xmlns:w16du="http://schemas.microsoft.com/office/word/2023/wordml/word16du" xmlns:w16sdtdh="http://schemas.microsoft.com/office/word/2020/wordml/sdtdatahash" xmlns:w16sdtfl="http://schemas.microsoft.com/office/word/2024/wordml/sdtformatlock" xmlns:w16se="http://schemas.microsoft.com/office/word/2015/wordml/symex" xmlns:wpg="http://schemas.microsoft.com/office/word/2010/wordprocessingGroup" xmlns:wpi="http://schemas.microsoft.com/office/word/2010/wordprocessingInk" xmlns:wne="http://schemas.microsoft.com/office/word/2006/wordml" xmlns:wps="http://schemas.microsoft.com/office/word/2010/wordprocessingShape" mc:Ignorable="w14 w15 w16se w16cid w16 w16cex w16sdtdh w16sdtfl w16du wp14">
   <w:footnote w:type="separator" w:id="-1">
     <w:p>
@@ -23787,7 +23943,7 @@
 </w:footnotes>
 </file>
 
-<file path=word/header1.xml><?xml version="1.0" encoding="utf-8"?>
+<file path=word\header1.xml><?xml version="1.0" encoding="utf-8"?>
 <w:hdr xmlns:wpc="http://schemas.microsoft.com/office/word/2010/wordprocessingCanvas" xmlns:cx="http://schemas.microsoft.com/office/drawing/2014/chartex" xmlns:cx1="http://schemas.microsoft.com/office/drawing/2015/9/8/chartex" xmlns:cx2="http://schemas.microsoft.com/office/drawing/2015/10/21/chartex" xmlns:cx3="http://schemas.microsoft.com/office/drawing/2016/5/9/chartex" xmlns:cx4="http://schemas.microsoft.com/office/drawing/2016/5/10/chartex" xmlns:cx5="http://schemas.microsoft.com/office/drawing/2016/5/11/chartex" xmlns:cx6="http://schemas.microsoft.com/office/drawing/2016/5/12/chartex" xmlns:cx7="http://schemas.microsoft.com/office/drawing/2016/5/13/chartex" xmlns:cx8="http://schemas.microsoft.com/office/drawing/2016/5/14/chartex" xmlns:mc="http://schemas.openxmlformats.org/markup-compatibility/2006" xmlns:aink="http://schemas.microsoft.com/office/drawing/2016/ink" xmlns:am3d="http://schemas.microsoft.com/office/drawing/2017/model3d" xmlns:o="urn:schemas-microsoft-com:office:office" xmlns:oel="http://schemas.microsoft.com/office/2019/extlst" xmlns:r="http://schemas.openxmlformats.org/officeDocument/2006/relationships" xmlns:m="http://schemas.openxmlformats.org/officeDocument/2006/math" xmlns:v="urn:schemas-microsoft-com:vml" xmlns:wp14="http://schemas.microsoft.com/office/word/2010/wordprocessingDrawing" xmlns:wp="http://schemas.openxmlformats.org/drawingml/2006/wordprocessingDrawing" xmlns:w10="urn:schemas-microsoft-com:office:word" xmlns:w="http://schemas.openxmlformats.org/wordprocessingml/2006/main" xmlns:w14="http://schemas.microsoft.com/office/word/2010/wordml" xmlns:w15="http://schemas.microsoft.com/office/word/2012/wordml" xmlns:w16cex="http://schemas.microsoft.com/office/word/2018/wordml/cex" xmlns:w16cid="http://schemas.microsoft.com/office/word/2016/wordml/cid" xmlns:w16="http://schemas.microsoft.com/office/word/2018/wordml" xmlns:w16du="http://schemas.microsoft.com/office/word/2023/wordml/word16du" xmlns:w16sdtdh="http://schemas.microsoft.com/office/word/2020/wordml/sdtdatahash" xmlns:w16sdtfl="http://schemas.microsoft.com/office/word/2024/wordml/sdtformatlock" xmlns:w16se="http://schemas.microsoft.com/office/word/2015/wordml/symex" xmlns:wpg="http://schemas.microsoft.com/office/word/2010/wordprocessingGroup" xmlns:wpi="http://schemas.microsoft.com/office/word/2010/wordprocessingInk" xmlns:wne="http://schemas.microsoft.com/office/word/2006/wordml" xmlns:wps="http://schemas.microsoft.com/office/word/2010/wordprocessingShape" mc:Ignorable="w14 w15 w16se w16cid w16 w16cex w16sdtdh w16sdtfl w16du wp14">
   <w:sdt>
     <w:sdtPr>
@@ -24534,7 +24690,7 @@
 </w:hdr>
 </file>
 
-<file path=word/numbering.xml><?xml version="1.0" encoding="utf-8"?>
+<file path=word\numbering.xml><?xml version="1.0" encoding="utf-8"?>
 <w:numbering xmlns:wpc="http://schemas.microsoft.com/office/word/2010/wordprocessingCanvas" xmlns:cx="http://schemas.microsoft.com/office/drawing/2014/chartex" xmlns:cx1="http://schemas.microsoft.com/office/drawing/2015/9/8/chartex" xmlns:cx2="http://schemas.microsoft.com/office/drawing/2015/10/21/chartex" xmlns:cx3="http://schemas.microsoft.com/office/drawing/2016/5/9/chartex" xmlns:cx4="http://schemas.microsoft.com/office/drawing/2016/5/10/chartex" xmlns:cx5="http://schemas.microsoft.com/office/drawing/2016/5/11/chartex" xmlns:cx6="http://schemas.microsoft.com/office/drawing/2016/5/12/chartex" xmlns:cx7="http://schemas.microsoft.com/office/drawing/2016/5/13/chartex" xmlns:cx8="http://schemas.microsoft.com/office/drawing/2016/5/14/chartex" xmlns:mc="http://schemas.openxmlformats.org/markup-compatibility/2006" xmlns:aink="http://schemas.microsoft.com/office/drawing/2016/ink" xmlns:am3d="http://schemas.microsoft.com/office/drawing/2017/model3d" xmlns:o="urn:schemas-microsoft-com:office:office" xmlns:oel="http://schemas.microsoft.com/office/2019/extlst" xmlns:r="http://schemas.openxmlformats.org/officeDocument/2006/relationships" xmlns:m="http://schemas.openxmlformats.org/officeDocument/2006/math" xmlns:v="urn:schemas-microsoft-com:vml" xmlns:wp14="http://schemas.microsoft.com/office/word/2010/wordprocessingDrawing" xmlns:wp="http://schemas.openxmlformats.org/drawingml/2006/wordprocessingDrawing" xmlns:w10="urn:schemas-microsoft-com:office:word" xmlns:w="http://schemas.openxmlformats.org/wordprocessingml/2006/main" xmlns:w14="http://schemas.microsoft.com/office/word/2010/wordml" xmlns:w15="http://schemas.microsoft.com/office/word/2012/wordml" xmlns:w16cex="http://schemas.microsoft.com/office/word/2018/wordml/cex" xmlns:w16cid="http://schemas.microsoft.com/office/word/2016/wordml/cid" xmlns:w16="http://schemas.microsoft.com/office/word/2018/wordml" xmlns:w16du="http://schemas.microsoft.com/office/word/2023/wordml/word16du" xmlns:w16sdtdh="http://schemas.microsoft.com/office/word/2020/wordml/sdtdatahash" xmlns:w16sdtfl="http://schemas.microsoft.com/office/word/2024/wordml/sdtformatlock" xmlns:w16se="http://schemas.microsoft.com/office/word/2015/wordml/symex" xmlns:wpg="http://schemas.microsoft.com/office/word/2010/wordprocessingGroup" xmlns:wpi="http://schemas.microsoft.com/office/word/2010/wordprocessingInk" xmlns:wne="http://schemas.microsoft.com/office/word/2006/wordml" xmlns:wps="http://schemas.microsoft.com/office/word/2010/wordprocessingShape" mc:Ignorable="w14 w15 w16se w16cid w16 w16cex w16sdtdh w16sdtfl w16du wp14">
   <w:abstractNum w:abstractNumId="0" w15:restartNumberingAfterBreak="0">
     <w:nsid w:val="FFFFFFFE"/>
@@ -29409,7 +29565,704 @@
 </w:numbering>
 </file>
 
-<file path=word/styles.xml><?xml version="1.0" encoding="utf-8"?>
+<file path=word\settings.xml><?xml version="1.0" encoding="utf-8"?>
+<w:settings xmlns:mc="http://schemas.openxmlformats.org/markup-compatibility/2006" xmlns:o="urn:schemas-microsoft-com:office:office" xmlns:r="http://schemas.openxmlformats.org/officeDocument/2006/relationships" xmlns:m="http://schemas.openxmlformats.org/officeDocument/2006/math" xmlns:v="urn:schemas-microsoft-com:vml" xmlns:w10="urn:schemas-microsoft-com:office:word" xmlns:w="http://schemas.openxmlformats.org/wordprocessingml/2006/main" xmlns:w14="http://schemas.microsoft.com/office/word/2010/wordml" xmlns:w15="http://schemas.microsoft.com/office/word/2012/wordml" xmlns:w16cex="http://schemas.microsoft.com/office/word/2018/wordml/cex" xmlns:w16cid="http://schemas.microsoft.com/office/word/2016/wordml/cid" xmlns:w16="http://schemas.microsoft.com/office/word/2018/wordml" xmlns:w16du="http://schemas.microsoft.com/office/word/2023/wordml/word16du" xmlns:w16sdtdh="http://schemas.microsoft.com/office/word/2020/wordml/sdtdatahash" xmlns:w16sdtfl="http://schemas.microsoft.com/office/word/2024/wordml/sdtformatlock" xmlns:w16se="http://schemas.microsoft.com/office/word/2015/wordml/symex" xmlns:sl="http://schemas.openxmlformats.org/schemaLibrary/2006/main" mc:Ignorable="w14 w15 w16se w16cid w16 w16cex w16sdtdh w16sdtfl w16du">
+  <w:zoom w:percent="100"/>
+  <w:proofState w:spelling="clean"/>
+  <w:defaultTabStop w:val="720"/>
+  <w:hyphenationZone w:val="425"/>
+  <w:characterSpacingControl w:val="doNotCompress"/>
+  <w:hdrShapeDefaults>
+    <o:shapedefaults v:ext="edit" spidmax="2050"/>
+  </w:hdrShapeDefaults>
+  <w:footnotePr>
+    <w:footnote w:id="-1"/>
+    <w:footnote w:id="0"/>
+  </w:footnotePr>
+  <w:endnotePr>
+    <w:endnote w:id="-1"/>
+    <w:endnote w:id="0"/>
+  </w:endnotePr>
+  <w:compat>
+    <w:useFELayout/>
+    <w:compatSetting w:name="compatibilityMode" w:uri="http://schemas.microsoft.com/office/word" w:val="15"/>
+    <w:compatSetting w:name="overrideTableStyleFontSizeAndJustification" w:uri="http://schemas.microsoft.com/office/word" w:val="1"/>
+    <w:compatSetting w:name="enableOpenTypeFeatures" w:uri="http://schemas.microsoft.com/office/word" w:val="1"/>
+    <w:compatSetting w:name="doNotFlipMirrorIndents" w:uri="http://schemas.microsoft.com/office/word" w:val="1"/>
+    <w:compatSetting w:name="differentiateMultirowTableHeaders" w:uri="http://schemas.microsoft.com/office/word" w:val="1"/>
+    <w:compatSetting w:name="useWord2013TrackBottomHyphenation" w:uri="http://schemas.microsoft.com/office/word" w:val="1"/>
+  </w:compat>
+  <w:rsids>
+    <w:rsidRoot w:val="75A1F418"/>
+    <w:rsid w:val="00010D24"/>
+    <w:rsid w:val="00013DE8"/>
+    <w:rsid w:val="00015551"/>
+    <w:rsid w:val="000226B6"/>
+    <w:rsid w:val="00025CD5"/>
+    <w:rsid w:val="000358F8"/>
+    <w:rsid w:val="0004708D"/>
+    <w:rsid w:val="000523AC"/>
+    <w:rsid w:val="000541D2"/>
+    <w:rsid w:val="000561CD"/>
+    <w:rsid w:val="00057C7E"/>
+    <w:rsid w:val="00061E73"/>
+    <w:rsid w:val="00066BD1"/>
+    <w:rsid w:val="000773A2"/>
+    <w:rsid w:val="00080113"/>
+    <w:rsid w:val="00083A3B"/>
+    <w:rsid w:val="00086057"/>
+    <w:rsid w:val="000867D8"/>
+    <w:rsid w:val="00087972"/>
+    <w:rsid w:val="000A447E"/>
+    <w:rsid w:val="000B1C9D"/>
+    <w:rsid w:val="000B61D1"/>
+    <w:rsid w:val="000B69EA"/>
+    <w:rsid w:val="000B7D94"/>
+    <w:rsid w:val="000D2906"/>
+    <w:rsid w:val="000D33CB"/>
+    <w:rsid w:val="000D3787"/>
+    <w:rsid w:val="000D4CFD"/>
+    <w:rsid w:val="000D6F19"/>
+    <w:rsid w:val="000E16A4"/>
+    <w:rsid w:val="000E2CE9"/>
+    <w:rsid w:val="000E3FA0"/>
+    <w:rsid w:val="000E7D3D"/>
+    <w:rsid w:val="000F085C"/>
+    <w:rsid w:val="000F1A55"/>
+    <w:rsid w:val="000F4AD2"/>
+    <w:rsid w:val="000F7CB1"/>
+    <w:rsid w:val="00102165"/>
+    <w:rsid w:val="00102DF1"/>
+    <w:rsid w:val="00112682"/>
+    <w:rsid w:val="00116C14"/>
+    <w:rsid w:val="001177B4"/>
+    <w:rsid w:val="00127D65"/>
+    <w:rsid w:val="00130CAD"/>
+    <w:rsid w:val="00133595"/>
+    <w:rsid w:val="001457B8"/>
+    <w:rsid w:val="0015362B"/>
+    <w:rsid w:val="00153E84"/>
+    <w:rsid w:val="001566C2"/>
+    <w:rsid w:val="00156F7F"/>
+    <w:rsid w:val="00165586"/>
+    <w:rsid w:val="00172EC7"/>
+    <w:rsid w:val="0018157E"/>
+    <w:rsid w:val="0019111C"/>
+    <w:rsid w:val="00194AC0"/>
+    <w:rsid w:val="00196F69"/>
+    <w:rsid w:val="001A2BF7"/>
+    <w:rsid w:val="001A3184"/>
+    <w:rsid w:val="001B2B79"/>
+    <w:rsid w:val="001B4191"/>
+    <w:rsid w:val="001B4F16"/>
+    <w:rsid w:val="001C791B"/>
+    <w:rsid w:val="001D4CF8"/>
+    <w:rsid w:val="001E16AB"/>
+    <w:rsid w:val="001E2A05"/>
+    <w:rsid w:val="001E5FE3"/>
+    <w:rsid w:val="001F3D69"/>
+    <w:rsid w:val="001F4BFC"/>
+    <w:rsid w:val="001F7DDD"/>
+    <w:rsid w:val="0020185A"/>
+    <w:rsid w:val="00201940"/>
+    <w:rsid w:val="002109DA"/>
+    <w:rsid w:val="0021490C"/>
+    <w:rsid w:val="00222D5F"/>
+    <w:rsid w:val="00226088"/>
+    <w:rsid w:val="002271E4"/>
+    <w:rsid w:val="00231B62"/>
+    <w:rsid w:val="00233069"/>
+    <w:rsid w:val="00264456"/>
+    <w:rsid w:val="00265AA7"/>
+    <w:rsid w:val="00275313"/>
+    <w:rsid w:val="002769ED"/>
+    <w:rsid w:val="00276E76"/>
+    <w:rsid w:val="00277838"/>
+    <w:rsid w:val="00280C0F"/>
+    <w:rsid w:val="0028163C"/>
+    <w:rsid w:val="0028377A"/>
+    <w:rsid w:val="00283F93"/>
+    <w:rsid w:val="00287F6E"/>
+    <w:rsid w:val="00296A01"/>
+    <w:rsid w:val="002A27A1"/>
+    <w:rsid w:val="002A58FE"/>
+    <w:rsid w:val="002B34B7"/>
+    <w:rsid w:val="002B6D2B"/>
+    <w:rsid w:val="002B751F"/>
+    <w:rsid w:val="002C21DB"/>
+    <w:rsid w:val="002C33E8"/>
+    <w:rsid w:val="002C56D6"/>
+    <w:rsid w:val="002C71C9"/>
+    <w:rsid w:val="002D3296"/>
+    <w:rsid w:val="002E324C"/>
+    <w:rsid w:val="0030512D"/>
+    <w:rsid w:val="0030721D"/>
+    <w:rsid w:val="00310883"/>
+    <w:rsid w:val="00312545"/>
+    <w:rsid w:val="00312D81"/>
+    <w:rsid w:val="00322376"/>
+    <w:rsid w:val="003226A5"/>
+    <w:rsid w:val="00322A26"/>
+    <w:rsid w:val="00330BFB"/>
+    <w:rsid w:val="00333FDC"/>
+    <w:rsid w:val="00336849"/>
+    <w:rsid w:val="00337E6C"/>
+    <w:rsid w:val="00340746"/>
+    <w:rsid w:val="00340A51"/>
+    <w:rsid w:val="00340C84"/>
+    <w:rsid w:val="003416D5"/>
+    <w:rsid w:val="00355F27"/>
+    <w:rsid w:val="00356A71"/>
+    <w:rsid w:val="00357C6F"/>
+    <w:rsid w:val="00370740"/>
+    <w:rsid w:val="00373233"/>
+    <w:rsid w:val="0038379A"/>
+    <w:rsid w:val="00385091"/>
+    <w:rsid w:val="00385EB1"/>
+    <w:rsid w:val="00395AE5"/>
+    <w:rsid w:val="0039759F"/>
+    <w:rsid w:val="003B0ED2"/>
+    <w:rsid w:val="003B42B5"/>
+    <w:rsid w:val="003B538A"/>
+    <w:rsid w:val="003C15AF"/>
+    <w:rsid w:val="003C278D"/>
+    <w:rsid w:val="003C6026"/>
+    <w:rsid w:val="003C624A"/>
+    <w:rsid w:val="003C6530"/>
+    <w:rsid w:val="003C6952"/>
+    <w:rsid w:val="003D1B5B"/>
+    <w:rsid w:val="003D2207"/>
+    <w:rsid w:val="003D7911"/>
+    <w:rsid w:val="003E2EA7"/>
+    <w:rsid w:val="003E331E"/>
+    <w:rsid w:val="003E560C"/>
+    <w:rsid w:val="003F14AF"/>
+    <w:rsid w:val="003F5C33"/>
+    <w:rsid w:val="00410CA4"/>
+    <w:rsid w:val="00412BAC"/>
+    <w:rsid w:val="00414F9C"/>
+    <w:rsid w:val="0041750F"/>
+    <w:rsid w:val="00417C03"/>
+    <w:rsid w:val="00421841"/>
+    <w:rsid w:val="00422F20"/>
+    <w:rsid w:val="004351BD"/>
+    <w:rsid w:val="00442FA3"/>
+    <w:rsid w:val="00443767"/>
+    <w:rsid w:val="004463D9"/>
+    <w:rsid w:val="00447F29"/>
+    <w:rsid w:val="00451ED1"/>
+    <w:rsid w:val="00454AD9"/>
+    <w:rsid w:val="00462644"/>
+    <w:rsid w:val="004802D7"/>
+    <w:rsid w:val="004806F1"/>
+    <w:rsid w:val="00494E43"/>
+    <w:rsid w:val="004953FC"/>
+    <w:rsid w:val="004A1E39"/>
+    <w:rsid w:val="004A59BE"/>
+    <w:rsid w:val="004A76C7"/>
+    <w:rsid w:val="004B3AC6"/>
+    <w:rsid w:val="004C3BF5"/>
+    <w:rsid w:val="004C69B4"/>
+    <w:rsid w:val="004E3626"/>
+    <w:rsid w:val="004F1638"/>
+    <w:rsid w:val="004F610D"/>
+    <w:rsid w:val="004F7E95"/>
+    <w:rsid w:val="004F7FD0"/>
+    <w:rsid w:val="00501D9A"/>
+    <w:rsid w:val="00514B07"/>
+    <w:rsid w:val="00531336"/>
+    <w:rsid w:val="005319D8"/>
+    <w:rsid w:val="0053437D"/>
+    <w:rsid w:val="0053723A"/>
+    <w:rsid w:val="005470CD"/>
+    <w:rsid w:val="0054740B"/>
+    <w:rsid w:val="005522E7"/>
+    <w:rsid w:val="005741E1"/>
+    <w:rsid w:val="00574589"/>
+    <w:rsid w:val="005839AF"/>
+    <w:rsid w:val="00592686"/>
+    <w:rsid w:val="0059362D"/>
+    <w:rsid w:val="00594368"/>
+    <w:rsid w:val="00596F0F"/>
+    <w:rsid w:val="005A1467"/>
+    <w:rsid w:val="005A661D"/>
+    <w:rsid w:val="005B04D2"/>
+    <w:rsid w:val="005B4098"/>
+    <w:rsid w:val="005B5144"/>
+    <w:rsid w:val="005B5A45"/>
+    <w:rsid w:val="005B5D56"/>
+    <w:rsid w:val="005B6E30"/>
+    <w:rsid w:val="005B7648"/>
+    <w:rsid w:val="005C111C"/>
+    <w:rsid w:val="005C1A7B"/>
+    <w:rsid w:val="005C4CB2"/>
+    <w:rsid w:val="005C5F84"/>
+    <w:rsid w:val="005D2698"/>
+    <w:rsid w:val="005D38F2"/>
+    <w:rsid w:val="005D3C4A"/>
+    <w:rsid w:val="005D53F2"/>
+    <w:rsid w:val="005D79EB"/>
+    <w:rsid w:val="005E6362"/>
+    <w:rsid w:val="005E7927"/>
+    <w:rsid w:val="005F2787"/>
+    <w:rsid w:val="005F5A65"/>
+    <w:rsid w:val="006127E5"/>
+    <w:rsid w:val="00613F07"/>
+    <w:rsid w:val="00622AD3"/>
+    <w:rsid w:val="00623882"/>
+    <w:rsid w:val="006340DF"/>
+    <w:rsid w:val="006425F9"/>
+    <w:rsid w:val="00660514"/>
+    <w:rsid w:val="006614A0"/>
+    <w:rsid w:val="00661FC3"/>
+    <w:rsid w:val="00675777"/>
+    <w:rsid w:val="0068328A"/>
+    <w:rsid w:val="00692A74"/>
+    <w:rsid w:val="00694EF3"/>
+    <w:rsid w:val="006A0915"/>
+    <w:rsid w:val="006A12D7"/>
+    <w:rsid w:val="006A40D1"/>
+    <w:rsid w:val="006A6A24"/>
+    <w:rsid w:val="006B2DE6"/>
+    <w:rsid w:val="006B4386"/>
+    <w:rsid w:val="006B5C0C"/>
+    <w:rsid w:val="006C41CD"/>
+    <w:rsid w:val="006C4ACD"/>
+    <w:rsid w:val="006C5B57"/>
+    <w:rsid w:val="006D0963"/>
+    <w:rsid w:val="006D3FDF"/>
+    <w:rsid w:val="006D5D23"/>
+    <w:rsid w:val="006E258A"/>
+    <w:rsid w:val="006E31CE"/>
+    <w:rsid w:val="006F5342"/>
+    <w:rsid w:val="007030BC"/>
+    <w:rsid w:val="00706927"/>
+    <w:rsid w:val="0070704F"/>
+    <w:rsid w:val="00712D13"/>
+    <w:rsid w:val="0071534D"/>
+    <w:rsid w:val="0071691A"/>
+    <w:rsid w:val="007218E0"/>
+    <w:rsid w:val="007226D2"/>
+    <w:rsid w:val="00726BEA"/>
+    <w:rsid w:val="00730250"/>
+    <w:rsid w:val="007310E5"/>
+    <w:rsid w:val="007364B4"/>
+    <w:rsid w:val="00740198"/>
+    <w:rsid w:val="00740CCC"/>
+    <w:rsid w:val="007460B5"/>
+    <w:rsid w:val="00746383"/>
+    <w:rsid w:val="00746720"/>
+    <w:rsid w:val="00747F86"/>
+    <w:rsid w:val="00752C16"/>
+    <w:rsid w:val="00753658"/>
+    <w:rsid w:val="007674B2"/>
+    <w:rsid w:val="00784A4E"/>
+    <w:rsid w:val="00790752"/>
+    <w:rsid w:val="00795AC5"/>
+    <w:rsid w:val="007A063E"/>
+    <w:rsid w:val="007A0C85"/>
+    <w:rsid w:val="007A3EC3"/>
+    <w:rsid w:val="007A49CF"/>
+    <w:rsid w:val="007A5B57"/>
+    <w:rsid w:val="007A6BA8"/>
+    <w:rsid w:val="007B7D60"/>
+    <w:rsid w:val="007C3561"/>
+    <w:rsid w:val="007C5A73"/>
+    <w:rsid w:val="007D2E7B"/>
+    <w:rsid w:val="007D48AF"/>
+    <w:rsid w:val="007D4D54"/>
+    <w:rsid w:val="007D5B6B"/>
+    <w:rsid w:val="007E59A7"/>
+    <w:rsid w:val="007E69AA"/>
+    <w:rsid w:val="007F0545"/>
+    <w:rsid w:val="007F393C"/>
+    <w:rsid w:val="007F41B0"/>
+    <w:rsid w:val="007F45E7"/>
+    <w:rsid w:val="007F6923"/>
+    <w:rsid w:val="00802771"/>
+    <w:rsid w:val="0080529B"/>
+    <w:rsid w:val="00806272"/>
+    <w:rsid w:val="00807549"/>
+    <w:rsid w:val="00811595"/>
+    <w:rsid w:val="00811EAF"/>
+    <w:rsid w:val="008169E7"/>
+    <w:rsid w:val="00827423"/>
+    <w:rsid w:val="00835DDB"/>
+    <w:rsid w:val="008379BE"/>
+    <w:rsid w:val="00844E2E"/>
+    <w:rsid w:val="0085031B"/>
+    <w:rsid w:val="00850A64"/>
+    <w:rsid w:val="00850C38"/>
+    <w:rsid w:val="0086163C"/>
+    <w:rsid w:val="008672CC"/>
+    <w:rsid w:val="00867EA3"/>
+    <w:rsid w:val="00882EFB"/>
+    <w:rsid w:val="00885392"/>
+    <w:rsid w:val="0089203E"/>
+    <w:rsid w:val="0089279A"/>
+    <w:rsid w:val="0089442B"/>
+    <w:rsid w:val="0089510B"/>
+    <w:rsid w:val="00896927"/>
+    <w:rsid w:val="008A5E61"/>
+    <w:rsid w:val="008C0878"/>
+    <w:rsid w:val="008C29A4"/>
+    <w:rsid w:val="008C402E"/>
+    <w:rsid w:val="008C512C"/>
+    <w:rsid w:val="008D12D7"/>
+    <w:rsid w:val="008D6E4F"/>
+    <w:rsid w:val="008D7712"/>
+    <w:rsid w:val="008E21AD"/>
+    <w:rsid w:val="008E2721"/>
+    <w:rsid w:val="008E708A"/>
+    <w:rsid w:val="008F7511"/>
+    <w:rsid w:val="00906491"/>
+    <w:rsid w:val="009110AD"/>
+    <w:rsid w:val="00913D20"/>
+    <w:rsid w:val="009147B4"/>
+    <w:rsid w:val="0091613F"/>
+    <w:rsid w:val="00916861"/>
+    <w:rsid w:val="009225CB"/>
+    <w:rsid w:val="009266E0"/>
+    <w:rsid w:val="00931A2A"/>
+    <w:rsid w:val="0093520F"/>
+    <w:rsid w:val="0093788E"/>
+    <w:rsid w:val="009430F1"/>
+    <w:rsid w:val="009477CD"/>
+    <w:rsid w:val="00957ED6"/>
+    <w:rsid w:val="0096367E"/>
+    <w:rsid w:val="009657AC"/>
+    <w:rsid w:val="0096663B"/>
+    <w:rsid w:val="009728B8"/>
+    <w:rsid w:val="00974698"/>
+    <w:rsid w:val="00981CBD"/>
+    <w:rsid w:val="00986671"/>
+    <w:rsid w:val="0099242C"/>
+    <w:rsid w:val="00992B32"/>
+    <w:rsid w:val="00992CC8"/>
+    <w:rsid w:val="009930C4"/>
+    <w:rsid w:val="009932D8"/>
+    <w:rsid w:val="009953F5"/>
+    <w:rsid w:val="009A36E4"/>
+    <w:rsid w:val="009A74D8"/>
+    <w:rsid w:val="009A79BD"/>
+    <w:rsid w:val="009B125D"/>
+    <w:rsid w:val="009B2002"/>
+    <w:rsid w:val="009B716B"/>
+    <w:rsid w:val="009B7A58"/>
+    <w:rsid w:val="00A003EA"/>
+    <w:rsid w:val="00A018D0"/>
+    <w:rsid w:val="00A02BE9"/>
+    <w:rsid w:val="00A02ECE"/>
+    <w:rsid w:val="00A04433"/>
+    <w:rsid w:val="00A05F84"/>
+    <w:rsid w:val="00A14C97"/>
+    <w:rsid w:val="00A14E6A"/>
+    <w:rsid w:val="00A17483"/>
+    <w:rsid w:val="00A17A3A"/>
+    <w:rsid w:val="00A2157C"/>
+    <w:rsid w:val="00A25F41"/>
+    <w:rsid w:val="00A36598"/>
+    <w:rsid w:val="00A51A54"/>
+    <w:rsid w:val="00A5485B"/>
+    <w:rsid w:val="00A60A3B"/>
+    <w:rsid w:val="00A641D0"/>
+    <w:rsid w:val="00A65A90"/>
+    <w:rsid w:val="00A7309D"/>
+    <w:rsid w:val="00A74607"/>
+    <w:rsid w:val="00A8051D"/>
+    <w:rsid w:val="00A81F75"/>
+    <w:rsid w:val="00A82CAD"/>
+    <w:rsid w:val="00A84A88"/>
+    <w:rsid w:val="00A904A3"/>
+    <w:rsid w:val="00A90C7C"/>
+    <w:rsid w:val="00A92E54"/>
+    <w:rsid w:val="00A94E5F"/>
+    <w:rsid w:val="00A95EB4"/>
+    <w:rsid w:val="00A97CDB"/>
+    <w:rsid w:val="00AA4AE3"/>
+    <w:rsid w:val="00AA4F49"/>
+    <w:rsid w:val="00AA549C"/>
+    <w:rsid w:val="00AB2B24"/>
+    <w:rsid w:val="00AB7E9A"/>
+    <w:rsid w:val="00AC07FF"/>
+    <w:rsid w:val="00AD3BEF"/>
+    <w:rsid w:val="00AD51AF"/>
+    <w:rsid w:val="00AD6550"/>
+    <w:rsid w:val="00AF6546"/>
+    <w:rsid w:val="00B04591"/>
+    <w:rsid w:val="00B04C77"/>
+    <w:rsid w:val="00B0660D"/>
+    <w:rsid w:val="00B15BC5"/>
+    <w:rsid w:val="00B17E42"/>
+    <w:rsid w:val="00B2037E"/>
+    <w:rsid w:val="00B22C49"/>
+    <w:rsid w:val="00B2591B"/>
+    <w:rsid w:val="00B263BE"/>
+    <w:rsid w:val="00B26CFE"/>
+    <w:rsid w:val="00B3057E"/>
+    <w:rsid w:val="00B3429F"/>
+    <w:rsid w:val="00B34A96"/>
+    <w:rsid w:val="00B40685"/>
+    <w:rsid w:val="00B4217E"/>
+    <w:rsid w:val="00B43E67"/>
+    <w:rsid w:val="00B43F1B"/>
+    <w:rsid w:val="00B608E5"/>
+    <w:rsid w:val="00B642FE"/>
+    <w:rsid w:val="00B64ACB"/>
+    <w:rsid w:val="00B74DED"/>
+    <w:rsid w:val="00B81938"/>
+    <w:rsid w:val="00B84DA5"/>
+    <w:rsid w:val="00B96E3C"/>
+    <w:rsid w:val="00BA5DD0"/>
+    <w:rsid w:val="00BB4641"/>
+    <w:rsid w:val="00BB5186"/>
+    <w:rsid w:val="00BC0B24"/>
+    <w:rsid w:val="00BC3856"/>
+    <w:rsid w:val="00BC49BE"/>
+    <w:rsid w:val="00BC6D13"/>
+    <w:rsid w:val="00BD3E74"/>
+    <w:rsid w:val="00BD77D9"/>
+    <w:rsid w:val="00BE5733"/>
+    <w:rsid w:val="00BE64B0"/>
+    <w:rsid w:val="00C0001B"/>
+    <w:rsid w:val="00C02435"/>
+    <w:rsid w:val="00C04435"/>
+    <w:rsid w:val="00C20CA2"/>
+    <w:rsid w:val="00C2745E"/>
+    <w:rsid w:val="00C34985"/>
+    <w:rsid w:val="00C36E72"/>
+    <w:rsid w:val="00C37279"/>
+    <w:rsid w:val="00C46D12"/>
+    <w:rsid w:val="00C54E01"/>
+    <w:rsid w:val="00C605A5"/>
+    <w:rsid w:val="00C61726"/>
+    <w:rsid w:val="00C62FB5"/>
+    <w:rsid w:val="00C66048"/>
+    <w:rsid w:val="00C7281E"/>
+    <w:rsid w:val="00C72B78"/>
+    <w:rsid w:val="00C7391F"/>
+    <w:rsid w:val="00C84D6C"/>
+    <w:rsid w:val="00C92CAD"/>
+    <w:rsid w:val="00C9574D"/>
+    <w:rsid w:val="00CA3222"/>
+    <w:rsid w:val="00CA3380"/>
+    <w:rsid w:val="00CA61B5"/>
+    <w:rsid w:val="00CA7FE9"/>
+    <w:rsid w:val="00CB4FCC"/>
+    <w:rsid w:val="00CB6185"/>
+    <w:rsid w:val="00CB63FE"/>
+    <w:rsid w:val="00CB6F8C"/>
+    <w:rsid w:val="00CB7BEF"/>
+    <w:rsid w:val="00CC2B7B"/>
+    <w:rsid w:val="00CC3361"/>
+    <w:rsid w:val="00CC3E4E"/>
+    <w:rsid w:val="00CC65EE"/>
+    <w:rsid w:val="00CD7652"/>
+    <w:rsid w:val="00CD7D48"/>
+    <w:rsid w:val="00CE048E"/>
+    <w:rsid w:val="00CF0255"/>
+    <w:rsid w:val="00CF0C14"/>
+    <w:rsid w:val="00CF4DC3"/>
+    <w:rsid w:val="00CF56A4"/>
+    <w:rsid w:val="00D033B5"/>
+    <w:rsid w:val="00D13B29"/>
+    <w:rsid w:val="00D13FBB"/>
+    <w:rsid w:val="00D16250"/>
+    <w:rsid w:val="00D25696"/>
+    <w:rsid w:val="00D3733D"/>
+    <w:rsid w:val="00D41DCC"/>
+    <w:rsid w:val="00D43785"/>
+    <w:rsid w:val="00D60C9B"/>
+    <w:rsid w:val="00D63C61"/>
+    <w:rsid w:val="00D662CE"/>
+    <w:rsid w:val="00D6709A"/>
+    <w:rsid w:val="00D73ED2"/>
+    <w:rsid w:val="00D8183E"/>
+    <w:rsid w:val="00D842E5"/>
+    <w:rsid w:val="00D84F8E"/>
+    <w:rsid w:val="00D86FEF"/>
+    <w:rsid w:val="00D904CA"/>
+    <w:rsid w:val="00D95E4D"/>
+    <w:rsid w:val="00DA3474"/>
+    <w:rsid w:val="00DB1323"/>
+    <w:rsid w:val="00DB4D16"/>
+    <w:rsid w:val="00DB7B80"/>
+    <w:rsid w:val="00DC065E"/>
+    <w:rsid w:val="00DC1A22"/>
+    <w:rsid w:val="00DE07B7"/>
+    <w:rsid w:val="00DE315C"/>
+    <w:rsid w:val="00DE3BDB"/>
+    <w:rsid w:val="00DF14ED"/>
+    <w:rsid w:val="00DF6AFC"/>
+    <w:rsid w:val="00E00FE3"/>
+    <w:rsid w:val="00E011ED"/>
+    <w:rsid w:val="00E06594"/>
+    <w:rsid w:val="00E16339"/>
+    <w:rsid w:val="00E20304"/>
+    <w:rsid w:val="00E24A35"/>
+    <w:rsid w:val="00E403D4"/>
+    <w:rsid w:val="00E40C0E"/>
+    <w:rsid w:val="00E456B8"/>
+    <w:rsid w:val="00E513A5"/>
+    <w:rsid w:val="00E54F5E"/>
+    <w:rsid w:val="00E64440"/>
+    <w:rsid w:val="00E67F63"/>
+    <w:rsid w:val="00E8127C"/>
+    <w:rsid w:val="00E86B7C"/>
+    <w:rsid w:val="00E91464"/>
+    <w:rsid w:val="00E93C81"/>
+    <w:rsid w:val="00EA22E9"/>
+    <w:rsid w:val="00EA6297"/>
+    <w:rsid w:val="00EA7CA6"/>
+    <w:rsid w:val="00EB186D"/>
+    <w:rsid w:val="00EB34F2"/>
+    <w:rsid w:val="00EB3AEE"/>
+    <w:rsid w:val="00EB6131"/>
+    <w:rsid w:val="00EB6732"/>
+    <w:rsid w:val="00EC06EA"/>
+    <w:rsid w:val="00EC252C"/>
+    <w:rsid w:val="00EC4DF9"/>
+    <w:rsid w:val="00ED1E53"/>
+    <w:rsid w:val="00ED2A71"/>
+    <w:rsid w:val="00ED65D7"/>
+    <w:rsid w:val="00EE1C00"/>
+    <w:rsid w:val="00EE5FE9"/>
+    <w:rsid w:val="00EF18D2"/>
+    <w:rsid w:val="00EF377E"/>
+    <w:rsid w:val="00EF617E"/>
+    <w:rsid w:val="00EF6306"/>
+    <w:rsid w:val="00EF7A6B"/>
+    <w:rsid w:val="00F02CA9"/>
+    <w:rsid w:val="00F02EC1"/>
+    <w:rsid w:val="00F07D09"/>
+    <w:rsid w:val="00F12D3C"/>
+    <w:rsid w:val="00F144E0"/>
+    <w:rsid w:val="00F17227"/>
+    <w:rsid w:val="00F37444"/>
+    <w:rsid w:val="00F4268B"/>
+    <w:rsid w:val="00F44890"/>
+    <w:rsid w:val="00F57BAE"/>
+    <w:rsid w:val="00F60617"/>
+    <w:rsid w:val="00F62698"/>
+    <w:rsid w:val="00F636E2"/>
+    <w:rsid w:val="00F6581D"/>
+    <w:rsid w:val="00F72C3F"/>
+    <w:rsid w:val="00F75C52"/>
+    <w:rsid w:val="00F76172"/>
+    <w:rsid w:val="00F77E56"/>
+    <w:rsid w:val="00F819BA"/>
+    <w:rsid w:val="00F81AAF"/>
+    <w:rsid w:val="00F84269"/>
+    <w:rsid w:val="00F8430F"/>
+    <w:rsid w:val="00F8532B"/>
+    <w:rsid w:val="00F93B6C"/>
+    <w:rsid w:val="00FA0569"/>
+    <w:rsid w:val="00FA2AB0"/>
+    <w:rsid w:val="00FA3F3C"/>
+    <w:rsid w:val="00FA4716"/>
+    <w:rsid w:val="00FB525E"/>
+    <w:rsid w:val="00FC0369"/>
+    <w:rsid w:val="00FD2D1C"/>
+    <w:rsid w:val="00FD3D53"/>
+    <w:rsid w:val="00FE35F0"/>
+    <w:rsid w:val="00FE4D32"/>
+    <w:rsid w:val="00FE537F"/>
+    <w:rsid w:val="00FF596B"/>
+    <w:rsid w:val="00FF7BFB"/>
+    <w:rsid w:val="03A4329B"/>
+    <w:rsid w:val="04AD31E8"/>
+    <w:rsid w:val="073E916A"/>
+    <w:rsid w:val="08D34EEF"/>
+    <w:rsid w:val="0BB933F6"/>
+    <w:rsid w:val="0D2843C3"/>
+    <w:rsid w:val="0D51526E"/>
+    <w:rsid w:val="0E0E1D42"/>
+    <w:rsid w:val="11D0EDD1"/>
+    <w:rsid w:val="139C564D"/>
+    <w:rsid w:val="14655733"/>
+    <w:rsid w:val="16003260"/>
+    <w:rsid w:val="162B9687"/>
+    <w:rsid w:val="1C50BB76"/>
+    <w:rsid w:val="1F9E2E98"/>
+    <w:rsid w:val="21399A99"/>
+    <w:rsid w:val="27FD9BAA"/>
+    <w:rsid w:val="28474E09"/>
+    <w:rsid w:val="2B58CA36"/>
+    <w:rsid w:val="2B7435A4"/>
+    <w:rsid w:val="2FF0749F"/>
+    <w:rsid w:val="31923121"/>
+    <w:rsid w:val="349608E2"/>
+    <w:rsid w:val="34E6C9C7"/>
+    <w:rsid w:val="356D4A1F"/>
+    <w:rsid w:val="3661B5D4"/>
+    <w:rsid w:val="3675770C"/>
+    <w:rsid w:val="3853C886"/>
+    <w:rsid w:val="38F62B2F"/>
+    <w:rsid w:val="38F8294E"/>
+    <w:rsid w:val="3947F202"/>
+    <w:rsid w:val="3CA5AA0E"/>
+    <w:rsid w:val="3F4400B2"/>
+    <w:rsid w:val="406A7FFC"/>
+    <w:rsid w:val="40A8E098"/>
+    <w:rsid w:val="49DE4A77"/>
+    <w:rsid w:val="4A3DE591"/>
+    <w:rsid w:val="4BDB3197"/>
+    <w:rsid w:val="4EF545DC"/>
+    <w:rsid w:val="4FE90BB5"/>
+    <w:rsid w:val="5165673F"/>
+    <w:rsid w:val="531A09D2"/>
+    <w:rsid w:val="58AA336C"/>
+    <w:rsid w:val="58C9E2B9"/>
+    <w:rsid w:val="59587B6F"/>
+    <w:rsid w:val="60DC5949"/>
+    <w:rsid w:val="61EE5C66"/>
+    <w:rsid w:val="66FC6013"/>
+    <w:rsid w:val="69FAF4B2"/>
+    <w:rsid w:val="6ACD96F3"/>
+    <w:rsid w:val="6EF8BBAB"/>
+    <w:rsid w:val="6F0D20DB"/>
+    <w:rsid w:val="71F668A6"/>
+    <w:rsid w:val="72809725"/>
+    <w:rsid w:val="73CF1D74"/>
+    <w:rsid w:val="748298C2"/>
+    <w:rsid w:val="75A1F418"/>
+    <w:rsid w:val="77E2EAF4"/>
+    <w:rsid w:val="7BD006B3"/>
+    <w:rsid w:val="7C306EE1"/>
+    <w:rsid w:val="7EBBA0A1"/>
+    <w:rsid w:val="7F8A9A1C"/>
+    <w:rsid w:val="7F92B352"/>
+  </w:rsids>
+  <m:mathPr>
+    <m:mathFont m:val="Cambria Math"/>
+    <m:brkBin m:val="before"/>
+    <m:brkBinSub m:val="--"/>
+    <m:smallFrac m:val="0"/>
+    <m:dispDef/>
+    <m:lMargin m:val="0"/>
+    <m:rMargin m:val="0"/>
+    <m:defJc m:val="centerGroup"/>
+    <m:wrapIndent m:val="1440"/>
+    <m:intLim m:val="subSup"/>
+    <m:naryLim m:val="undOvr"/>
+  </m:mathPr>
+  <w:themeFontLang w:val="en-US" w:eastAsia="ja-JP" w:bidi="ar-SA"/>
+  <w:clrSchemeMapping w:bg1="light1" w:t1="dark1" w:bg2="light2" w:t2="dark2" w:accent1="accent1" w:accent2="accent2" w:accent3="accent3" w:accent4="accent4" w:accent5="accent5" w:accent6="accent6" w:hyperlink="hyperlink" w:followedHyperlink="followedHyperlink"/>
+  <w:shapeDefaults>
+    <o:shapedefaults v:ext="edit" spidmax="2050"/>
+    <o:shapelayout v:ext="edit">
+      <o:idmap v:ext="edit" data="2"/>
+    </o:shapelayout>
+  </w:shapeDefaults>
+  <w:decimalSymbol w:val=","/>
+  <w:listSeparator w:val=";"/>
+  <w14:docId w14:val="6C7B0F93"/>
+  <w15:chartTrackingRefBased/>
+  <w15:docId w15:val="{D2E69AFD-AE41-47FC-96B2-31EE139E1A8F}"/>
+</w:settings>
+</file>
+
+<file path=word\styles.xml><?xml version="1.0" encoding="utf-8"?>
 <w:styles xmlns:mc="http://schemas.openxmlformats.org/markup-compatibility/2006" xmlns:r="http://schemas.openxmlformats.org/officeDocument/2006/relationships" xmlns:w="http://schemas.openxmlformats.org/wordprocessingml/2006/main" xmlns:w14="http://schemas.microsoft.com/office/word/2010/wordml" xmlns:w15="http://schemas.microsoft.com/office/word/2012/wordml" xmlns:w16cex="http://schemas.microsoft.com/office/word/2018/wordml/cex" xmlns:w16cid="http://schemas.microsoft.com/office/word/2016/wordml/cid" xmlns:w16="http://schemas.microsoft.com/office/word/2018/wordml" xmlns:w16du="http://schemas.microsoft.com/office/word/2023/wordml/word16du" xmlns:w16sdtdh="http://schemas.microsoft.com/office/word/2020/wordml/sdtdatahash" xmlns:w16sdtfl="http://schemas.microsoft.com/office/word/2024/wordml/sdtformatlock" xmlns:w16se="http://schemas.microsoft.com/office/word/2015/wordml/symex" mc:Ignorable="w14 w15 w16se w16cid w16 w16cex w16sdtdh w16sdtfl w16du">
   <w:docDefaults>
     <w:rPrDefault>
@@ -30371,7 +31224,7 @@
 </w:styles>
 </file>
 
-<file path=word/theme/theme1.xml><?xml version="1.0" encoding="utf-8"?>
+<file path=word\theme\theme1.xml><?xml version="1.0" encoding="utf-8"?>
 <a:theme xmlns:a="http://schemas.openxmlformats.org/drawingml/2006/main" name="Office Theme">
   <a:themeElements>
     <a:clrScheme name="Office">
@@ -30632,14 +31485,10 @@
 </a:theme>
 </file>
 
-<file path=customXml/item1.xml><?xml version="1.0" encoding="utf-8"?>
-<b:Sources xmlns:b="http://schemas.openxmlformats.org/officeDocument/2006/bibliography" xmlns="http://schemas.openxmlformats.org/officeDocument/2006/bibliography" SelectedStyle="\APASixthEditionOfficeOnline.xsl" StyleName="APA" Version="6"/>
-</file>
-
-<file path=customXml/itemProps1.xml><?xml version="1.0" encoding="utf-8"?>
-<ds:datastoreItem xmlns:ds="http://schemas.openxmlformats.org/officeDocument/2006/customXml" ds:itemID="{A1620483-8240-496A-8E3B-5ED9D0093773}">
-  <ds:schemaRefs>
-    <ds:schemaRef ds:uri="http://schemas.openxmlformats.org/officeDocument/2006/bibliography"/>
-  </ds:schemaRefs>
-</ds:datastoreItem>
+<file path=word\webSettings.xml><?xml version="1.0" encoding="utf-8"?>
+<w:webSettings xmlns:mc="http://schemas.openxmlformats.org/markup-compatibility/2006" xmlns:r="http://schemas.openxmlformats.org/officeDocument/2006/relationships" xmlns:w="http://schemas.openxmlformats.org/wordprocessingml/2006/main" xmlns:w14="http://schemas.microsoft.com/office/word/2010/wordml" xmlns:w15="http://schemas.microsoft.com/office/word/2012/wordml" xmlns:w16cex="http://schemas.microsoft.com/office/word/2018/wordml/cex" xmlns:w16cid="http://schemas.microsoft.com/office/word/2016/wordml/cid" xmlns:w16="http://schemas.microsoft.com/office/word/2018/wordml" xmlns:w16du="http://schemas.microsoft.com/office/word/2023/wordml/word16du" xmlns:w16sdtdh="http://schemas.microsoft.com/office/word/2020/wordml/sdtdatahash" xmlns:w16sdtfl="http://schemas.microsoft.com/office/word/2024/wordml/sdtformatlock" xmlns:w16se="http://schemas.microsoft.com/office/word/2015/wordml/symex" mc:Ignorable="w14 w15 w16se w16cid w16 w16cex w16sdtdh w16sdtfl w16du">
+  <w:optimizeForBrowser/>
+  <w:relyOnVML/>
+  <w:allowPNG/>
+</w:webSettings>
 </file>
</xml_diff>